<commit_message>
docs(report): finalize lab report
</commit_message>
<xml_diff>
--- a/CCCS106_Lab01_Report_Template.docx
+++ b/CCCS106_Lab01_Report_Template.docx
@@ -1,6 +1,6 @@
 
 <file path=word/document.xml><?xml version="1.0" encoding="utf-8"?>
-<w:document xmlns:wpc="http://schemas.microsoft.com/office/word/2010/wordprocessingCanvas" xmlns:cx="http://schemas.microsoft.com/office/drawing/2014/chartex" xmlns:cx1="http://schemas.microsoft.com/office/drawing/2015/9/8/chartex" xmlns:cx2="http://schemas.microsoft.com/office/drawing/2015/10/21/chartex" xmlns:cx3="http://schemas.microsoft.com/office/drawing/2016/5/9/chartex" xmlns:cx4="http://schemas.microsoft.com/office/drawing/2016/5/10/chartex" xmlns:cx5="http://schemas.microsoft.com/office/drawing/2016/5/11/chartex" xmlns:cx6="http://schemas.microsoft.com/office/drawing/2016/5/12/chartex" xmlns:cx7="http://schemas.microsoft.com/office/drawing/2016/5/13/chartex" xmlns:cx8="http://schemas.microsoft.com/office/drawing/2016/5/14/chartex" xmlns:mc="http://schemas.openxmlformats.org/markup-compatibility/2006" xmlns:m="http://schemas.openxmlformats.org/officeDocument/2006/math" xmlns:aink="http://schemas.microsoft.com/office/drawing/2016/ink" xmlns:am3d="http://schemas.microsoft.com/office/drawing/2017/model3d" xmlns:oel="http://schemas.microsoft.com/office/2019/extlst" xmlns:r="http://schemas.openxmlformats.org/officeDocument/2006/relationships" xmlns:wp14="http://schemas.microsoft.com/office/word/2010/wordprocessingDrawing" xmlns:wp="http://schemas.openxmlformats.org/drawingml/2006/wordprocessingDrawing" xmlns:wpg="http://schemas.microsoft.com/office/word/2010/wordprocessingGroup" xmlns:wpi="http://schemas.microsoft.com/office/word/2010/wordprocessingInk" xmlns:wps="http://schemas.microsoft.com/office/word/2010/wordprocessingShape" xmlns:o="urn:schemas-microsoft-com:office:office" xmlns:v="urn:schemas-microsoft-com:vml" xmlns:w10="urn:schemas-microsoft-com:office:word" xmlns:w="http://schemas.openxmlformats.org/wordprocessingml/2006/main" xmlns:w14="http://schemas.microsoft.com/office/word/2010/wordml" xmlns:w15="http://schemas.microsoft.com/office/word/2012/wordml" xmlns:w16cex="http://schemas.microsoft.com/office/word/2018/wordml/cex" xmlns:w16cid="http://schemas.microsoft.com/office/word/2016/wordml/cid" xmlns:w16="http://schemas.microsoft.com/office/word/2018/wordml" xmlns:w16sdtdh="http://schemas.microsoft.com/office/word/2020/wordml/sdtdatahash" xmlns:w16sdtfl="http://schemas.microsoft.com/office/word/2024/wordml/sdtformatlock" xmlns:w16se="http://schemas.microsoft.com/office/word/2015/wordml/symex" xmlns:w16du="http://schemas.microsoft.com/office/word/2023/wordml/word16du" xmlns:wne="http://schemas.microsoft.com/office/word/2006/wordml" mc:Ignorable="w14 w15 w16se w16cid w16 w16cex w16sdtdh w16sdtfl w16du wp14">
+<w:document xmlns:wpc="http://schemas.microsoft.com/office/word/2010/wordprocessingCanvas" xmlns:cx="http://schemas.microsoft.com/office/drawing/2014/chartex" xmlns:cx1="http://schemas.microsoft.com/office/drawing/2015/9/8/chartex" xmlns:cx2="http://schemas.microsoft.com/office/drawing/2015/10/21/chartex" xmlns:cx3="http://schemas.microsoft.com/office/drawing/2016/5/9/chartex" xmlns:cx4="http://schemas.microsoft.com/office/drawing/2016/5/10/chartex" xmlns:cx5="http://schemas.microsoft.com/office/drawing/2016/5/11/chartex" xmlns:cx6="http://schemas.microsoft.com/office/drawing/2016/5/12/chartex" xmlns:cx7="http://schemas.microsoft.com/office/drawing/2016/5/13/chartex" xmlns:cx8="http://schemas.microsoft.com/office/drawing/2016/5/14/chartex" xmlns:mc="http://schemas.openxmlformats.org/markup-compatibility/2006" xmlns:aink="http://schemas.microsoft.com/office/drawing/2016/ink" xmlns:am3d="http://schemas.microsoft.com/office/drawing/2017/model3d" xmlns:o="urn:schemas-microsoft-com:office:office" xmlns:oel="http://schemas.microsoft.com/office/2019/extlst" xmlns:r="http://schemas.openxmlformats.org/officeDocument/2006/relationships" xmlns:m="http://schemas.openxmlformats.org/officeDocument/2006/math" xmlns:v="urn:schemas-microsoft-com:vml" xmlns:wp14="http://schemas.microsoft.com/office/word/2010/wordprocessingDrawing" xmlns:wp="http://schemas.openxmlformats.org/drawingml/2006/wordprocessingDrawing" xmlns:w10="urn:schemas-microsoft-com:office:word" xmlns:w="http://schemas.openxmlformats.org/wordprocessingml/2006/main" xmlns:w14="http://schemas.microsoft.com/office/word/2010/wordml" xmlns:w15="http://schemas.microsoft.com/office/word/2012/wordml" xmlns:w16cex="http://schemas.microsoft.com/office/word/2018/wordml/cex" xmlns:w16cid="http://schemas.microsoft.com/office/word/2016/wordml/cid" xmlns:w16="http://schemas.microsoft.com/office/word/2018/wordml" xmlns:w16du="http://schemas.microsoft.com/office/word/2023/wordml/word16du" xmlns:w16sdtdh="http://schemas.microsoft.com/office/word/2020/wordml/sdtdatahash" xmlns:w16sdtfl="http://schemas.microsoft.com/office/word/2024/wordml/sdtformatlock" xmlns:w16se="http://schemas.microsoft.com/office/word/2015/wordml/symex" xmlns:wpg="http://schemas.microsoft.com/office/word/2010/wordprocessingGroup" xmlns:wpi="http://schemas.microsoft.com/office/word/2010/wordprocessingInk" xmlns:wne="http://schemas.microsoft.com/office/word/2006/wordml" xmlns:wps="http://schemas.microsoft.com/office/word/2010/wordprocessingShape" mc:Ignorable="w14 w15 w16se w16cid w16 w16cex w16sdtdh w16sdtfl w16du wp14">
   <w:body>
     <w:p>
       <w:pPr>
@@ -155,7 +155,6 @@
               </w:rPr>
               <w:t xml:space="preserve">Group No. [ </w:t>
             </w:r>
-            <w:proofErr w:type="gramStart"/>
             <w:r>
               <w:rPr>
                 <w:color w:val="0F172A"/>
@@ -168,15 +167,7 @@
                 <w:color w:val="0F172A"/>
                 <w:sz w:val="19"/>
               </w:rPr>
-              <w:t xml:space="preserve"> ]</w:t>
-            </w:r>
-            <w:proofErr w:type="gramEnd"/>
-            <w:r>
-              <w:rPr>
-                <w:color w:val="0F172A"/>
-                <w:sz w:val="19"/>
-              </w:rPr>
-              <w:t xml:space="preserve">  (e.g., Group 03)</w:t>
+              <w:t xml:space="preserve"> ]  (e.g., Group 03)</w:t>
             </w:r>
           </w:p>
         </w:tc>
@@ -475,7 +466,13 @@
               <w:rPr>
                 <w:sz w:val="18"/>
               </w:rPr>
-              <w:t>2024-XXXXX</w:t>
+              <w:t>2024-</w:t>
+            </w:r>
+            <w:r>
+              <w:rPr>
+                <w:sz w:val="18"/>
+              </w:rPr>
+              <w:t>2411288</w:t>
             </w:r>
           </w:p>
         </w:tc>
@@ -498,7 +495,13 @@
               <w:rPr>
                 <w:sz w:val="18"/>
               </w:rPr>
-              <w:t>@dev1-username</w:t>
+              <w:t>@</w:t>
+            </w:r>
+            <w:r>
+              <w:rPr>
+                <w:sz w:val="18"/>
+              </w:rPr>
+              <w:t>staanagelorenz-cyber</w:t>
             </w:r>
           </w:p>
         </w:tc>
@@ -564,15 +567,7 @@
                 <w:b/>
                 <w:sz w:val="18"/>
               </w:rPr>
-              <w:t xml:space="preserve">Renz Angelo S. </w:t>
-            </w:r>
-            <w:proofErr w:type="gramStart"/>
-            <w:r>
-              <w:rPr>
-                <w:b/>
-                <w:sz w:val="18"/>
-              </w:rPr>
-              <w:t>Priela</w:t>
+              <w:t>Renz Angelo S. Priela</w:t>
             </w:r>
             <w:r>
               <w:rPr>
@@ -581,7 +576,6 @@
               </w:rPr>
               <w:t xml:space="preserve"> ]</w:t>
             </w:r>
-            <w:proofErr w:type="gramEnd"/>
           </w:p>
         </w:tc>
         <w:tc>
@@ -843,6 +837,60 @@
             <w:pPr>
               <w:spacing w:before="240" w:after="80"/>
               <w:jc w:val="center"/>
+              <w:rPr>
+                <w:b/>
+                <w:color w:val="475569"/>
+                <w:sz w:val="22"/>
+              </w:rPr>
+            </w:pPr>
+            <w:r>
+              <w:rPr>
+                <w:b/>
+                <w:noProof/>
+                <w:color w:val="475569"/>
+                <w:sz w:val="22"/>
+              </w:rPr>
+              <w:drawing>
+                <wp:inline distT="0" distB="0" distL="0" distR="0" wp14:anchorId="01DA9E0B" wp14:editId="6EBAC498">
+                  <wp:extent cx="5689600" cy="3200400"/>
+                  <wp:effectExtent l="0" t="0" r="6350" b="0"/>
+                  <wp:docPr id="1373198609" name="Picture 1"/>
+                  <wp:cNvGraphicFramePr>
+                    <a:graphicFrameLocks xmlns:a="http://schemas.openxmlformats.org/drawingml/2006/main" noChangeAspect="1"/>
+                  </wp:cNvGraphicFramePr>
+                  <a:graphic xmlns:a="http://schemas.openxmlformats.org/drawingml/2006/main">
+                    <a:graphicData uri="http://schemas.openxmlformats.org/drawingml/2006/picture">
+                      <pic:pic xmlns:pic="http://schemas.openxmlformats.org/drawingml/2006/picture">
+                        <pic:nvPicPr>
+                          <pic:cNvPr id="1373198609" name="Picture 1373198609"/>
+                          <pic:cNvPicPr/>
+                        </pic:nvPicPr>
+                        <pic:blipFill>
+                          <a:blip r:embed="rId8"/>
+                          <a:stretch>
+                            <a:fillRect/>
+                          </a:stretch>
+                        </pic:blipFill>
+                        <pic:spPr>
+                          <a:xfrm>
+                            <a:off x="0" y="0"/>
+                            <a:ext cx="5689600" cy="3200400"/>
+                          </a:xfrm>
+                          <a:prstGeom prst="rect">
+                            <a:avLst/>
+                          </a:prstGeom>
+                        </pic:spPr>
+                      </pic:pic>
+                    </a:graphicData>
+                  </a:graphic>
+                </wp:inline>
+              </w:drawing>
+            </w:r>
+          </w:p>
+          <w:p>
+            <w:pPr>
+              <w:spacing w:before="240" w:after="80"/>
+              <w:jc w:val="center"/>
             </w:pPr>
             <w:r>
               <w:rPr>
@@ -949,6 +997,61 @@
             <w:pPr>
               <w:spacing w:before="240" w:after="80"/>
               <w:jc w:val="center"/>
+              <w:rPr>
+                <w:b/>
+                <w:color w:val="475569"/>
+                <w:sz w:val="22"/>
+              </w:rPr>
+            </w:pPr>
+            <w:r>
+              <w:rPr>
+                <w:b/>
+                <w:noProof/>
+                <w:color w:val="475569"/>
+                <w:sz w:val="22"/>
+              </w:rPr>
+              <w:lastRenderedPageBreak/>
+              <w:drawing>
+                <wp:inline distT="0" distB="0" distL="0" distR="0" wp14:anchorId="3C0561CB" wp14:editId="596FF887">
+                  <wp:extent cx="5689600" cy="3200400"/>
+                  <wp:effectExtent l="0" t="0" r="6350" b="0"/>
+                  <wp:docPr id="250099404" name="Picture 2"/>
+                  <wp:cNvGraphicFramePr>
+                    <a:graphicFrameLocks xmlns:a="http://schemas.openxmlformats.org/drawingml/2006/main" noChangeAspect="1"/>
+                  </wp:cNvGraphicFramePr>
+                  <a:graphic xmlns:a="http://schemas.openxmlformats.org/drawingml/2006/main">
+                    <a:graphicData uri="http://schemas.openxmlformats.org/drawingml/2006/picture">
+                      <pic:pic xmlns:pic="http://schemas.openxmlformats.org/drawingml/2006/picture">
+                        <pic:nvPicPr>
+                          <pic:cNvPr id="250099404" name="Picture 250099404"/>
+                          <pic:cNvPicPr/>
+                        </pic:nvPicPr>
+                        <pic:blipFill>
+                          <a:blip r:embed="rId9"/>
+                          <a:stretch>
+                            <a:fillRect/>
+                          </a:stretch>
+                        </pic:blipFill>
+                        <pic:spPr>
+                          <a:xfrm>
+                            <a:off x="0" y="0"/>
+                            <a:ext cx="5689600" cy="3200400"/>
+                          </a:xfrm>
+                          <a:prstGeom prst="rect">
+                            <a:avLst/>
+                          </a:prstGeom>
+                        </pic:spPr>
+                      </pic:pic>
+                    </a:graphicData>
+                  </a:graphic>
+                </wp:inline>
+              </w:drawing>
+            </w:r>
+          </w:p>
+          <w:p>
+            <w:pPr>
+              <w:spacing w:before="240" w:after="80"/>
+              <w:jc w:val="center"/>
             </w:pPr>
             <w:r>
               <w:rPr>
@@ -973,7 +1076,7 @@
                           <pic:cNvPicPr/>
                         </pic:nvPicPr>
                         <pic:blipFill>
-                          <a:blip r:embed="rId8"/>
+                          <a:blip r:embed="rId10"/>
                           <a:stretch>
                             <a:fillRect/>
                           </a:stretch>
@@ -999,18 +1102,8 @@
                 <w:color w:val="475569"/>
                 <w:sz w:val="22"/>
               </w:rPr>
-              <w:t xml:space="preserve"> [PASTE / INSERT SCREENSHOT IMAGE </w:t>
+              <w:t xml:space="preserve"> [PASTE / INSERT SCREENSHOT IMAGE HERE ]</w:t>
             </w:r>
-            <w:proofErr w:type="gramStart"/>
-            <w:r>
-              <w:rPr>
-                <w:b/>
-                <w:color w:val="475569"/>
-                <w:sz w:val="22"/>
-              </w:rPr>
-              <w:t>HERE ]</w:t>
-            </w:r>
-            <w:proofErr w:type="gramEnd"/>
             <w:r>
               <w:rPr>
                 <w:b/>
@@ -1065,7 +1158,6 @@
         <w:spacing w:before="280" w:after="120"/>
       </w:pPr>
       <w:r>
-        <w:lastRenderedPageBreak/>
         <w:t>Section 3: Git Working Tree Cleanliness &amp; .gitignore Audit</w:t>
       </w:r>
     </w:p>
@@ -1105,6 +1197,61 @@
               <w:right w:w="200" w:type="dxa"/>
             </w:tcMar>
           </w:tcPr>
+          <w:p>
+            <w:pPr>
+              <w:spacing w:before="240" w:after="80"/>
+              <w:jc w:val="center"/>
+              <w:rPr>
+                <w:b/>
+                <w:color w:val="475569"/>
+                <w:sz w:val="22"/>
+              </w:rPr>
+            </w:pPr>
+            <w:r>
+              <w:rPr>
+                <w:b/>
+                <w:noProof/>
+                <w:color w:val="475569"/>
+                <w:sz w:val="22"/>
+              </w:rPr>
+              <w:lastRenderedPageBreak/>
+              <w:drawing>
+                <wp:inline distT="0" distB="0" distL="0" distR="0" wp14:anchorId="4D5674C2" wp14:editId="2C88850E">
+                  <wp:extent cx="5689600" cy="3200400"/>
+                  <wp:effectExtent l="0" t="0" r="6350" b="0"/>
+                  <wp:docPr id="394996854" name="Picture 3"/>
+                  <wp:cNvGraphicFramePr>
+                    <a:graphicFrameLocks xmlns:a="http://schemas.openxmlformats.org/drawingml/2006/main" noChangeAspect="1"/>
+                  </wp:cNvGraphicFramePr>
+                  <a:graphic xmlns:a="http://schemas.openxmlformats.org/drawingml/2006/main">
+                    <a:graphicData uri="http://schemas.openxmlformats.org/drawingml/2006/picture">
+                      <pic:pic xmlns:pic="http://schemas.openxmlformats.org/drawingml/2006/picture">
+                        <pic:nvPicPr>
+                          <pic:cNvPr id="394996854" name="Picture 394996854"/>
+                          <pic:cNvPicPr/>
+                        </pic:nvPicPr>
+                        <pic:blipFill>
+                          <a:blip r:embed="rId11"/>
+                          <a:stretch>
+                            <a:fillRect/>
+                          </a:stretch>
+                        </pic:blipFill>
+                        <pic:spPr>
+                          <a:xfrm>
+                            <a:off x="0" y="0"/>
+                            <a:ext cx="5689600" cy="3200400"/>
+                          </a:xfrm>
+                          <a:prstGeom prst="rect">
+                            <a:avLst/>
+                          </a:prstGeom>
+                        </pic:spPr>
+                      </pic:pic>
+                    </a:graphicData>
+                  </a:graphic>
+                </wp:inline>
+              </w:drawing>
+            </w:r>
+          </w:p>
           <w:p>
             <w:pPr>
               <w:spacing w:before="240" w:after="80"/>
@@ -1221,6 +1368,60 @@
             <w:pPr>
               <w:spacing w:before="240" w:after="80"/>
               <w:jc w:val="center"/>
+              <w:rPr>
+                <w:b/>
+                <w:color w:val="475569"/>
+                <w:sz w:val="22"/>
+              </w:rPr>
+            </w:pPr>
+            <w:r>
+              <w:rPr>
+                <w:b/>
+                <w:noProof/>
+                <w:color w:val="475569"/>
+                <w:sz w:val="22"/>
+              </w:rPr>
+              <w:drawing>
+                <wp:inline distT="0" distB="0" distL="0" distR="0" wp14:anchorId="2C45AEB8" wp14:editId="12426114">
+                  <wp:extent cx="5689600" cy="3200400"/>
+                  <wp:effectExtent l="0" t="0" r="6350" b="0"/>
+                  <wp:docPr id="860300565" name="Picture 5"/>
+                  <wp:cNvGraphicFramePr>
+                    <a:graphicFrameLocks xmlns:a="http://schemas.openxmlformats.org/drawingml/2006/main" noChangeAspect="1"/>
+                  </wp:cNvGraphicFramePr>
+                  <a:graphic xmlns:a="http://schemas.openxmlformats.org/drawingml/2006/main">
+                    <a:graphicData uri="http://schemas.openxmlformats.org/drawingml/2006/picture">
+                      <pic:pic xmlns:pic="http://schemas.openxmlformats.org/drawingml/2006/picture">
+                        <pic:nvPicPr>
+                          <pic:cNvPr id="860300565" name="Picture 860300565"/>
+                          <pic:cNvPicPr/>
+                        </pic:nvPicPr>
+                        <pic:blipFill>
+                          <a:blip r:embed="rId12"/>
+                          <a:stretch>
+                            <a:fillRect/>
+                          </a:stretch>
+                        </pic:blipFill>
+                        <pic:spPr>
+                          <a:xfrm>
+                            <a:off x="0" y="0"/>
+                            <a:ext cx="5689600" cy="3200400"/>
+                          </a:xfrm>
+                          <a:prstGeom prst="rect">
+                            <a:avLst/>
+                          </a:prstGeom>
+                        </pic:spPr>
+                      </pic:pic>
+                    </a:graphicData>
+                  </a:graphic>
+                </wp:inline>
+              </w:drawing>
+            </w:r>
+          </w:p>
+          <w:p>
+            <w:pPr>
+              <w:spacing w:before="240" w:after="80"/>
+              <w:jc w:val="center"/>
             </w:pPr>
             <w:r>
               <w:rPr>
@@ -1326,6 +1527,61 @@
                 <w:color w:val="475569"/>
                 <w:sz w:val="22"/>
               </w:rPr>
+              <w:lastRenderedPageBreak/>
+              <w:drawing>
+                <wp:inline distT="0" distB="0" distL="0" distR="0" wp14:anchorId="08CDB028" wp14:editId="0E53726F">
+                  <wp:extent cx="5689600" cy="3200400"/>
+                  <wp:effectExtent l="0" t="0" r="6350" b="0"/>
+                  <wp:docPr id="53408434" name="Picture 6"/>
+                  <wp:cNvGraphicFramePr>
+                    <a:graphicFrameLocks xmlns:a="http://schemas.openxmlformats.org/drawingml/2006/main" noChangeAspect="1"/>
+                  </wp:cNvGraphicFramePr>
+                  <a:graphic xmlns:a="http://schemas.openxmlformats.org/drawingml/2006/main">
+                    <a:graphicData uri="http://schemas.openxmlformats.org/drawingml/2006/picture">
+                      <pic:pic xmlns:pic="http://schemas.openxmlformats.org/drawingml/2006/picture">
+                        <pic:nvPicPr>
+                          <pic:cNvPr id="53408434" name="Picture 53408434"/>
+                          <pic:cNvPicPr/>
+                        </pic:nvPicPr>
+                        <pic:blipFill>
+                          <a:blip r:embed="rId13"/>
+                          <a:stretch>
+                            <a:fillRect/>
+                          </a:stretch>
+                        </pic:blipFill>
+                        <pic:spPr>
+                          <a:xfrm>
+                            <a:off x="0" y="0"/>
+                            <a:ext cx="5689600" cy="3200400"/>
+                          </a:xfrm>
+                          <a:prstGeom prst="rect">
+                            <a:avLst/>
+                          </a:prstGeom>
+                        </pic:spPr>
+                      </pic:pic>
+                    </a:graphicData>
+                  </a:graphic>
+                </wp:inline>
+              </w:drawing>
+            </w:r>
+          </w:p>
+          <w:p>
+            <w:pPr>
+              <w:spacing w:before="240" w:after="80"/>
+              <w:jc w:val="center"/>
+              <w:rPr>
+                <w:b/>
+                <w:color w:val="475569"/>
+                <w:sz w:val="22"/>
+              </w:rPr>
+            </w:pPr>
+            <w:r>
+              <w:rPr>
+                <w:b/>
+                <w:noProof/>
+                <w:color w:val="475569"/>
+                <w:sz w:val="22"/>
+              </w:rPr>
               <w:drawing>
                 <wp:inline distT="0" distB="0" distL="0" distR="0" wp14:anchorId="7F7048EC" wp14:editId="29874A8C">
                   <wp:extent cx="3233099" cy="3998794"/>
@@ -1342,7 +1598,7 @@
                           <pic:cNvPicPr/>
                         </pic:nvPicPr>
                         <pic:blipFill>
-                          <a:blip r:embed="rId9"/>
+                          <a:blip r:embed="rId14"/>
                           <a:stretch>
                             <a:fillRect/>
                           </a:stretch>
@@ -1374,18 +1630,8 @@
                 <w:color w:val="475569"/>
                 <w:sz w:val="22"/>
               </w:rPr>
-              <w:t xml:space="preserve">[ PASTE / INSERT SCREENSHOT IMAGE </w:t>
+              <w:t>[ PASTE / INSERT SCREENSHOT IMAGE HERE ]</w:t>
             </w:r>
-            <w:proofErr w:type="gramStart"/>
-            <w:r>
-              <w:rPr>
-                <w:b/>
-                <w:color w:val="475569"/>
-                <w:sz w:val="22"/>
-              </w:rPr>
-              <w:t>HERE ]</w:t>
-            </w:r>
-            <w:proofErr w:type="gramEnd"/>
             <w:r>
               <w:rPr>
                 <w:b/>
@@ -1400,6 +1646,7 @@
                 <w:color w:val="64748B"/>
                 <w:sz w:val="19"/>
               </w:rPr>
+              <w:lastRenderedPageBreak/>
               <w:t>Reference: Sprint Goal Milestone Reached State</w:t>
             </w:r>
             <w:r>
@@ -1484,6 +1731,61 @@
                 <w:sz w:val="22"/>
               </w:rPr>
               <w:drawing>
+                <wp:inline distT="0" distB="0" distL="0" distR="0" wp14:anchorId="31BAE28A" wp14:editId="026A904A">
+                  <wp:extent cx="5689600" cy="3200400"/>
+                  <wp:effectExtent l="0" t="0" r="6350" b="0"/>
+                  <wp:docPr id="874456453" name="Picture 8"/>
+                  <wp:cNvGraphicFramePr>
+                    <a:graphicFrameLocks xmlns:a="http://schemas.openxmlformats.org/drawingml/2006/main" noChangeAspect="1"/>
+                  </wp:cNvGraphicFramePr>
+                  <a:graphic xmlns:a="http://schemas.openxmlformats.org/drawingml/2006/main">
+                    <a:graphicData uri="http://schemas.openxmlformats.org/drawingml/2006/picture">
+                      <pic:pic xmlns:pic="http://schemas.openxmlformats.org/drawingml/2006/picture">
+                        <pic:nvPicPr>
+                          <pic:cNvPr id="874456453" name="Picture 874456453"/>
+                          <pic:cNvPicPr/>
+                        </pic:nvPicPr>
+                        <pic:blipFill>
+                          <a:blip r:embed="rId15"/>
+                          <a:stretch>
+                            <a:fillRect/>
+                          </a:stretch>
+                        </pic:blipFill>
+                        <pic:spPr>
+                          <a:xfrm>
+                            <a:off x="0" y="0"/>
+                            <a:ext cx="5689600" cy="3200400"/>
+                          </a:xfrm>
+                          <a:prstGeom prst="rect">
+                            <a:avLst/>
+                          </a:prstGeom>
+                        </pic:spPr>
+                      </pic:pic>
+                    </a:graphicData>
+                  </a:graphic>
+                </wp:inline>
+              </w:drawing>
+            </w:r>
+          </w:p>
+          <w:p>
+            <w:pPr>
+              <w:spacing w:before="240" w:after="80"/>
+              <w:jc w:val="center"/>
+              <w:rPr>
+                <w:b/>
+                <w:color w:val="475569"/>
+                <w:sz w:val="22"/>
+              </w:rPr>
+            </w:pPr>
+            <w:r>
+              <w:rPr>
+                <w:b/>
+                <w:noProof/>
+                <w:color w:val="475569"/>
+                <w:sz w:val="22"/>
+              </w:rPr>
+              <w:lastRenderedPageBreak/>
+              <w:drawing>
                 <wp:inline distT="0" distB="0" distL="0" distR="0" wp14:anchorId="619B0E1F" wp14:editId="5313B372">
                   <wp:extent cx="3073283" cy="3779520"/>
                   <wp:effectExtent l="0" t="0" r="635" b="5080"/>
@@ -1499,7 +1801,7 @@
                           <pic:cNvPicPr/>
                         </pic:nvPicPr>
                         <pic:blipFill>
-                          <a:blip r:embed="rId10"/>
+                          <a:blip r:embed="rId16"/>
                           <a:stretch>
                             <a:fillRect/>
                           </a:stretch>
@@ -1531,18 +1833,8 @@
                 <w:color w:val="475569"/>
                 <w:sz w:val="22"/>
               </w:rPr>
-              <w:t xml:space="preserve">[ PASTE / INSERT SCREENSHOT IMAGE </w:t>
+              <w:t>[ PASTE / INSERT SCREENSHOT IMAGE HERE ]</w:t>
             </w:r>
-            <w:proofErr w:type="gramStart"/>
-            <w:r>
-              <w:rPr>
-                <w:b/>
-                <w:color w:val="475569"/>
-                <w:sz w:val="22"/>
-              </w:rPr>
-              <w:t>HERE ]</w:t>
-            </w:r>
-            <w:proofErr w:type="gramEnd"/>
             <w:r>
               <w:rPr>
                 <w:b/>
@@ -1588,6 +1880,7 @@
           <w:b/>
           <w:sz w:val="19"/>
         </w:rPr>
+        <w:lastRenderedPageBreak/>
         <w:t>Figure 6: Material 3 Dark Mode Theme Toggle State</w:t>
       </w:r>
     </w:p>
@@ -1914,7 +2207,6 @@
               </w:rPr>
               <w:t xml:space="preserve">[ </w:t>
             </w:r>
-            <w:proofErr w:type="gramStart"/>
             <w:r>
               <w:rPr>
                 <w:b/>
@@ -1929,7 +2221,6 @@
               </w:rPr>
               <w:t xml:space="preserve"> ]</w:t>
             </w:r>
-            <w:proofErr w:type="gramEnd"/>
           </w:p>
         </w:tc>
         <w:tc>
@@ -2185,7 +2476,7 @@
     </w:p>
     <w:p>
       <w:pPr>
-        <w:spacing w:after="160"/>
+        <w:spacing w:before="80" w:after="40"/>
       </w:pPr>
       <w:r>
         <w:rPr>
@@ -2193,20 +2484,69 @@
           <w:color w:val="64748B"/>
           <w:sz w:val="19"/>
         </w:rPr>
-        <w:t>[ Write 3-4 sentences describing what you learned regarding virtual environment isolation, .gitignore configuration rules, and coordinating remote repository invitations on GitHub... ]</w:t>
+        <w:t>Virtual environments allow you to separate dependencies for different projects from the Python installation on your system, so that packages do not conflict between them. I learned about `.</w:t>
       </w:r>
-    </w:p>
-    <w:p>
-      <w:pPr>
-        <w:spacing w:before="80" w:after="40"/>
-      </w:pPr>
+      <w:proofErr w:type="spellStart"/>
+      <w:r>
+        <w:rPr>
+          <w:i/>
+          <w:color w:val="64748B"/>
+          <w:sz w:val="19"/>
+        </w:rPr>
+        <w:t>gitignore</w:t>
+      </w:r>
+      <w:proofErr w:type="spellEnd"/>
+      <w:r>
+        <w:rPr>
+          <w:i/>
+          <w:color w:val="64748B"/>
+          <w:sz w:val="19"/>
+        </w:rPr>
+        <w:t>` and how to use it to exclude virtual-environment folders (like `</w:t>
+      </w:r>
+      <w:proofErr w:type="spellStart"/>
+      <w:r>
+        <w:rPr>
+          <w:i/>
+          <w:color w:val="64748B"/>
+          <w:sz w:val="19"/>
+        </w:rPr>
+        <w:t>venv</w:t>
+      </w:r>
+      <w:proofErr w:type="spellEnd"/>
+      <w:r>
+        <w:rPr>
+          <w:i/>
+          <w:color w:val="64748B"/>
+          <w:sz w:val="19"/>
+        </w:rPr>
+        <w:t xml:space="preserve">/`), generated files, caches and sensitive configuration files (like `.env`), while still keeping track of the source code and the required configuration files. When collaborating on GitHub, it is very important to make sure that repository invitations are coordinated properly, by ensuring that the right user with the right access is invited, and that the access is correct before collaborators start working. With good coordination, you can avoid configuration problems in the repository, duplicate work, and unauthorized </w:t>
+      </w:r>
+      <w:proofErr w:type="spellStart"/>
+      <w:r>
+        <w:rPr>
+          <w:i/>
+          <w:color w:val="64748B"/>
+          <w:sz w:val="19"/>
+        </w:rPr>
+        <w:t>access.</w:t>
+      </w:r>
       <w:r>
         <w:rPr>
           <w:b/>
           <w:color w:val="1E3A8A"/>
           <w:sz w:val="20"/>
         </w:rPr>
-        <w:t>Developer 2 (State &amp; Event Logic Engineer):</w:t>
+        <w:t>Developer</w:t>
+      </w:r>
+      <w:proofErr w:type="spellEnd"/>
+      <w:r>
+        <w:rPr>
+          <w:b/>
+          <w:color w:val="1E3A8A"/>
+          <w:sz w:val="20"/>
+        </w:rPr>
+        <w:t xml:space="preserve"> 2 (State &amp; Event Logic Engineer):</w:t>
       </w:r>
     </w:p>
     <w:p>
@@ -2243,25 +2583,7 @@
           <w:color w:val="64748B"/>
           <w:sz w:val="19"/>
         </w:rPr>
-        <w:t xml:space="preserve"> which helps keep my local files updated with all of the latest changes. And </w:t>
-      </w:r>
-      <w:proofErr w:type="gramStart"/>
-      <w:r>
-        <w:rPr>
-          <w:i/>
-          <w:color w:val="64748B"/>
-          <w:sz w:val="19"/>
-        </w:rPr>
-        <w:t>also</w:t>
-      </w:r>
-      <w:proofErr w:type="gramEnd"/>
-      <w:r>
-        <w:rPr>
-          <w:i/>
-          <w:color w:val="64748B"/>
-          <w:sz w:val="19"/>
-        </w:rPr>
-        <w:t xml:space="preserve"> I learned how reactive event handlers can respond to user action, by clicks or input changes, and update the application dynamically. These new skills/knowledge helped me better understand both the version control and interactive application development.</w:t>
+        <w:t xml:space="preserve"> which helps keep my local files updated with all of the latest changes. And also I learned how reactive event handlers can respond to user action, by clicks or input changes, and update the application dynamically. These new skills/knowledge helped me better understand both the version control and interactive application development.</w:t>
       </w:r>
     </w:p>
     <w:p>
@@ -2478,8 +2800,8 @@
     </w:tbl>
     <w:p/>
     <w:sectPr>
-      <w:headerReference w:type="default" r:id="rId11"/>
-      <w:footerReference w:type="default" r:id="rId12"/>
+      <w:headerReference w:type="default" r:id="rId17"/>
+      <w:footerReference w:type="default" r:id="rId18"/>
       <w:pgSz w:w="12240" w:h="15840"/>
       <w:pgMar w:top="1440" w:right="1440" w:bottom="1440" w:left="1440" w:header="720" w:footer="720" w:gutter="0"/>
       <w:cols w:space="720"/>
@@ -2491,7 +2813,7 @@
 </file>
 
 <file path=word/endnotes.xml><?xml version="1.0" encoding="utf-8"?>
-<w:endnotes xmlns:wpc="http://schemas.microsoft.com/office/word/2010/wordprocessingCanvas" xmlns:cx="http://schemas.microsoft.com/office/drawing/2014/chartex" xmlns:cx1="http://schemas.microsoft.com/office/drawing/2015/9/8/chartex" xmlns:cx2="http://schemas.microsoft.com/office/drawing/2015/10/21/chartex" xmlns:cx3="http://schemas.microsoft.com/office/drawing/2016/5/9/chartex" xmlns:cx4="http://schemas.microsoft.com/office/drawing/2016/5/10/chartex" xmlns:cx5="http://schemas.microsoft.com/office/drawing/2016/5/11/chartex" xmlns:cx6="http://schemas.microsoft.com/office/drawing/2016/5/12/chartex" xmlns:cx7="http://schemas.microsoft.com/office/drawing/2016/5/13/chartex" xmlns:cx8="http://schemas.microsoft.com/office/drawing/2016/5/14/chartex" xmlns:mc="http://schemas.openxmlformats.org/markup-compatibility/2006" xmlns:m="http://schemas.openxmlformats.org/officeDocument/2006/math" xmlns:aink="http://schemas.microsoft.com/office/drawing/2016/ink" xmlns:am3d="http://schemas.microsoft.com/office/drawing/2017/model3d" xmlns:oel="http://schemas.microsoft.com/office/2019/extlst" xmlns:r="http://schemas.openxmlformats.org/officeDocument/2006/relationships" xmlns:wp14="http://schemas.microsoft.com/office/word/2010/wordprocessingDrawing" xmlns:wp="http://schemas.openxmlformats.org/drawingml/2006/wordprocessingDrawing" xmlns:wpg="http://schemas.microsoft.com/office/word/2010/wordprocessingGroup" xmlns:wpi="http://schemas.microsoft.com/office/word/2010/wordprocessingInk" xmlns:wps="http://schemas.microsoft.com/office/word/2010/wordprocessingShape" xmlns:o="urn:schemas-microsoft-com:office:office" xmlns:v="urn:schemas-microsoft-com:vml" xmlns:w10="urn:schemas-microsoft-com:office:word" xmlns:w="http://schemas.openxmlformats.org/wordprocessingml/2006/main" xmlns:w14="http://schemas.microsoft.com/office/word/2010/wordml" xmlns:w15="http://schemas.microsoft.com/office/word/2012/wordml" xmlns:w16cex="http://schemas.microsoft.com/office/word/2018/wordml/cex" xmlns:w16cid="http://schemas.microsoft.com/office/word/2016/wordml/cid" xmlns:w16="http://schemas.microsoft.com/office/word/2018/wordml" xmlns:w16sdtdh="http://schemas.microsoft.com/office/word/2020/wordml/sdtdatahash" xmlns:w16sdtfl="http://schemas.microsoft.com/office/word/2024/wordml/sdtformatlock" xmlns:w16se="http://schemas.microsoft.com/office/word/2015/wordml/symex" xmlns:w16du="http://schemas.microsoft.com/office/word/2023/wordml/word16du" xmlns:wne="http://schemas.microsoft.com/office/word/2006/wordml" mc:Ignorable="w14 w15 w16se w16cid w16 w16cex w16sdtdh w16sdtfl w16du wp14">
+<w:endnotes xmlns:wpc="http://schemas.microsoft.com/office/word/2010/wordprocessingCanvas" xmlns:cx="http://schemas.microsoft.com/office/drawing/2014/chartex" xmlns:cx1="http://schemas.microsoft.com/office/drawing/2015/9/8/chartex" xmlns:cx2="http://schemas.microsoft.com/office/drawing/2015/10/21/chartex" xmlns:cx3="http://schemas.microsoft.com/office/drawing/2016/5/9/chartex" xmlns:cx4="http://schemas.microsoft.com/office/drawing/2016/5/10/chartex" xmlns:cx5="http://schemas.microsoft.com/office/drawing/2016/5/11/chartex" xmlns:cx6="http://schemas.microsoft.com/office/drawing/2016/5/12/chartex" xmlns:cx7="http://schemas.microsoft.com/office/drawing/2016/5/13/chartex" xmlns:cx8="http://schemas.microsoft.com/office/drawing/2016/5/14/chartex" xmlns:mc="http://schemas.openxmlformats.org/markup-compatibility/2006" xmlns:aink="http://schemas.microsoft.com/office/drawing/2016/ink" xmlns:am3d="http://schemas.microsoft.com/office/drawing/2017/model3d" xmlns:o="urn:schemas-microsoft-com:office:office" xmlns:oel="http://schemas.microsoft.com/office/2019/extlst" xmlns:r="http://schemas.openxmlformats.org/officeDocument/2006/relationships" xmlns:m="http://schemas.openxmlformats.org/officeDocument/2006/math" xmlns:v="urn:schemas-microsoft-com:vml" xmlns:wp14="http://schemas.microsoft.com/office/word/2010/wordprocessingDrawing" xmlns:wp="http://schemas.openxmlformats.org/drawingml/2006/wordprocessingDrawing" xmlns:w10="urn:schemas-microsoft-com:office:word" xmlns:w="http://schemas.openxmlformats.org/wordprocessingml/2006/main" xmlns:w14="http://schemas.microsoft.com/office/word/2010/wordml" xmlns:w15="http://schemas.microsoft.com/office/word/2012/wordml" xmlns:w16cex="http://schemas.microsoft.com/office/word/2018/wordml/cex" xmlns:w16cid="http://schemas.microsoft.com/office/word/2016/wordml/cid" xmlns:w16="http://schemas.microsoft.com/office/word/2018/wordml" xmlns:w16du="http://schemas.microsoft.com/office/word/2023/wordml/word16du" xmlns:w16sdtdh="http://schemas.microsoft.com/office/word/2020/wordml/sdtdatahash" xmlns:w16sdtfl="http://schemas.microsoft.com/office/word/2024/wordml/sdtformatlock" xmlns:w16se="http://schemas.microsoft.com/office/word/2015/wordml/symex" xmlns:wpg="http://schemas.microsoft.com/office/word/2010/wordprocessingGroup" xmlns:wpi="http://schemas.microsoft.com/office/word/2010/wordprocessingInk" xmlns:wne="http://schemas.microsoft.com/office/word/2006/wordml" xmlns:wps="http://schemas.microsoft.com/office/word/2010/wordprocessingShape" mc:Ignorable="w14 w15 w16se w16cid w16 w16cex w16sdtdh w16sdtfl w16du wp14">
   <w:endnote w:type="separator" w:id="-1">
     <w:p>
       <w:pPr>
@@ -2516,7 +2838,7 @@
 </file>
 
 <file path=word/footer1.xml><?xml version="1.0" encoding="utf-8"?>
-<w:ftr xmlns:wpc="http://schemas.microsoft.com/office/word/2010/wordprocessingCanvas" xmlns:cx="http://schemas.microsoft.com/office/drawing/2014/chartex" xmlns:cx1="http://schemas.microsoft.com/office/drawing/2015/9/8/chartex" xmlns:cx2="http://schemas.microsoft.com/office/drawing/2015/10/21/chartex" xmlns:cx3="http://schemas.microsoft.com/office/drawing/2016/5/9/chartex" xmlns:cx4="http://schemas.microsoft.com/office/drawing/2016/5/10/chartex" xmlns:cx5="http://schemas.microsoft.com/office/drawing/2016/5/11/chartex" xmlns:cx6="http://schemas.microsoft.com/office/drawing/2016/5/12/chartex" xmlns:cx7="http://schemas.microsoft.com/office/drawing/2016/5/13/chartex" xmlns:cx8="http://schemas.microsoft.com/office/drawing/2016/5/14/chartex" xmlns:mc="http://schemas.openxmlformats.org/markup-compatibility/2006" xmlns:m="http://schemas.openxmlformats.org/officeDocument/2006/math" xmlns:aink="http://schemas.microsoft.com/office/drawing/2016/ink" xmlns:am3d="http://schemas.microsoft.com/office/drawing/2017/model3d" xmlns:oel="http://schemas.microsoft.com/office/2019/extlst" xmlns:r="http://schemas.openxmlformats.org/officeDocument/2006/relationships" xmlns:wp14="http://schemas.microsoft.com/office/word/2010/wordprocessingDrawing" xmlns:wp="http://schemas.openxmlformats.org/drawingml/2006/wordprocessingDrawing" xmlns:wpg="http://schemas.microsoft.com/office/word/2010/wordprocessingGroup" xmlns:wpi="http://schemas.microsoft.com/office/word/2010/wordprocessingInk" xmlns:wps="http://schemas.microsoft.com/office/word/2010/wordprocessingShape" xmlns:o="urn:schemas-microsoft-com:office:office" xmlns:v="urn:schemas-microsoft-com:vml" xmlns:w10="urn:schemas-microsoft-com:office:word" xmlns:w="http://schemas.openxmlformats.org/wordprocessingml/2006/main" xmlns:w14="http://schemas.microsoft.com/office/word/2010/wordml" xmlns:w15="http://schemas.microsoft.com/office/word/2012/wordml" xmlns:w16cex="http://schemas.microsoft.com/office/word/2018/wordml/cex" xmlns:w16cid="http://schemas.microsoft.com/office/word/2016/wordml/cid" xmlns:w16="http://schemas.microsoft.com/office/word/2018/wordml" xmlns:w16sdtdh="http://schemas.microsoft.com/office/word/2020/wordml/sdtdatahash" xmlns:w16sdtfl="http://schemas.microsoft.com/office/word/2024/wordml/sdtformatlock" xmlns:w16se="http://schemas.microsoft.com/office/word/2015/wordml/symex" xmlns:w16du="http://schemas.microsoft.com/office/word/2023/wordml/word16du" xmlns:wne="http://schemas.microsoft.com/office/word/2006/wordml" mc:Ignorable="w14 w15 w16se w16cid w16 w16cex w16sdtdh w16sdtfl w16du wp14">
+<w:ftr xmlns:wpc="http://schemas.microsoft.com/office/word/2010/wordprocessingCanvas" xmlns:cx="http://schemas.microsoft.com/office/drawing/2014/chartex" xmlns:cx1="http://schemas.microsoft.com/office/drawing/2015/9/8/chartex" xmlns:cx2="http://schemas.microsoft.com/office/drawing/2015/10/21/chartex" xmlns:cx3="http://schemas.microsoft.com/office/drawing/2016/5/9/chartex" xmlns:cx4="http://schemas.microsoft.com/office/drawing/2016/5/10/chartex" xmlns:cx5="http://schemas.microsoft.com/office/drawing/2016/5/11/chartex" xmlns:cx6="http://schemas.microsoft.com/office/drawing/2016/5/12/chartex" xmlns:cx7="http://schemas.microsoft.com/office/drawing/2016/5/13/chartex" xmlns:cx8="http://schemas.microsoft.com/office/drawing/2016/5/14/chartex" xmlns:mc="http://schemas.openxmlformats.org/markup-compatibility/2006" xmlns:aink="http://schemas.microsoft.com/office/drawing/2016/ink" xmlns:am3d="http://schemas.microsoft.com/office/drawing/2017/model3d" xmlns:o="urn:schemas-microsoft-com:office:office" xmlns:oel="http://schemas.microsoft.com/office/2019/extlst" xmlns:r="http://schemas.openxmlformats.org/officeDocument/2006/relationships" xmlns:m="http://schemas.openxmlformats.org/officeDocument/2006/math" xmlns:v="urn:schemas-microsoft-com:vml" xmlns:wp14="http://schemas.microsoft.com/office/word/2010/wordprocessingDrawing" xmlns:wp="http://schemas.openxmlformats.org/drawingml/2006/wordprocessingDrawing" xmlns:w10="urn:schemas-microsoft-com:office:word" xmlns:w="http://schemas.openxmlformats.org/wordprocessingml/2006/main" xmlns:w14="http://schemas.microsoft.com/office/word/2010/wordml" xmlns:w15="http://schemas.microsoft.com/office/word/2012/wordml" xmlns:w16cex="http://schemas.microsoft.com/office/word/2018/wordml/cex" xmlns:w16cid="http://schemas.microsoft.com/office/word/2016/wordml/cid" xmlns:w16="http://schemas.microsoft.com/office/word/2018/wordml" xmlns:w16du="http://schemas.microsoft.com/office/word/2023/wordml/word16du" xmlns:w16sdtdh="http://schemas.microsoft.com/office/word/2020/wordml/sdtdatahash" xmlns:w16sdtfl="http://schemas.microsoft.com/office/word/2024/wordml/sdtformatlock" xmlns:w16se="http://schemas.microsoft.com/office/word/2015/wordml/symex" xmlns:wpg="http://schemas.microsoft.com/office/word/2010/wordprocessingGroup" xmlns:wpi="http://schemas.microsoft.com/office/word/2010/wordprocessingInk" xmlns:wne="http://schemas.microsoft.com/office/word/2006/wordml" xmlns:wps="http://schemas.microsoft.com/office/word/2010/wordprocessingShape" mc:Ignorable="w14 w15 w16se w16cid w16 w16cex w16sdtdh w16sdtfl w16du wp14">
   <w:p>
     <w:pPr>
       <w:pStyle w:val="Footer"/>
@@ -2534,7 +2856,7 @@
 </file>
 
 <file path=word/footnotes.xml><?xml version="1.0" encoding="utf-8"?>
-<w:footnotes xmlns:wpc="http://schemas.microsoft.com/office/word/2010/wordprocessingCanvas" xmlns:cx="http://schemas.microsoft.com/office/drawing/2014/chartex" xmlns:cx1="http://schemas.microsoft.com/office/drawing/2015/9/8/chartex" xmlns:cx2="http://schemas.microsoft.com/office/drawing/2015/10/21/chartex" xmlns:cx3="http://schemas.microsoft.com/office/drawing/2016/5/9/chartex" xmlns:cx4="http://schemas.microsoft.com/office/drawing/2016/5/10/chartex" xmlns:cx5="http://schemas.microsoft.com/office/drawing/2016/5/11/chartex" xmlns:cx6="http://schemas.microsoft.com/office/drawing/2016/5/12/chartex" xmlns:cx7="http://schemas.microsoft.com/office/drawing/2016/5/13/chartex" xmlns:cx8="http://schemas.microsoft.com/office/drawing/2016/5/14/chartex" xmlns:mc="http://schemas.openxmlformats.org/markup-compatibility/2006" xmlns:m="http://schemas.openxmlformats.org/officeDocument/2006/math" xmlns:aink="http://schemas.microsoft.com/office/drawing/2016/ink" xmlns:am3d="http://schemas.microsoft.com/office/drawing/2017/model3d" xmlns:oel="http://schemas.microsoft.com/office/2019/extlst" xmlns:r="http://schemas.openxmlformats.org/officeDocument/2006/relationships" xmlns:wp14="http://schemas.microsoft.com/office/word/2010/wordprocessingDrawing" xmlns:wp="http://schemas.openxmlformats.org/drawingml/2006/wordprocessingDrawing" xmlns:wpg="http://schemas.microsoft.com/office/word/2010/wordprocessingGroup" xmlns:wpi="http://schemas.microsoft.com/office/word/2010/wordprocessingInk" xmlns:wps="http://schemas.microsoft.com/office/word/2010/wordprocessingShape" xmlns:o="urn:schemas-microsoft-com:office:office" xmlns:v="urn:schemas-microsoft-com:vml" xmlns:w10="urn:schemas-microsoft-com:office:word" xmlns:w="http://schemas.openxmlformats.org/wordprocessingml/2006/main" xmlns:w14="http://schemas.microsoft.com/office/word/2010/wordml" xmlns:w15="http://schemas.microsoft.com/office/word/2012/wordml" xmlns:w16cex="http://schemas.microsoft.com/office/word/2018/wordml/cex" xmlns:w16cid="http://schemas.microsoft.com/office/word/2016/wordml/cid" xmlns:w16="http://schemas.microsoft.com/office/word/2018/wordml" xmlns:w16sdtdh="http://schemas.microsoft.com/office/word/2020/wordml/sdtdatahash" xmlns:w16sdtfl="http://schemas.microsoft.com/office/word/2024/wordml/sdtformatlock" xmlns:w16se="http://schemas.microsoft.com/office/word/2015/wordml/symex" xmlns:w16du="http://schemas.microsoft.com/office/word/2023/wordml/word16du" xmlns:wne="http://schemas.microsoft.com/office/word/2006/wordml" mc:Ignorable="w14 w15 w16se w16cid w16 w16cex w16sdtdh w16sdtfl w16du wp14">
+<w:footnotes xmlns:wpc="http://schemas.microsoft.com/office/word/2010/wordprocessingCanvas" xmlns:cx="http://schemas.microsoft.com/office/drawing/2014/chartex" xmlns:cx1="http://schemas.microsoft.com/office/drawing/2015/9/8/chartex" xmlns:cx2="http://schemas.microsoft.com/office/drawing/2015/10/21/chartex" xmlns:cx3="http://schemas.microsoft.com/office/drawing/2016/5/9/chartex" xmlns:cx4="http://schemas.microsoft.com/office/drawing/2016/5/10/chartex" xmlns:cx5="http://schemas.microsoft.com/office/drawing/2016/5/11/chartex" xmlns:cx6="http://schemas.microsoft.com/office/drawing/2016/5/12/chartex" xmlns:cx7="http://schemas.microsoft.com/office/drawing/2016/5/13/chartex" xmlns:cx8="http://schemas.microsoft.com/office/drawing/2016/5/14/chartex" xmlns:mc="http://schemas.openxmlformats.org/markup-compatibility/2006" xmlns:aink="http://schemas.microsoft.com/office/drawing/2016/ink" xmlns:am3d="http://schemas.microsoft.com/office/drawing/2017/model3d" xmlns:o="urn:schemas-microsoft-com:office:office" xmlns:oel="http://schemas.microsoft.com/office/2019/extlst" xmlns:r="http://schemas.openxmlformats.org/officeDocument/2006/relationships" xmlns:m="http://schemas.openxmlformats.org/officeDocument/2006/math" xmlns:v="urn:schemas-microsoft-com:vml" xmlns:wp14="http://schemas.microsoft.com/office/word/2010/wordprocessingDrawing" xmlns:wp="http://schemas.openxmlformats.org/drawingml/2006/wordprocessingDrawing" xmlns:w10="urn:schemas-microsoft-com:office:word" xmlns:w="http://schemas.openxmlformats.org/wordprocessingml/2006/main" xmlns:w14="http://schemas.microsoft.com/office/word/2010/wordml" xmlns:w15="http://schemas.microsoft.com/office/word/2012/wordml" xmlns:w16cex="http://schemas.microsoft.com/office/word/2018/wordml/cex" xmlns:w16cid="http://schemas.microsoft.com/office/word/2016/wordml/cid" xmlns:w16="http://schemas.microsoft.com/office/word/2018/wordml" xmlns:w16du="http://schemas.microsoft.com/office/word/2023/wordml/word16du" xmlns:w16sdtdh="http://schemas.microsoft.com/office/word/2020/wordml/sdtdatahash" xmlns:w16sdtfl="http://schemas.microsoft.com/office/word/2024/wordml/sdtformatlock" xmlns:w16se="http://schemas.microsoft.com/office/word/2015/wordml/symex" xmlns:wpg="http://schemas.microsoft.com/office/word/2010/wordprocessingGroup" xmlns:wpi="http://schemas.microsoft.com/office/word/2010/wordprocessingInk" xmlns:wne="http://schemas.microsoft.com/office/word/2006/wordml" xmlns:wps="http://schemas.microsoft.com/office/word/2010/wordprocessingShape" mc:Ignorable="w14 w15 w16se w16cid w16 w16cex w16sdtdh w16sdtfl w16du wp14">
   <w:footnote w:type="separator" w:id="-1">
     <w:p>
       <w:pPr>
@@ -2559,7 +2881,7 @@
 </file>
 
 <file path=word/header1.xml><?xml version="1.0" encoding="utf-8"?>
-<w:hdr xmlns:wpc="http://schemas.microsoft.com/office/word/2010/wordprocessingCanvas" xmlns:cx="http://schemas.microsoft.com/office/drawing/2014/chartex" xmlns:cx1="http://schemas.microsoft.com/office/drawing/2015/9/8/chartex" xmlns:cx2="http://schemas.microsoft.com/office/drawing/2015/10/21/chartex" xmlns:cx3="http://schemas.microsoft.com/office/drawing/2016/5/9/chartex" xmlns:cx4="http://schemas.microsoft.com/office/drawing/2016/5/10/chartex" xmlns:cx5="http://schemas.microsoft.com/office/drawing/2016/5/11/chartex" xmlns:cx6="http://schemas.microsoft.com/office/drawing/2016/5/12/chartex" xmlns:cx7="http://schemas.microsoft.com/office/drawing/2016/5/13/chartex" xmlns:cx8="http://schemas.microsoft.com/office/drawing/2016/5/14/chartex" xmlns:mc="http://schemas.openxmlformats.org/markup-compatibility/2006" xmlns:m="http://schemas.openxmlformats.org/officeDocument/2006/math" xmlns:aink="http://schemas.microsoft.com/office/drawing/2016/ink" xmlns:am3d="http://schemas.microsoft.com/office/drawing/2017/model3d" xmlns:oel="http://schemas.microsoft.com/office/2019/extlst" xmlns:r="http://schemas.openxmlformats.org/officeDocument/2006/relationships" xmlns:wp14="http://schemas.microsoft.com/office/word/2010/wordprocessingDrawing" xmlns:wp="http://schemas.openxmlformats.org/drawingml/2006/wordprocessingDrawing" xmlns:wpg="http://schemas.microsoft.com/office/word/2010/wordprocessingGroup" xmlns:wpi="http://schemas.microsoft.com/office/word/2010/wordprocessingInk" xmlns:wps="http://schemas.microsoft.com/office/word/2010/wordprocessingShape" xmlns:o="urn:schemas-microsoft-com:office:office" xmlns:v="urn:schemas-microsoft-com:vml" xmlns:w10="urn:schemas-microsoft-com:office:word" xmlns:w="http://schemas.openxmlformats.org/wordprocessingml/2006/main" xmlns:w14="http://schemas.microsoft.com/office/word/2010/wordml" xmlns:w15="http://schemas.microsoft.com/office/word/2012/wordml" xmlns:w16cex="http://schemas.microsoft.com/office/word/2018/wordml/cex" xmlns:w16cid="http://schemas.microsoft.com/office/word/2016/wordml/cid" xmlns:w16="http://schemas.microsoft.com/office/word/2018/wordml" xmlns:w16sdtdh="http://schemas.microsoft.com/office/word/2020/wordml/sdtdatahash" xmlns:w16sdtfl="http://schemas.microsoft.com/office/word/2024/wordml/sdtformatlock" xmlns:w16se="http://schemas.microsoft.com/office/word/2015/wordml/symex" xmlns:w16du="http://schemas.microsoft.com/office/word/2023/wordml/word16du" xmlns:wne="http://schemas.microsoft.com/office/word/2006/wordml" mc:Ignorable="w14 w15 w16se w16cid w16 w16cex w16sdtdh w16sdtfl w16du wp14">
+<w:hdr xmlns:wpc="http://schemas.microsoft.com/office/word/2010/wordprocessingCanvas" xmlns:cx="http://schemas.microsoft.com/office/drawing/2014/chartex" xmlns:cx1="http://schemas.microsoft.com/office/drawing/2015/9/8/chartex" xmlns:cx2="http://schemas.microsoft.com/office/drawing/2015/10/21/chartex" xmlns:cx3="http://schemas.microsoft.com/office/drawing/2016/5/9/chartex" xmlns:cx4="http://schemas.microsoft.com/office/drawing/2016/5/10/chartex" xmlns:cx5="http://schemas.microsoft.com/office/drawing/2016/5/11/chartex" xmlns:cx6="http://schemas.microsoft.com/office/drawing/2016/5/12/chartex" xmlns:cx7="http://schemas.microsoft.com/office/drawing/2016/5/13/chartex" xmlns:cx8="http://schemas.microsoft.com/office/drawing/2016/5/14/chartex" xmlns:mc="http://schemas.openxmlformats.org/markup-compatibility/2006" xmlns:aink="http://schemas.microsoft.com/office/drawing/2016/ink" xmlns:am3d="http://schemas.microsoft.com/office/drawing/2017/model3d" xmlns:o="urn:schemas-microsoft-com:office:office" xmlns:oel="http://schemas.microsoft.com/office/2019/extlst" xmlns:r="http://schemas.openxmlformats.org/officeDocument/2006/relationships" xmlns:m="http://schemas.openxmlformats.org/officeDocument/2006/math" xmlns:v="urn:schemas-microsoft-com:vml" xmlns:wp14="http://schemas.microsoft.com/office/word/2010/wordprocessingDrawing" xmlns:wp="http://schemas.openxmlformats.org/drawingml/2006/wordprocessingDrawing" xmlns:w10="urn:schemas-microsoft-com:office:word" xmlns:w="http://schemas.openxmlformats.org/wordprocessingml/2006/main" xmlns:w14="http://schemas.microsoft.com/office/word/2010/wordml" xmlns:w15="http://schemas.microsoft.com/office/word/2012/wordml" xmlns:w16cex="http://schemas.microsoft.com/office/word/2018/wordml/cex" xmlns:w16cid="http://schemas.microsoft.com/office/word/2016/wordml/cid" xmlns:w16="http://schemas.microsoft.com/office/word/2018/wordml" xmlns:w16du="http://schemas.microsoft.com/office/word/2023/wordml/word16du" xmlns:w16sdtdh="http://schemas.microsoft.com/office/word/2020/wordml/sdtdatahash" xmlns:w16sdtfl="http://schemas.microsoft.com/office/word/2024/wordml/sdtformatlock" xmlns:w16se="http://schemas.microsoft.com/office/word/2015/wordml/symex" xmlns:wpg="http://schemas.microsoft.com/office/word/2010/wordprocessingGroup" xmlns:wpi="http://schemas.microsoft.com/office/word/2010/wordprocessingInk" xmlns:wne="http://schemas.microsoft.com/office/word/2006/wordml" xmlns:wps="http://schemas.microsoft.com/office/word/2010/wordprocessingShape" mc:Ignorable="w14 w15 w16se w16cid w16 w16cex w16sdtdh w16sdtfl w16du wp14">
   <w:p>
     <w:pPr>
       <w:pStyle w:val="Header"/>
@@ -2577,7 +2899,7 @@
 </file>
 
 <file path=word/numbering.xml><?xml version="1.0" encoding="utf-8"?>
-<w:numbering xmlns:wpc="http://schemas.microsoft.com/office/word/2010/wordprocessingCanvas" xmlns:cx="http://schemas.microsoft.com/office/drawing/2014/chartex" xmlns:cx1="http://schemas.microsoft.com/office/drawing/2015/9/8/chartex" xmlns:cx2="http://schemas.microsoft.com/office/drawing/2015/10/21/chartex" xmlns:cx3="http://schemas.microsoft.com/office/drawing/2016/5/9/chartex" xmlns:cx4="http://schemas.microsoft.com/office/drawing/2016/5/10/chartex" xmlns:cx5="http://schemas.microsoft.com/office/drawing/2016/5/11/chartex" xmlns:cx6="http://schemas.microsoft.com/office/drawing/2016/5/12/chartex" xmlns:cx7="http://schemas.microsoft.com/office/drawing/2016/5/13/chartex" xmlns:cx8="http://schemas.microsoft.com/office/drawing/2016/5/14/chartex" xmlns:mc="http://schemas.openxmlformats.org/markup-compatibility/2006" xmlns:m="http://schemas.openxmlformats.org/officeDocument/2006/math" xmlns:aink="http://schemas.microsoft.com/office/drawing/2016/ink" xmlns:am3d="http://schemas.microsoft.com/office/drawing/2017/model3d" xmlns:oel="http://schemas.microsoft.com/office/2019/extlst" xmlns:r="http://schemas.openxmlformats.org/officeDocument/2006/relationships" xmlns:wp14="http://schemas.microsoft.com/office/word/2010/wordprocessingDrawing" xmlns:wp="http://schemas.openxmlformats.org/drawingml/2006/wordprocessingDrawing" xmlns:wpg="http://schemas.microsoft.com/office/word/2010/wordprocessingGroup" xmlns:wpi="http://schemas.microsoft.com/office/word/2010/wordprocessingInk" xmlns:wps="http://schemas.microsoft.com/office/word/2010/wordprocessingShape" xmlns:o="urn:schemas-microsoft-com:office:office" xmlns:v="urn:schemas-microsoft-com:vml" xmlns:w10="urn:schemas-microsoft-com:office:word" xmlns:w="http://schemas.openxmlformats.org/wordprocessingml/2006/main" xmlns:w14="http://schemas.microsoft.com/office/word/2010/wordml" xmlns:w15="http://schemas.microsoft.com/office/word/2012/wordml" xmlns:w16cex="http://schemas.microsoft.com/office/word/2018/wordml/cex" xmlns:w16cid="http://schemas.microsoft.com/office/word/2016/wordml/cid" xmlns:w16="http://schemas.microsoft.com/office/word/2018/wordml" xmlns:w16sdtdh="http://schemas.microsoft.com/office/word/2020/wordml/sdtdatahash" xmlns:w16sdtfl="http://schemas.microsoft.com/office/word/2024/wordml/sdtformatlock" xmlns:w16se="http://schemas.microsoft.com/office/word/2015/wordml/symex" xmlns:w16du="http://schemas.microsoft.com/office/word/2023/wordml/word16du" xmlns:wne="http://schemas.microsoft.com/office/word/2006/wordml" mc:Ignorable="w14 w15 w16se w16cid w16 w16cex w16sdtdh w16sdtfl w16du wp14">
+<w:numbering xmlns:wpc="http://schemas.microsoft.com/office/word/2010/wordprocessingCanvas" xmlns:cx="http://schemas.microsoft.com/office/drawing/2014/chartex" xmlns:cx1="http://schemas.microsoft.com/office/drawing/2015/9/8/chartex" xmlns:cx2="http://schemas.microsoft.com/office/drawing/2015/10/21/chartex" xmlns:cx3="http://schemas.microsoft.com/office/drawing/2016/5/9/chartex" xmlns:cx4="http://schemas.microsoft.com/office/drawing/2016/5/10/chartex" xmlns:cx5="http://schemas.microsoft.com/office/drawing/2016/5/11/chartex" xmlns:cx6="http://schemas.microsoft.com/office/drawing/2016/5/12/chartex" xmlns:cx7="http://schemas.microsoft.com/office/drawing/2016/5/13/chartex" xmlns:cx8="http://schemas.microsoft.com/office/drawing/2016/5/14/chartex" xmlns:mc="http://schemas.openxmlformats.org/markup-compatibility/2006" xmlns:aink="http://schemas.microsoft.com/office/drawing/2016/ink" xmlns:am3d="http://schemas.microsoft.com/office/drawing/2017/model3d" xmlns:o="urn:schemas-microsoft-com:office:office" xmlns:oel="http://schemas.microsoft.com/office/2019/extlst" xmlns:r="http://schemas.openxmlformats.org/officeDocument/2006/relationships" xmlns:m="http://schemas.openxmlformats.org/officeDocument/2006/math" xmlns:v="urn:schemas-microsoft-com:vml" xmlns:wp14="http://schemas.microsoft.com/office/word/2010/wordprocessingDrawing" xmlns:wp="http://schemas.openxmlformats.org/drawingml/2006/wordprocessingDrawing" xmlns:w10="urn:schemas-microsoft-com:office:word" xmlns:w="http://schemas.openxmlformats.org/wordprocessingml/2006/main" xmlns:w14="http://schemas.microsoft.com/office/word/2010/wordml" xmlns:w15="http://schemas.microsoft.com/office/word/2012/wordml" xmlns:w16cex="http://schemas.microsoft.com/office/word/2018/wordml/cex" xmlns:w16cid="http://schemas.microsoft.com/office/word/2016/wordml/cid" xmlns:w16="http://schemas.microsoft.com/office/word/2018/wordml" xmlns:w16du="http://schemas.microsoft.com/office/word/2023/wordml/word16du" xmlns:w16sdtdh="http://schemas.microsoft.com/office/word/2020/wordml/sdtdatahash" xmlns:w16sdtfl="http://schemas.microsoft.com/office/word/2024/wordml/sdtformatlock" xmlns:w16se="http://schemas.microsoft.com/office/word/2015/wordml/symex" xmlns:wpg="http://schemas.microsoft.com/office/word/2010/wordprocessingGroup" xmlns:wpi="http://schemas.microsoft.com/office/word/2010/wordprocessingInk" xmlns:wne="http://schemas.microsoft.com/office/word/2006/wordml" xmlns:wps="http://schemas.microsoft.com/office/word/2010/wordprocessingShape" mc:Ignorable="w14 w15 w16se w16cid w16 w16cex w16sdtdh w16sdtfl w16du wp14">
   <w:abstractNum w:abstractNumId="0" w15:restartNumberingAfterBreak="0">
     <w:nsid w:val="FFFFFF7C"/>
     <w:multiLevelType w:val="singleLevel"/>
@@ -2780,7 +3102,7 @@
 </file>
 
 <file path=word/styles.xml><?xml version="1.0" encoding="utf-8"?>
-<w:styles xmlns:mc="http://schemas.openxmlformats.org/markup-compatibility/2006" xmlns:r="http://schemas.openxmlformats.org/officeDocument/2006/relationships" xmlns:w="http://schemas.openxmlformats.org/wordprocessingml/2006/main" xmlns:w14="http://schemas.microsoft.com/office/word/2010/wordml" xmlns:w15="http://schemas.microsoft.com/office/word/2012/wordml" xmlns:w16cex="http://schemas.microsoft.com/office/word/2018/wordml/cex" xmlns:w16cid="http://schemas.microsoft.com/office/word/2016/wordml/cid" xmlns:w16="http://schemas.microsoft.com/office/word/2018/wordml" xmlns:w16sdtdh="http://schemas.microsoft.com/office/word/2020/wordml/sdtdatahash" xmlns:w16sdtfl="http://schemas.microsoft.com/office/word/2024/wordml/sdtformatlock" xmlns:w16se="http://schemas.microsoft.com/office/word/2015/wordml/symex" xmlns:w16du="http://schemas.microsoft.com/office/word/2023/wordml/word16du" mc:Ignorable="w14 w15 w16se w16cid w16 w16cex w16sdtdh w16sdtfl w16du">
+<w:styles xmlns:mc="http://schemas.openxmlformats.org/markup-compatibility/2006" xmlns:r="http://schemas.openxmlformats.org/officeDocument/2006/relationships" xmlns:w="http://schemas.openxmlformats.org/wordprocessingml/2006/main" xmlns:w14="http://schemas.microsoft.com/office/word/2010/wordml" xmlns:w15="http://schemas.microsoft.com/office/word/2012/wordml" xmlns:w16cex="http://schemas.microsoft.com/office/word/2018/wordml/cex" xmlns:w16cid="http://schemas.microsoft.com/office/word/2016/wordml/cid" xmlns:w16="http://schemas.microsoft.com/office/word/2018/wordml" xmlns:w16du="http://schemas.microsoft.com/office/word/2023/wordml/word16du" xmlns:w16sdtdh="http://schemas.microsoft.com/office/word/2020/wordml/sdtdatahash" xmlns:w16sdtfl="http://schemas.microsoft.com/office/word/2024/wordml/sdtformatlock" xmlns:w16se="http://schemas.microsoft.com/office/word/2015/wordml/symex" mc:Ignorable="w14 w15 w16se w16cid w16 w16cex w16sdtdh w16sdtfl w16du">
   <w:docDefaults>
     <w:rPrDefault>
       <w:rPr>
@@ -3387,7 +3709,6 @@
   <w:style w:type="character" w:default="1" w:styleId="DefaultParagraphFont">
     <w:name w:val="Default Paragraph Font"/>
     <w:uiPriority w:val="1"/>
-    <w:semiHidden/>
     <w:unhideWhenUsed/>
   </w:style>
   <w:style w:type="table" w:default="1" w:styleId="TableNormal">

</xml_diff>

<commit_message>
docs[Lab_Report]: Added new Screenshot, and minor fixes.
</commit_message>
<xml_diff>
--- a/CCCS106_Lab01_Report_Template.docx
+++ b/CCCS106_Lab01_Report_Template.docx
@@ -1,6 +1,6 @@
 
 <file path=word/document.xml><?xml version="1.0" encoding="utf-8"?>
-<w:document xmlns:wpc="http://schemas.microsoft.com/office/word/2010/wordprocessingCanvas" xmlns:cx="http://schemas.microsoft.com/office/drawing/2014/chartex" xmlns:cx1="http://schemas.microsoft.com/office/drawing/2015/9/8/chartex" xmlns:cx2="http://schemas.microsoft.com/office/drawing/2015/10/21/chartex" xmlns:cx3="http://schemas.microsoft.com/office/drawing/2016/5/9/chartex" xmlns:cx4="http://schemas.microsoft.com/office/drawing/2016/5/10/chartex" xmlns:cx5="http://schemas.microsoft.com/office/drawing/2016/5/11/chartex" xmlns:cx6="http://schemas.microsoft.com/office/drawing/2016/5/12/chartex" xmlns:cx7="http://schemas.microsoft.com/office/drawing/2016/5/13/chartex" xmlns:cx8="http://schemas.microsoft.com/office/drawing/2016/5/14/chartex" xmlns:mc="http://schemas.openxmlformats.org/markup-compatibility/2006" xmlns:aink="http://schemas.microsoft.com/office/drawing/2016/ink" xmlns:am3d="http://schemas.microsoft.com/office/drawing/2017/model3d" xmlns:o="urn:schemas-microsoft-com:office:office" xmlns:oel="http://schemas.microsoft.com/office/2019/extlst" xmlns:r="http://schemas.openxmlformats.org/officeDocument/2006/relationships" xmlns:m="http://schemas.openxmlformats.org/officeDocument/2006/math" xmlns:v="urn:schemas-microsoft-com:vml" xmlns:wp14="http://schemas.microsoft.com/office/word/2010/wordprocessingDrawing" xmlns:wp="http://schemas.openxmlformats.org/drawingml/2006/wordprocessingDrawing" xmlns:w10="urn:schemas-microsoft-com:office:word" xmlns:w="http://schemas.openxmlformats.org/wordprocessingml/2006/main" xmlns:w14="http://schemas.microsoft.com/office/word/2010/wordml" xmlns:w15="http://schemas.microsoft.com/office/word/2012/wordml" xmlns:w16cex="http://schemas.microsoft.com/office/word/2018/wordml/cex" xmlns:w16cid="http://schemas.microsoft.com/office/word/2016/wordml/cid" xmlns:w16="http://schemas.microsoft.com/office/word/2018/wordml" xmlns:w16du="http://schemas.microsoft.com/office/word/2023/wordml/word16du" xmlns:w16sdtdh="http://schemas.microsoft.com/office/word/2020/wordml/sdtdatahash" xmlns:w16sdtfl="http://schemas.microsoft.com/office/word/2024/wordml/sdtformatlock" xmlns:w16se="http://schemas.microsoft.com/office/word/2015/wordml/symex" xmlns:wpg="http://schemas.microsoft.com/office/word/2010/wordprocessingGroup" xmlns:wpi="http://schemas.microsoft.com/office/word/2010/wordprocessingInk" xmlns:wne="http://schemas.microsoft.com/office/word/2006/wordml" xmlns:wps="http://schemas.microsoft.com/office/word/2010/wordprocessingShape" mc:Ignorable="w14 w15 w16se w16cid w16 w16cex w16sdtdh w16sdtfl w16du wp14">
+<w:document xmlns:wpc="http://schemas.microsoft.com/office/word/2010/wordprocessingCanvas" xmlns:cx="http://schemas.microsoft.com/office/drawing/2014/chartex" xmlns:cx1="http://schemas.microsoft.com/office/drawing/2015/9/8/chartex" xmlns:cx2="http://schemas.microsoft.com/office/drawing/2015/10/21/chartex" xmlns:cx3="http://schemas.microsoft.com/office/drawing/2016/5/9/chartex" xmlns:cx4="http://schemas.microsoft.com/office/drawing/2016/5/10/chartex" xmlns:cx5="http://schemas.microsoft.com/office/drawing/2016/5/11/chartex" xmlns:cx6="http://schemas.microsoft.com/office/drawing/2016/5/12/chartex" xmlns:cx7="http://schemas.microsoft.com/office/drawing/2016/5/13/chartex" xmlns:cx8="http://schemas.microsoft.com/office/drawing/2016/5/14/chartex" xmlns:mc="http://schemas.openxmlformats.org/markup-compatibility/2006" xmlns:m="http://schemas.openxmlformats.org/officeDocument/2006/math" xmlns:aink="http://schemas.microsoft.com/office/drawing/2016/ink" xmlns:am3d="http://schemas.microsoft.com/office/drawing/2017/model3d" xmlns:oel="http://schemas.microsoft.com/office/2019/extlst" xmlns:r="http://schemas.openxmlformats.org/officeDocument/2006/relationships" xmlns:wp14="http://schemas.microsoft.com/office/word/2010/wordprocessingDrawing" xmlns:wp="http://schemas.openxmlformats.org/drawingml/2006/wordprocessingDrawing" xmlns:wpg="http://schemas.microsoft.com/office/word/2010/wordprocessingGroup" xmlns:wpi="http://schemas.microsoft.com/office/word/2010/wordprocessingInk" xmlns:wps="http://schemas.microsoft.com/office/word/2010/wordprocessingShape" xmlns:o="urn:schemas-microsoft-com:office:office" xmlns:v="urn:schemas-microsoft-com:vml" xmlns:w10="urn:schemas-microsoft-com:office:word" xmlns:w="http://schemas.openxmlformats.org/wordprocessingml/2006/main" xmlns:w14="http://schemas.microsoft.com/office/word/2010/wordml" xmlns:w15="http://schemas.microsoft.com/office/word/2012/wordml" xmlns:w16cex="http://schemas.microsoft.com/office/word/2018/wordml/cex" xmlns:w16cid="http://schemas.microsoft.com/office/word/2016/wordml/cid" xmlns:w16="http://schemas.microsoft.com/office/word/2018/wordml" xmlns:w16sdtdh="http://schemas.microsoft.com/office/word/2020/wordml/sdtdatahash" xmlns:w16sdtfl="http://schemas.microsoft.com/office/word/2024/wordml/sdtformatlock" xmlns:w16se="http://schemas.microsoft.com/office/word/2015/wordml/symex" xmlns:w16du="http://schemas.microsoft.com/office/word/2023/wordml/word16du" xmlns:wne="http://schemas.microsoft.com/office/word/2006/wordml" mc:Ignorable="w14 w15 w16se w16cid w16 w16cex w16sdtdh w16sdtfl w16du wp14">
   <w:body>
     <w:p>
       <w:pPr>
@@ -155,6 +155,7 @@
               </w:rPr>
               <w:t xml:space="preserve">Group No. [ </w:t>
             </w:r>
+            <w:proofErr w:type="gramStart"/>
             <w:r>
               <w:rPr>
                 <w:color w:val="0F172A"/>
@@ -167,7 +168,15 @@
                 <w:color w:val="0F172A"/>
                 <w:sz w:val="19"/>
               </w:rPr>
-              <w:t xml:space="preserve"> ]  (e.g., Group 03)</w:t>
+              <w:t xml:space="preserve"> ]</w:t>
+            </w:r>
+            <w:proofErr w:type="gramEnd"/>
+            <w:r>
+              <w:rPr>
+                <w:color w:val="0F172A"/>
+                <w:sz w:val="19"/>
+              </w:rPr>
+              <w:t xml:space="preserve">  (e.g., Group 03)</w:t>
             </w:r>
           </w:p>
         </w:tc>
@@ -220,8 +229,31 @@
                 <w:color w:val="0F172A"/>
                 <w:sz w:val="19"/>
               </w:rPr>
-              <w:t>[ Month DD, 2026 ]</w:t>
+              <w:t xml:space="preserve">[ </w:t>
             </w:r>
+            <w:r>
+              <w:rPr>
+                <w:color w:val="0F172A"/>
+                <w:sz w:val="19"/>
+              </w:rPr>
+              <w:t>September</w:t>
+            </w:r>
+            <w:r>
+              <w:rPr>
+                <w:color w:val="0F172A"/>
+                <w:sz w:val="19"/>
+              </w:rPr>
+              <w:t xml:space="preserve"> DD, </w:t>
+            </w:r>
+            <w:proofErr w:type="gramStart"/>
+            <w:r>
+              <w:rPr>
+                <w:color w:val="0F172A"/>
+                <w:sz w:val="19"/>
+              </w:rPr>
+              <w:t>2026 ]</w:t>
+            </w:r>
+            <w:proofErr w:type="gramEnd"/>
           </w:p>
         </w:tc>
       </w:tr>
@@ -443,8 +475,17 @@
                 <w:b/>
                 <w:sz w:val="18"/>
               </w:rPr>
-              <w:t>[ Lead Student Name ]</w:t>
+              <w:t xml:space="preserve">[ Lead Student </w:t>
             </w:r>
+            <w:proofErr w:type="gramStart"/>
+            <w:r>
+              <w:rPr>
+                <w:b/>
+                <w:sz w:val="18"/>
+              </w:rPr>
+              <w:t>Name ]</w:t>
+            </w:r>
+            <w:proofErr w:type="gramEnd"/>
           </w:p>
         </w:tc>
         <w:tc>
@@ -567,7 +608,15 @@
                 <w:b/>
                 <w:sz w:val="18"/>
               </w:rPr>
-              <w:t>Renz Angelo S. Priela</w:t>
+              <w:t xml:space="preserve">Renz Angelo S. </w:t>
+            </w:r>
+            <w:proofErr w:type="gramStart"/>
+            <w:r>
+              <w:rPr>
+                <w:b/>
+                <w:sz w:val="18"/>
+              </w:rPr>
+              <w:t>Priela</w:t>
             </w:r>
             <w:r>
               <w:rPr>
@@ -576,6 +625,7 @@
               </w:rPr>
               <w:t xml:space="preserve"> ]</w:t>
             </w:r>
+            <w:proofErr w:type="gramEnd"/>
           </w:p>
         </w:tc>
         <w:tc>
@@ -593,6 +643,12 @@
             <w:pPr>
               <w:spacing w:after="0"/>
             </w:pPr>
+            <w:r>
+              <w:rPr>
+                <w:sz w:val="18"/>
+              </w:rPr>
+              <w:t>2024-</w:t>
+            </w:r>
             <w:r>
               <w:rPr>
                 <w:sz w:val="18"/>
@@ -685,8 +741,17 @@
                 <w:b/>
                 <w:sz w:val="18"/>
               </w:rPr>
-              <w:t>[ Partner C Name ]</w:t>
+              <w:t xml:space="preserve">[ Partner C </w:t>
             </w:r>
+            <w:proofErr w:type="gramStart"/>
+            <w:r>
+              <w:rPr>
+                <w:b/>
+                <w:sz w:val="18"/>
+              </w:rPr>
+              <w:t>Name ]</w:t>
+            </w:r>
+            <w:proofErr w:type="gramEnd"/>
           </w:p>
         </w:tc>
         <w:tc>
@@ -794,7 +859,23 @@
           <w:color w:val="2563EB"/>
           <w:u w:val="single"/>
         </w:rPr>
-        <w:t>https://github.com/[developer1-username]/cccs106-group[XX]-showcase</w:t>
+        <w:t>https://github.com/[developer1-username]/cccs106-</w:t>
+      </w:r>
+      <w:proofErr w:type="gramStart"/>
+      <w:r>
+        <w:rPr>
+          <w:color w:val="2563EB"/>
+          <w:u w:val="single"/>
+        </w:rPr>
+        <w:t>group[</w:t>
+      </w:r>
+      <w:proofErr w:type="gramEnd"/>
+      <w:r>
+        <w:rPr>
+          <w:color w:val="2563EB"/>
+          <w:u w:val="single"/>
+        </w:rPr>
+        <w:t>XX]-showcase</w:t>
       </w:r>
     </w:p>
     <w:p>
@@ -898,8 +979,18 @@
                 <w:color w:val="475569"/>
                 <w:sz w:val="22"/>
               </w:rPr>
-              <w:t>[ PASTE / INSERT SCREENSHOT IMAGE HERE ]</w:t>
+              <w:t xml:space="preserve">[ PASTE / INSERT SCREENSHOT IMAGE </w:t>
             </w:r>
+            <w:proofErr w:type="gramStart"/>
+            <w:r>
+              <w:rPr>
+                <w:b/>
+                <w:color w:val="475569"/>
+                <w:sz w:val="22"/>
+              </w:rPr>
+              <w:t>HERE ]</w:t>
+            </w:r>
+            <w:proofErr w:type="gramEnd"/>
             <w:r>
               <w:rPr>
                 <w:b/>
@@ -959,7 +1050,15 @@
     </w:p>
     <w:p>
       <w:r>
-        <w:t>Pre-flight workstation audit executed via 'python verify_setup.py' inside the active virtual environment (.venv). All six (6) audit checks must report [PASS] verifying Python 3.10+, virtualenv isolation, Flet SDK v0.86.5+, Git binary detection, configured institutional user identity, and .gitignore hygiene.</w:t>
+        <w:t xml:space="preserve">Pre-flight workstation audit executed via 'python verify_setup.py' inside the active virtual environment (.venv). All six (6) audit checks must report [PASS] verifying Python 3.10+, virtualenv isolation, Flet SDK v0.86.5+, Git binary detection, configured institutional user identity, </w:t>
+      </w:r>
+      <w:proofErr w:type="gramStart"/>
+      <w:r>
+        <w:t>and .gitignore</w:t>
+      </w:r>
+      <w:proofErr w:type="gramEnd"/>
+      <w:r>
+        <w:t xml:space="preserve"> hygiene.</w:t>
       </w:r>
     </w:p>
     <w:tbl>
@@ -1102,8 +1201,18 @@
                 <w:color w:val="475569"/>
                 <w:sz w:val="22"/>
               </w:rPr>
-              <w:t xml:space="preserve"> [PASTE / INSERT SCREENSHOT IMAGE HERE ]</w:t>
+              <w:t xml:space="preserve"> [PASTE / INSERT SCREENSHOT IMAGE </w:t>
             </w:r>
+            <w:proofErr w:type="gramStart"/>
+            <w:r>
+              <w:rPr>
+                <w:b/>
+                <w:color w:val="475569"/>
+                <w:sz w:val="22"/>
+              </w:rPr>
+              <w:t>HERE ]</w:t>
+            </w:r>
+            <w:proofErr w:type="gramEnd"/>
             <w:r>
               <w:rPr>
                 <w:b/>
@@ -1158,12 +1267,28 @@
         <w:spacing w:before="280" w:after="120"/>
       </w:pPr>
       <w:r>
-        <w:t>Section 3: Git Working Tree Cleanliness &amp; .gitignore Audit</w:t>
+        <w:t xml:space="preserve">Section 3: Git Working Tree Cleanliness </w:t>
+      </w:r>
+      <w:proofErr w:type="gramStart"/>
+      <w:r>
+        <w:t>&amp; .gitignore</w:t>
+      </w:r>
+      <w:proofErr w:type="gramEnd"/>
+      <w:r>
+        <w:t xml:space="preserve"> Audit</w:t>
       </w:r>
     </w:p>
     <w:p>
       <w:r>
-        <w:t>Demonstration of repository hygiene. The screenshot proves that the working tree is clean with zero uncommitted changes, and that .venv/ is completely untracked (verified by running 'git ls-files .venv', returning empty output).</w:t>
+        <w:t xml:space="preserve">Demonstration of repository hygiene. The screenshot proves that the working tree is clean with zero uncommitted changes, and </w:t>
+      </w:r>
+      <w:proofErr w:type="gramStart"/>
+      <w:r>
+        <w:t>that .venv</w:t>
+      </w:r>
+      <w:proofErr w:type="gramEnd"/>
+      <w:r>
+        <w:t>/ is completely untracked (verified by running 'git ls-files .venv', returning empty output).</w:t>
       </w:r>
     </w:p>
     <w:tbl>
@@ -1216,9 +1341,9 @@
               </w:rPr>
               <w:lastRenderedPageBreak/>
               <w:drawing>
-                <wp:inline distT="0" distB="0" distL="0" distR="0" wp14:anchorId="4D5674C2" wp14:editId="2C88850E">
-                  <wp:extent cx="5689600" cy="3200400"/>
-                  <wp:effectExtent l="0" t="0" r="6350" b="0"/>
+                <wp:inline distT="0" distB="0" distL="0" distR="0" wp14:anchorId="4D5674C2" wp14:editId="0D14F980">
+                  <wp:extent cx="4550735" cy="2559788"/>
+                  <wp:effectExtent l="0" t="0" r="0" b="5715"/>
                   <wp:docPr id="394996854" name="Picture 3"/>
                   <wp:cNvGraphicFramePr>
                     <a:graphicFrameLocks xmlns:a="http://schemas.openxmlformats.org/drawingml/2006/main" noChangeAspect="1"/>
@@ -1239,7 +1364,61 @@
                         <pic:spPr>
                           <a:xfrm>
                             <a:off x="0" y="0"/>
-                            <a:ext cx="5689600" cy="3200400"/>
+                            <a:ext cx="4575751" cy="2573859"/>
+                          </a:xfrm>
+                          <a:prstGeom prst="rect">
+                            <a:avLst/>
+                          </a:prstGeom>
+                        </pic:spPr>
+                      </pic:pic>
+                    </a:graphicData>
+                  </a:graphic>
+                </wp:inline>
+              </w:drawing>
+            </w:r>
+          </w:p>
+          <w:p>
+            <w:pPr>
+              <w:spacing w:before="240" w:after="80"/>
+              <w:jc w:val="center"/>
+              <w:rPr>
+                <w:b/>
+                <w:color w:val="475569"/>
+                <w:sz w:val="22"/>
+              </w:rPr>
+            </w:pPr>
+            <w:r>
+              <w:rPr>
+                <w:b/>
+                <w:noProof/>
+                <w:color w:val="475569"/>
+                <w:sz w:val="22"/>
+              </w:rPr>
+              <w:drawing>
+                <wp:inline distT="0" distB="0" distL="0" distR="0" wp14:anchorId="22C7353A" wp14:editId="1875D2D7">
+                  <wp:extent cx="4231758" cy="1361625"/>
+                  <wp:effectExtent l="0" t="0" r="0" b="0"/>
+                  <wp:docPr id="793809037" name="Picture 1"/>
+                  <wp:cNvGraphicFramePr>
+                    <a:graphicFrameLocks xmlns:a="http://schemas.openxmlformats.org/drawingml/2006/main" noChangeAspect="1"/>
+                  </wp:cNvGraphicFramePr>
+                  <a:graphic xmlns:a="http://schemas.openxmlformats.org/drawingml/2006/main">
+                    <a:graphicData uri="http://schemas.openxmlformats.org/drawingml/2006/picture">
+                      <pic:pic xmlns:pic="http://schemas.openxmlformats.org/drawingml/2006/picture">
+                        <pic:nvPicPr>
+                          <pic:cNvPr id="793809037" name="Picture 793809037"/>
+                          <pic:cNvPicPr/>
+                        </pic:nvPicPr>
+                        <pic:blipFill>
+                          <a:blip r:embed="rId12"/>
+                          <a:stretch>
+                            <a:fillRect/>
+                          </a:stretch>
+                        </pic:blipFill>
+                        <pic:spPr>
+                          <a:xfrm>
+                            <a:off x="0" y="0"/>
+                            <a:ext cx="4351219" cy="1400063"/>
                           </a:xfrm>
                           <a:prstGeom prst="rect">
                             <a:avLst/>
@@ -1263,8 +1442,18 @@
                 <w:color w:val="475569"/>
                 <w:sz w:val="22"/>
               </w:rPr>
-              <w:t>[ PASTE / INSERT SCREENSHOT IMAGE HERE ]</w:t>
+              <w:t xml:space="preserve">[ PASTE / INSERT SCREENSHOT IMAGE </w:t>
             </w:r>
+            <w:proofErr w:type="gramStart"/>
+            <w:r>
+              <w:rPr>
+                <w:b/>
+                <w:color w:val="475569"/>
+                <w:sz w:val="22"/>
+              </w:rPr>
+              <w:t>HERE ]</w:t>
+            </w:r>
+            <w:proofErr w:type="gramEnd"/>
             <w:r>
               <w:rPr>
                 <w:b/>
@@ -1279,7 +1468,25 @@
                 <w:color w:val="64748B"/>
                 <w:sz w:val="19"/>
               </w:rPr>
-              <w:t>Reference: Git Working Tree Cleanliness &amp; .gitignore Hygiene Proof</w:t>
+              <w:t xml:space="preserve">Reference: Git Working Tree Cleanliness </w:t>
+            </w:r>
+            <w:proofErr w:type="gramStart"/>
+            <w:r>
+              <w:rPr>
+                <w:i/>
+                <w:color w:val="64748B"/>
+                <w:sz w:val="19"/>
+              </w:rPr>
+              <w:t>&amp; .gitignore</w:t>
+            </w:r>
+            <w:proofErr w:type="gramEnd"/>
+            <w:r>
+              <w:rPr>
+                <w:i/>
+                <w:color w:val="64748B"/>
+                <w:sz w:val="19"/>
+              </w:rPr>
+              <w:t xml:space="preserve"> Hygiene Proof</w:t>
             </w:r>
             <w:r>
               <w:rPr>
@@ -1310,7 +1517,23 @@
           <w:b/>
           <w:sz w:val="19"/>
         </w:rPr>
-        <w:t>Figure 3: Git Working Tree Cleanliness &amp; .gitignore Hygiene Proof</w:t>
+        <w:t xml:space="preserve">Figure 3: Git Working Tree Cleanliness </w:t>
+      </w:r>
+      <w:proofErr w:type="gramStart"/>
+      <w:r>
+        <w:rPr>
+          <w:b/>
+          <w:sz w:val="19"/>
+        </w:rPr>
+        <w:t>&amp; .gitignore</w:t>
+      </w:r>
+      <w:proofErr w:type="gramEnd"/>
+      <w:r>
+        <w:rPr>
+          <w:b/>
+          <w:sz w:val="19"/>
+        </w:rPr>
+        <w:t xml:space="preserve"> Hygiene Proof</w:t>
       </w:r>
     </w:p>
     <w:p>
@@ -1397,7 +1620,7 @@
                           <pic:cNvPicPr/>
                         </pic:nvPicPr>
                         <pic:blipFill>
-                          <a:blip r:embed="rId12"/>
+                          <a:blip r:embed="rId13"/>
                           <a:stretch>
                             <a:fillRect/>
                           </a:stretch>
@@ -1422,6 +1645,60 @@
             <w:pPr>
               <w:spacing w:before="240" w:after="80"/>
               <w:jc w:val="center"/>
+              <w:rPr>
+                <w:b/>
+                <w:color w:val="475569"/>
+                <w:sz w:val="22"/>
+              </w:rPr>
+            </w:pPr>
+            <w:r>
+              <w:rPr>
+                <w:b/>
+                <w:noProof/>
+                <w:color w:val="475569"/>
+                <w:sz w:val="22"/>
+              </w:rPr>
+              <w:drawing>
+                <wp:inline distT="0" distB="0" distL="0" distR="0" wp14:anchorId="24DA492F" wp14:editId="14E77438">
+                  <wp:extent cx="1865702" cy="2299854"/>
+                  <wp:effectExtent l="0" t="0" r="1270" b="0"/>
+                  <wp:docPr id="2088159481" name="Picture 2"/>
+                  <wp:cNvGraphicFramePr>
+                    <a:graphicFrameLocks xmlns:a="http://schemas.openxmlformats.org/drawingml/2006/main" noChangeAspect="1"/>
+                  </wp:cNvGraphicFramePr>
+                  <a:graphic xmlns:a="http://schemas.openxmlformats.org/drawingml/2006/main">
+                    <a:graphicData uri="http://schemas.openxmlformats.org/drawingml/2006/picture">
+                      <pic:pic xmlns:pic="http://schemas.openxmlformats.org/drawingml/2006/picture">
+                        <pic:nvPicPr>
+                          <pic:cNvPr id="2088159481" name="Picture 2088159481"/>
+                          <pic:cNvPicPr/>
+                        </pic:nvPicPr>
+                        <pic:blipFill>
+                          <a:blip r:embed="rId14"/>
+                          <a:stretch>
+                            <a:fillRect/>
+                          </a:stretch>
+                        </pic:blipFill>
+                        <pic:spPr>
+                          <a:xfrm>
+                            <a:off x="0" y="0"/>
+                            <a:ext cx="1911341" cy="2356114"/>
+                          </a:xfrm>
+                          <a:prstGeom prst="rect">
+                            <a:avLst/>
+                          </a:prstGeom>
+                        </pic:spPr>
+                      </pic:pic>
+                    </a:graphicData>
+                  </a:graphic>
+                </wp:inline>
+              </w:drawing>
+            </w:r>
+          </w:p>
+          <w:p>
+            <w:pPr>
+              <w:spacing w:before="240" w:after="80"/>
+              <w:jc w:val="center"/>
             </w:pPr>
             <w:r>
               <w:rPr>
@@ -1429,8 +1706,18 @@
                 <w:color w:val="475569"/>
                 <w:sz w:val="22"/>
               </w:rPr>
-              <w:t>[ PASTE / INSERT SCREENSHOT IMAGE HERE ]</w:t>
+              <w:t xml:space="preserve">[ PASTE / INSERT SCREENSHOT IMAGE </w:t>
             </w:r>
+            <w:proofErr w:type="gramStart"/>
+            <w:r>
+              <w:rPr>
+                <w:b/>
+                <w:color w:val="475569"/>
+                <w:sz w:val="22"/>
+              </w:rPr>
+              <w:t>HERE ]</w:t>
+            </w:r>
+            <w:proofErr w:type="gramEnd"/>
             <w:r>
               <w:rPr>
                 <w:b/>
@@ -1476,7 +1763,218 @@
           <w:b/>
           <w:sz w:val="19"/>
         </w:rPr>
+        <w:lastRenderedPageBreak/>
         <w:t>Figure 4: Application Initial Launch State</w:t>
+      </w:r>
+    </w:p>
+    <w:tbl>
+      <w:tblPr>
+        <w:tblW w:w="0" w:type="auto"/>
+        <w:jc w:val="center"/>
+        <w:tblLayout w:type="fixed"/>
+        <w:tblLook w:val="04A0" w:firstRow="1" w:lastRow="0" w:firstColumn="1" w:lastColumn="0" w:noHBand="0" w:noVBand="1"/>
+      </w:tblPr>
+      <w:tblGrid>
+        <w:gridCol w:w="9360"/>
+      </w:tblGrid>
+      <w:tr>
+        <w:trPr>
+          <w:jc w:val="center"/>
+        </w:trPr>
+        <w:tc>
+          <w:tcPr>
+            <w:tcW w:w="9360" w:type="dxa"/>
+            <w:tcBorders>
+              <w:top w:val="dashed" w:sz="6" w:space="0" w:color="94A3B8"/>
+              <w:left w:val="dashed" w:sz="6" w:space="0" w:color="94A3B8"/>
+              <w:bottom w:val="dashed" w:sz="6" w:space="0" w:color="94A3B8"/>
+              <w:right w:val="dashed" w:sz="6" w:space="0" w:color="94A3B8"/>
+            </w:tcBorders>
+            <w:shd w:val="clear" w:color="auto" w:fill="F8FAFC"/>
+            <w:tcMar>
+              <w:top w:w="200" w:type="dxa"/>
+              <w:left w:w="200" w:type="dxa"/>
+              <w:bottom w:w="200" w:type="dxa"/>
+              <w:right w:w="200" w:type="dxa"/>
+            </w:tcMar>
+          </w:tcPr>
+          <w:p>
+            <w:pPr>
+              <w:spacing w:before="240" w:after="80"/>
+              <w:jc w:val="center"/>
+              <w:rPr>
+                <w:b/>
+                <w:color w:val="475569"/>
+                <w:sz w:val="22"/>
+              </w:rPr>
+            </w:pPr>
+            <w:r>
+              <w:rPr>
+                <w:b/>
+                <w:noProof/>
+                <w:color w:val="475569"/>
+                <w:sz w:val="22"/>
+              </w:rPr>
+              <w:drawing>
+                <wp:inline distT="0" distB="0" distL="0" distR="0" wp14:anchorId="08CDB028" wp14:editId="6257D68E">
+                  <wp:extent cx="4139609" cy="2328530"/>
+                  <wp:effectExtent l="0" t="0" r="635" b="0"/>
+                  <wp:docPr id="53408434" name="Picture 6"/>
+                  <wp:cNvGraphicFramePr>
+                    <a:graphicFrameLocks xmlns:a="http://schemas.openxmlformats.org/drawingml/2006/main" noChangeAspect="1"/>
+                  </wp:cNvGraphicFramePr>
+                  <a:graphic xmlns:a="http://schemas.openxmlformats.org/drawingml/2006/main">
+                    <a:graphicData uri="http://schemas.openxmlformats.org/drawingml/2006/picture">
+                      <pic:pic xmlns:pic="http://schemas.openxmlformats.org/drawingml/2006/picture">
+                        <pic:nvPicPr>
+                          <pic:cNvPr id="53408434" name="Picture 53408434"/>
+                          <pic:cNvPicPr/>
+                        </pic:nvPicPr>
+                        <pic:blipFill>
+                          <a:blip r:embed="rId15"/>
+                          <a:stretch>
+                            <a:fillRect/>
+                          </a:stretch>
+                        </pic:blipFill>
+                        <pic:spPr>
+                          <a:xfrm>
+                            <a:off x="0" y="0"/>
+                            <a:ext cx="4160199" cy="2340112"/>
+                          </a:xfrm>
+                          <a:prstGeom prst="rect">
+                            <a:avLst/>
+                          </a:prstGeom>
+                        </pic:spPr>
+                      </pic:pic>
+                    </a:graphicData>
+                  </a:graphic>
+                </wp:inline>
+              </w:drawing>
+            </w:r>
+          </w:p>
+          <w:p>
+            <w:pPr>
+              <w:spacing w:before="240" w:after="80"/>
+              <w:jc w:val="center"/>
+              <w:rPr>
+                <w:b/>
+                <w:color w:val="475569"/>
+                <w:sz w:val="22"/>
+              </w:rPr>
+            </w:pPr>
+            <w:r>
+              <w:rPr>
+                <w:b/>
+                <w:noProof/>
+                <w:color w:val="475569"/>
+                <w:sz w:val="22"/>
+              </w:rPr>
+              <w:drawing>
+                <wp:inline distT="0" distB="0" distL="0" distR="0" wp14:anchorId="7F7048EC" wp14:editId="2121FBE4">
+                  <wp:extent cx="1945758" cy="2406572"/>
+                  <wp:effectExtent l="0" t="0" r="0" b="0"/>
+                  <wp:docPr id="2121053025" name="Picture 1"/>
+                  <wp:cNvGraphicFramePr>
+                    <a:graphicFrameLocks xmlns:a="http://schemas.openxmlformats.org/drawingml/2006/main" noChangeAspect="1"/>
+                  </wp:cNvGraphicFramePr>
+                  <a:graphic xmlns:a="http://schemas.openxmlformats.org/drawingml/2006/main">
+                    <a:graphicData uri="http://schemas.openxmlformats.org/drawingml/2006/picture">
+                      <pic:pic xmlns:pic="http://schemas.openxmlformats.org/drawingml/2006/picture">
+                        <pic:nvPicPr>
+                          <pic:cNvPr id="2121053025" name="Picture 2121053025"/>
+                          <pic:cNvPicPr/>
+                        </pic:nvPicPr>
+                        <pic:blipFill>
+                          <a:blip r:embed="rId16"/>
+                          <a:stretch>
+                            <a:fillRect/>
+                          </a:stretch>
+                        </pic:blipFill>
+                        <pic:spPr>
+                          <a:xfrm>
+                            <a:off x="0" y="0"/>
+                            <a:ext cx="2057548" cy="2544837"/>
+                          </a:xfrm>
+                          <a:prstGeom prst="rect">
+                            <a:avLst/>
+                          </a:prstGeom>
+                        </pic:spPr>
+                      </pic:pic>
+                    </a:graphicData>
+                  </a:graphic>
+                </wp:inline>
+              </w:drawing>
+            </w:r>
+          </w:p>
+          <w:p>
+            <w:pPr>
+              <w:spacing w:before="240" w:after="80"/>
+              <w:jc w:val="center"/>
+            </w:pPr>
+            <w:r>
+              <w:rPr>
+                <w:b/>
+                <w:color w:val="475569"/>
+                <w:sz w:val="22"/>
+              </w:rPr>
+              <w:t xml:space="preserve">[ PASTE / INSERT SCREENSHOT IMAGE </w:t>
+            </w:r>
+            <w:proofErr w:type="gramStart"/>
+            <w:r>
+              <w:rPr>
+                <w:b/>
+                <w:color w:val="475569"/>
+                <w:sz w:val="22"/>
+              </w:rPr>
+              <w:t>HERE ]</w:t>
+            </w:r>
+            <w:proofErr w:type="gramEnd"/>
+            <w:r>
+              <w:rPr>
+                <w:b/>
+                <w:color w:val="475569"/>
+                <w:sz w:val="22"/>
+              </w:rPr>
+              <w:br/>
+            </w:r>
+            <w:r>
+              <w:rPr>
+                <w:i/>
+                <w:color w:val="64748B"/>
+                <w:sz w:val="19"/>
+              </w:rPr>
+              <w:t>Reference: Sprint Goal Milestone Reached State</w:t>
+            </w:r>
+            <w:r>
+              <w:rPr>
+                <w:i/>
+                <w:color w:val="64748B"/>
+                <w:sz w:val="19"/>
+              </w:rPr>
+              <w:br/>
+            </w:r>
+            <w:r>
+              <w:rPr>
+                <w:color w:val="94A3B8"/>
+                <w:sz w:val="18"/>
+              </w:rPr>
+              <w:t>Requirement: Window showing counter at 5, status badge 'SPRINT GOAL MET (5/5)' in green, and Complete Task button disabled.</w:t>
+            </w:r>
+          </w:p>
+        </w:tc>
+      </w:tr>
+    </w:tbl>
+    <w:p>
+      <w:pPr>
+        <w:spacing w:before="80" w:after="280"/>
+        <w:jc w:val="center"/>
+      </w:pPr>
+      <w:r>
+        <w:rPr>
+          <w:b/>
+          <w:sz w:val="19"/>
+        </w:rPr>
+        <w:t>Figure 5: Sprint Goal Milestone Reached State</w:t>
       </w:r>
     </w:p>
     <w:tbl>
@@ -1529,10 +2027,10 @@
               </w:rPr>
               <w:lastRenderedPageBreak/>
               <w:drawing>
-                <wp:inline distT="0" distB="0" distL="0" distR="0" wp14:anchorId="08CDB028" wp14:editId="0E53726F">
-                  <wp:extent cx="5689600" cy="3200400"/>
-                  <wp:effectExtent l="0" t="0" r="6350" b="0"/>
-                  <wp:docPr id="53408434" name="Picture 6"/>
+                <wp:inline distT="0" distB="0" distL="0" distR="0" wp14:anchorId="31BAE28A" wp14:editId="5F24C618">
+                  <wp:extent cx="3987209" cy="2242805"/>
+                  <wp:effectExtent l="0" t="0" r="635" b="5715"/>
+                  <wp:docPr id="874456453" name="Picture 8"/>
                   <wp:cNvGraphicFramePr>
                     <a:graphicFrameLocks xmlns:a="http://schemas.openxmlformats.org/drawingml/2006/main" noChangeAspect="1"/>
                   </wp:cNvGraphicFramePr>
@@ -1540,11 +2038,11 @@
                     <a:graphicData uri="http://schemas.openxmlformats.org/drawingml/2006/picture">
                       <pic:pic xmlns:pic="http://schemas.openxmlformats.org/drawingml/2006/picture">
                         <pic:nvPicPr>
-                          <pic:cNvPr id="53408434" name="Picture 53408434"/>
+                          <pic:cNvPr id="874456453" name="Picture 874456453"/>
                           <pic:cNvPicPr/>
                         </pic:nvPicPr>
                         <pic:blipFill>
-                          <a:blip r:embed="rId13"/>
+                          <a:blip r:embed="rId17"/>
                           <a:stretch>
                             <a:fillRect/>
                           </a:stretch>
@@ -1552,7 +2050,7 @@
                         <pic:spPr>
                           <a:xfrm>
                             <a:off x="0" y="0"/>
-                            <a:ext cx="5689600" cy="3200400"/>
+                            <a:ext cx="4001115" cy="2250627"/>
                           </a:xfrm>
                           <a:prstGeom prst="rect">
                             <a:avLst/>
@@ -1583,10 +2081,10 @@
                 <w:sz w:val="22"/>
               </w:rPr>
               <w:drawing>
-                <wp:inline distT="0" distB="0" distL="0" distR="0" wp14:anchorId="7F7048EC" wp14:editId="29874A8C">
-                  <wp:extent cx="3233099" cy="3998794"/>
-                  <wp:effectExtent l="0" t="0" r="5715" b="1905"/>
-                  <wp:docPr id="2121053025" name="Picture 1"/>
+                <wp:inline distT="0" distB="0" distL="0" distR="0" wp14:anchorId="619B0E1F" wp14:editId="03070B03">
+                  <wp:extent cx="2073349" cy="2549802"/>
+                  <wp:effectExtent l="0" t="0" r="0" b="3175"/>
+                  <wp:docPr id="254954844" name="Picture 2"/>
                   <wp:cNvGraphicFramePr>
                     <a:graphicFrameLocks xmlns:a="http://schemas.openxmlformats.org/drawingml/2006/main" noChangeAspect="1"/>
                   </wp:cNvGraphicFramePr>
@@ -1594,11 +2092,11 @@
                     <a:graphicData uri="http://schemas.openxmlformats.org/drawingml/2006/picture">
                       <pic:pic xmlns:pic="http://schemas.openxmlformats.org/drawingml/2006/picture">
                         <pic:nvPicPr>
-                          <pic:cNvPr id="2121053025" name="Picture 2121053025"/>
+                          <pic:cNvPr id="254954844" name="Picture 254954844"/>
                           <pic:cNvPicPr/>
                         </pic:nvPicPr>
                         <pic:blipFill>
-                          <a:blip r:embed="rId14"/>
+                          <a:blip r:embed="rId18"/>
                           <a:stretch>
                             <a:fillRect/>
                           </a:stretch>
@@ -1606,7 +2104,7 @@
                         <pic:spPr>
                           <a:xfrm>
                             <a:off x="0" y="0"/>
-                            <a:ext cx="3292828" cy="4072668"/>
+                            <a:ext cx="2111459" cy="2596669"/>
                           </a:xfrm>
                           <a:prstGeom prst="rect">
                             <a:avLst/>
@@ -1630,211 +2128,18 @@
                 <w:color w:val="475569"/>
                 <w:sz w:val="22"/>
               </w:rPr>
-              <w:t>[ PASTE / INSERT SCREENSHOT IMAGE HERE ]</w:t>
+              <w:t xml:space="preserve">[ PASTE / INSERT SCREENSHOT IMAGE </w:t>
             </w:r>
+            <w:proofErr w:type="gramStart"/>
             <w:r>
               <w:rPr>
                 <w:b/>
                 <w:color w:val="475569"/>
                 <w:sz w:val="22"/>
               </w:rPr>
-              <w:br/>
+              <w:t>HERE ]</w:t>
             </w:r>
-            <w:r>
-              <w:rPr>
-                <w:i/>
-                <w:color w:val="64748B"/>
-                <w:sz w:val="19"/>
-              </w:rPr>
-              <w:lastRenderedPageBreak/>
-              <w:t>Reference: Sprint Goal Milestone Reached State</w:t>
-            </w:r>
-            <w:r>
-              <w:rPr>
-                <w:i/>
-                <w:color w:val="64748B"/>
-                <w:sz w:val="19"/>
-              </w:rPr>
-              <w:br/>
-            </w:r>
-            <w:r>
-              <w:rPr>
-                <w:color w:val="94A3B8"/>
-                <w:sz w:val="18"/>
-              </w:rPr>
-              <w:t>Requirement: Window showing counter at 5, status badge 'SPRINT GOAL MET (5/5)' in green, and Complete Task button disabled.</w:t>
-            </w:r>
-          </w:p>
-        </w:tc>
-      </w:tr>
-    </w:tbl>
-    <w:p>
-      <w:pPr>
-        <w:spacing w:before="80" w:after="280"/>
-        <w:jc w:val="center"/>
-      </w:pPr>
-      <w:r>
-        <w:rPr>
-          <w:b/>
-          <w:sz w:val="19"/>
-        </w:rPr>
-        <w:lastRenderedPageBreak/>
-        <w:t>Figure 5: Sprint Goal Milestone Reached State</w:t>
-      </w:r>
-    </w:p>
-    <w:tbl>
-      <w:tblPr>
-        <w:tblW w:w="0" w:type="auto"/>
-        <w:jc w:val="center"/>
-        <w:tblLayout w:type="fixed"/>
-        <w:tblLook w:val="04A0" w:firstRow="1" w:lastRow="0" w:firstColumn="1" w:lastColumn="0" w:noHBand="0" w:noVBand="1"/>
-      </w:tblPr>
-      <w:tblGrid>
-        <w:gridCol w:w="9360"/>
-      </w:tblGrid>
-      <w:tr>
-        <w:trPr>
-          <w:jc w:val="center"/>
-        </w:trPr>
-        <w:tc>
-          <w:tcPr>
-            <w:tcW w:w="9360" w:type="dxa"/>
-            <w:tcBorders>
-              <w:top w:val="dashed" w:sz="6" w:space="0" w:color="94A3B8"/>
-              <w:left w:val="dashed" w:sz="6" w:space="0" w:color="94A3B8"/>
-              <w:bottom w:val="dashed" w:sz="6" w:space="0" w:color="94A3B8"/>
-              <w:right w:val="dashed" w:sz="6" w:space="0" w:color="94A3B8"/>
-            </w:tcBorders>
-            <w:shd w:val="clear" w:color="auto" w:fill="F8FAFC"/>
-            <w:tcMar>
-              <w:top w:w="200" w:type="dxa"/>
-              <w:left w:w="200" w:type="dxa"/>
-              <w:bottom w:w="200" w:type="dxa"/>
-              <w:right w:w="200" w:type="dxa"/>
-            </w:tcMar>
-          </w:tcPr>
-          <w:p>
-            <w:pPr>
-              <w:spacing w:before="240" w:after="80"/>
-              <w:jc w:val="center"/>
-              <w:rPr>
-                <w:b/>
-                <w:color w:val="475569"/>
-                <w:sz w:val="22"/>
-              </w:rPr>
-            </w:pPr>
-            <w:r>
-              <w:rPr>
-                <w:b/>
-                <w:noProof/>
-                <w:color w:val="475569"/>
-                <w:sz w:val="22"/>
-              </w:rPr>
-              <w:drawing>
-                <wp:inline distT="0" distB="0" distL="0" distR="0" wp14:anchorId="31BAE28A" wp14:editId="026A904A">
-                  <wp:extent cx="5689600" cy="3200400"/>
-                  <wp:effectExtent l="0" t="0" r="6350" b="0"/>
-                  <wp:docPr id="874456453" name="Picture 8"/>
-                  <wp:cNvGraphicFramePr>
-                    <a:graphicFrameLocks xmlns:a="http://schemas.openxmlformats.org/drawingml/2006/main" noChangeAspect="1"/>
-                  </wp:cNvGraphicFramePr>
-                  <a:graphic xmlns:a="http://schemas.openxmlformats.org/drawingml/2006/main">
-                    <a:graphicData uri="http://schemas.openxmlformats.org/drawingml/2006/picture">
-                      <pic:pic xmlns:pic="http://schemas.openxmlformats.org/drawingml/2006/picture">
-                        <pic:nvPicPr>
-                          <pic:cNvPr id="874456453" name="Picture 874456453"/>
-                          <pic:cNvPicPr/>
-                        </pic:nvPicPr>
-                        <pic:blipFill>
-                          <a:blip r:embed="rId15"/>
-                          <a:stretch>
-                            <a:fillRect/>
-                          </a:stretch>
-                        </pic:blipFill>
-                        <pic:spPr>
-                          <a:xfrm>
-                            <a:off x="0" y="0"/>
-                            <a:ext cx="5689600" cy="3200400"/>
-                          </a:xfrm>
-                          <a:prstGeom prst="rect">
-                            <a:avLst/>
-                          </a:prstGeom>
-                        </pic:spPr>
-                      </pic:pic>
-                    </a:graphicData>
-                  </a:graphic>
-                </wp:inline>
-              </w:drawing>
-            </w:r>
-          </w:p>
-          <w:p>
-            <w:pPr>
-              <w:spacing w:before="240" w:after="80"/>
-              <w:jc w:val="center"/>
-              <w:rPr>
-                <w:b/>
-                <w:color w:val="475569"/>
-                <w:sz w:val="22"/>
-              </w:rPr>
-            </w:pPr>
-            <w:r>
-              <w:rPr>
-                <w:b/>
-                <w:noProof/>
-                <w:color w:val="475569"/>
-                <w:sz w:val="22"/>
-              </w:rPr>
-              <w:lastRenderedPageBreak/>
-              <w:drawing>
-                <wp:inline distT="0" distB="0" distL="0" distR="0" wp14:anchorId="619B0E1F" wp14:editId="5313B372">
-                  <wp:extent cx="3073283" cy="3779520"/>
-                  <wp:effectExtent l="0" t="0" r="635" b="5080"/>
-                  <wp:docPr id="254954844" name="Picture 2"/>
-                  <wp:cNvGraphicFramePr>
-                    <a:graphicFrameLocks xmlns:a="http://schemas.openxmlformats.org/drawingml/2006/main" noChangeAspect="1"/>
-                  </wp:cNvGraphicFramePr>
-                  <a:graphic xmlns:a="http://schemas.openxmlformats.org/drawingml/2006/main">
-                    <a:graphicData uri="http://schemas.openxmlformats.org/drawingml/2006/picture">
-                      <pic:pic xmlns:pic="http://schemas.openxmlformats.org/drawingml/2006/picture">
-                        <pic:nvPicPr>
-                          <pic:cNvPr id="254954844" name="Picture 254954844"/>
-                          <pic:cNvPicPr/>
-                        </pic:nvPicPr>
-                        <pic:blipFill>
-                          <a:blip r:embed="rId16"/>
-                          <a:stretch>
-                            <a:fillRect/>
-                          </a:stretch>
-                        </pic:blipFill>
-                        <pic:spPr>
-                          <a:xfrm>
-                            <a:off x="0" y="0"/>
-                            <a:ext cx="3109322" cy="3823841"/>
-                          </a:xfrm>
-                          <a:prstGeom prst="rect">
-                            <a:avLst/>
-                          </a:prstGeom>
-                        </pic:spPr>
-                      </pic:pic>
-                    </a:graphicData>
-                  </a:graphic>
-                </wp:inline>
-              </w:drawing>
-            </w:r>
-          </w:p>
-          <w:p>
-            <w:pPr>
-              <w:spacing w:before="240" w:after="80"/>
-              <w:jc w:val="center"/>
-            </w:pPr>
-            <w:r>
-              <w:rPr>
-                <w:b/>
-                <w:color w:val="475569"/>
-                <w:sz w:val="22"/>
-              </w:rPr>
-              <w:t>[ PASTE / INSERT SCREENSHOT IMAGE HERE ]</w:t>
-            </w:r>
+            <w:proofErr w:type="gramEnd"/>
             <w:r>
               <w:rPr>
                 <w:b/>
@@ -1880,7 +2185,6 @@
           <w:b/>
           <w:sz w:val="19"/>
         </w:rPr>
-        <w:lastRenderedPageBreak/>
         <w:t>Figure 6: Material 3 Dark Mode Theme Toggle State</w:t>
       </w:r>
     </w:p>
@@ -2077,8 +2381,17 @@
                 <w:b/>
                 <w:sz w:val="17"/>
               </w:rPr>
-              <w:t>[ Student 1 ]</w:t>
+              <w:t xml:space="preserve">[ Student </w:t>
             </w:r>
+            <w:proofErr w:type="gramStart"/>
+            <w:r>
+              <w:rPr>
+                <w:b/>
+                <w:sz w:val="17"/>
+              </w:rPr>
+              <w:t>1 ]</w:t>
+            </w:r>
+            <w:proofErr w:type="gramEnd"/>
           </w:p>
         </w:tc>
         <w:tc>
@@ -2176,7 +2489,21 @@
               <w:rPr>
                 <w:sz w:val="17"/>
               </w:rPr>
-              <w:t>Initialized repo, setup .gitignore, integrated card 1, configured remote repo &amp; pushed main.</w:t>
+              <w:t xml:space="preserve">Initialized repo, </w:t>
+            </w:r>
+            <w:proofErr w:type="gramStart"/>
+            <w:r>
+              <w:rPr>
+                <w:sz w:val="17"/>
+              </w:rPr>
+              <w:t>setup .gitignore</w:t>
+            </w:r>
+            <w:proofErr w:type="gramEnd"/>
+            <w:r>
+              <w:rPr>
+                <w:sz w:val="17"/>
+              </w:rPr>
+              <w:t>, integrated card 1, configured remote repo &amp; pushed main.</w:t>
             </w:r>
           </w:p>
         </w:tc>
@@ -2207,6 +2534,7 @@
               </w:rPr>
               <w:t xml:space="preserve">[ </w:t>
             </w:r>
+            <w:proofErr w:type="gramStart"/>
             <w:r>
               <w:rPr>
                 <w:b/>
@@ -2221,6 +2549,7 @@
               </w:rPr>
               <w:t xml:space="preserve"> ]</w:t>
             </w:r>
+            <w:proofErr w:type="gramEnd"/>
           </w:p>
         </w:tc>
         <w:tc>
@@ -2347,8 +2676,17 @@
                 <w:b/>
                 <w:sz w:val="17"/>
               </w:rPr>
-              <w:t>[ Student 3 ]</w:t>
+              <w:t xml:space="preserve">[ Student </w:t>
             </w:r>
+            <w:proofErr w:type="gramStart"/>
+            <w:r>
+              <w:rPr>
+                <w:b/>
+                <w:sz w:val="17"/>
+              </w:rPr>
+              <w:t>3 ]</w:t>
+            </w:r>
+            <w:proofErr w:type="gramEnd"/>
           </w:p>
         </w:tc>
         <w:tc>
@@ -2477,6 +2815,11 @@
     <w:p>
       <w:pPr>
         <w:spacing w:before="80" w:after="40"/>
+        <w:rPr>
+          <w:i/>
+          <w:color w:val="64748B"/>
+          <w:sz w:val="19"/>
+        </w:rPr>
       </w:pPr>
       <w:r>
         <w:rPr>
@@ -2484,7 +2827,16 @@
           <w:color w:val="64748B"/>
           <w:sz w:val="19"/>
         </w:rPr>
-        <w:t>Virtual environments allow you to separate dependencies for different projects from the Python installation on your system, so that packages do not conflict between them. I learned about `.</w:t>
+        <w:t xml:space="preserve">Virtual environments allow you to separate dependencies for different projects from the Python installation on your system, so that packages do not conflict between them. I learned about </w:t>
+      </w:r>
+      <w:proofErr w:type="gramStart"/>
+      <w:r>
+        <w:rPr>
+          <w:i/>
+          <w:color w:val="64748B"/>
+          <w:sz w:val="19"/>
+        </w:rPr>
+        <w:t>`.</w:t>
       </w:r>
       <w:proofErr w:type="spellStart"/>
       <w:r>
@@ -2496,6 +2848,7 @@
         <w:t>gitignore</w:t>
       </w:r>
       <w:proofErr w:type="spellEnd"/>
+      <w:proofErr w:type="gramEnd"/>
       <w:r>
         <w:rPr>
           <w:i/>
@@ -2520,33 +2873,61 @@
           <w:color w:val="64748B"/>
           <w:sz w:val="19"/>
         </w:rPr>
-        <w:t xml:space="preserve">/`), generated files, caches and sensitive configuration files (like `.env`), while still keeping track of the source code and the required configuration files. When collaborating on GitHub, it is very important to make sure that repository invitations are coordinated properly, by ensuring that the right user with the right access is invited, and that the access is correct before collaborators start working. With good coordination, you can avoid configuration problems in the repository, duplicate work, and unauthorized </w:t>
+        <w:t xml:space="preserve">/`), generated files, caches and sensitive configuration files (like </w:t>
       </w:r>
-      <w:proofErr w:type="spellStart"/>
+      <w:proofErr w:type="gramStart"/>
       <w:r>
         <w:rPr>
           <w:i/>
           <w:color w:val="64748B"/>
           <w:sz w:val="19"/>
         </w:rPr>
-        <w:t>access.</w:t>
+        <w:t>`.env</w:t>
       </w:r>
+      <w:proofErr w:type="gramEnd"/>
+      <w:r>
+        <w:rPr>
+          <w:i/>
+          <w:color w:val="64748B"/>
+          <w:sz w:val="19"/>
+        </w:rPr>
+        <w:t xml:space="preserve">`), while </w:t>
+      </w:r>
+      <w:proofErr w:type="gramStart"/>
+      <w:r>
+        <w:rPr>
+          <w:i/>
+          <w:color w:val="64748B"/>
+          <w:sz w:val="19"/>
+        </w:rPr>
+        <w:t>still keeping</w:t>
+      </w:r>
+      <w:proofErr w:type="gramEnd"/>
+      <w:r>
+        <w:rPr>
+          <w:i/>
+          <w:color w:val="64748B"/>
+          <w:sz w:val="19"/>
+        </w:rPr>
+        <w:t xml:space="preserve"> track of the source code and the required configuration files. When collaborating on GitHub, it is very important to make sure that repository invitations are coordinated properly, by ensuring that the right user with the right access is invited, and that the access is correct before collaborators start working. With good coordination, you can avoid configuration problems in the repository, duplicate work, and unauthorized access.</w:t>
+      </w:r>
+    </w:p>
+    <w:p>
+      <w:pPr>
+        <w:spacing w:before="80" w:after="40"/>
+        <w:rPr>
+          <w:i/>
+          <w:color w:val="64748B"/>
+          <w:sz w:val="19"/>
+        </w:rPr>
+      </w:pPr>
       <w:r>
         <w:rPr>
           <w:b/>
           <w:color w:val="1E3A8A"/>
           <w:sz w:val="20"/>
         </w:rPr>
-        <w:t>Developer</w:t>
-      </w:r>
-      <w:proofErr w:type="spellEnd"/>
-      <w:r>
-        <w:rPr>
-          <w:b/>
-          <w:color w:val="1E3A8A"/>
-          <w:sz w:val="20"/>
-        </w:rPr>
-        <w:t xml:space="preserve"> 2 (State &amp; Event Logic Engineer):</w:t>
+        <w:t>Developer 2 (State &amp; Event Logic Engineer):</w:t>
       </w:r>
     </w:p>
     <w:p>
@@ -2583,7 +2964,25 @@
           <w:color w:val="64748B"/>
           <w:sz w:val="19"/>
         </w:rPr>
-        <w:t xml:space="preserve"> which helps keep my local files updated with all of the latest changes. And also I learned how reactive event handlers can respond to user action, by clicks or input changes, and update the application dynamically. These new skills/knowledge helped me better understand both the version control and interactive application development.</w:t>
+        <w:t xml:space="preserve"> which helps keep my local files updated with all of the latest changes. And </w:t>
+      </w:r>
+      <w:proofErr w:type="gramStart"/>
+      <w:r>
+        <w:rPr>
+          <w:i/>
+          <w:color w:val="64748B"/>
+          <w:sz w:val="19"/>
+        </w:rPr>
+        <w:t>also</w:t>
+      </w:r>
+      <w:proofErr w:type="gramEnd"/>
+      <w:r>
+        <w:rPr>
+          <w:i/>
+          <w:color w:val="64748B"/>
+          <w:sz w:val="19"/>
+        </w:rPr>
+        <w:t xml:space="preserve"> I learned how reactive event handlers can respond to user action, by clicks or input changes, and update the application dynamically. These new skills/knowledge helped me better understand both the version control and interactive application development.</w:t>
       </w:r>
     </w:p>
     <w:p>
@@ -2609,8 +3008,18 @@
           <w:color w:val="64748B"/>
           <w:sz w:val="19"/>
         </w:rPr>
-        <w:t>[ Write 3-4 sentences describing what you learned about feature branching safety, enforcing state boundary constraints, and testing Material 3 controls in Flet... ]</w:t>
+        <w:t>[ Write 3-4 sentences describing what you learned about feature branching safety, enforcing state boundary constraints, and testing Material 3 controls in Flet</w:t>
       </w:r>
+      <w:proofErr w:type="gramStart"/>
+      <w:r>
+        <w:rPr>
+          <w:i/>
+          <w:color w:val="64748B"/>
+          <w:sz w:val="19"/>
+        </w:rPr>
+        <w:t>... ]</w:t>
+      </w:r>
+      <w:proofErr w:type="gramEnd"/>
     </w:p>
     <w:p>
       <w:r>
@@ -2800,8 +3209,8 @@
     </w:tbl>
     <w:p/>
     <w:sectPr>
-      <w:headerReference w:type="default" r:id="rId17"/>
-      <w:footerReference w:type="default" r:id="rId18"/>
+      <w:headerReference w:type="default" r:id="rId19"/>
+      <w:footerReference w:type="default" r:id="rId20"/>
       <w:pgSz w:w="12240" w:h="15840"/>
       <w:pgMar w:top="1440" w:right="1440" w:bottom="1440" w:left="1440" w:header="720" w:footer="720" w:gutter="0"/>
       <w:cols w:space="720"/>
@@ -2813,7 +3222,7 @@
 </file>
 
 <file path=word/endnotes.xml><?xml version="1.0" encoding="utf-8"?>
-<w:endnotes xmlns:wpc="http://schemas.microsoft.com/office/word/2010/wordprocessingCanvas" xmlns:cx="http://schemas.microsoft.com/office/drawing/2014/chartex" xmlns:cx1="http://schemas.microsoft.com/office/drawing/2015/9/8/chartex" xmlns:cx2="http://schemas.microsoft.com/office/drawing/2015/10/21/chartex" xmlns:cx3="http://schemas.microsoft.com/office/drawing/2016/5/9/chartex" xmlns:cx4="http://schemas.microsoft.com/office/drawing/2016/5/10/chartex" xmlns:cx5="http://schemas.microsoft.com/office/drawing/2016/5/11/chartex" xmlns:cx6="http://schemas.microsoft.com/office/drawing/2016/5/12/chartex" xmlns:cx7="http://schemas.microsoft.com/office/drawing/2016/5/13/chartex" xmlns:cx8="http://schemas.microsoft.com/office/drawing/2016/5/14/chartex" xmlns:mc="http://schemas.openxmlformats.org/markup-compatibility/2006" xmlns:aink="http://schemas.microsoft.com/office/drawing/2016/ink" xmlns:am3d="http://schemas.microsoft.com/office/drawing/2017/model3d" xmlns:o="urn:schemas-microsoft-com:office:office" xmlns:oel="http://schemas.microsoft.com/office/2019/extlst" xmlns:r="http://schemas.openxmlformats.org/officeDocument/2006/relationships" xmlns:m="http://schemas.openxmlformats.org/officeDocument/2006/math" xmlns:v="urn:schemas-microsoft-com:vml" xmlns:wp14="http://schemas.microsoft.com/office/word/2010/wordprocessingDrawing" xmlns:wp="http://schemas.openxmlformats.org/drawingml/2006/wordprocessingDrawing" xmlns:w10="urn:schemas-microsoft-com:office:word" xmlns:w="http://schemas.openxmlformats.org/wordprocessingml/2006/main" xmlns:w14="http://schemas.microsoft.com/office/word/2010/wordml" xmlns:w15="http://schemas.microsoft.com/office/word/2012/wordml" xmlns:w16cex="http://schemas.microsoft.com/office/word/2018/wordml/cex" xmlns:w16cid="http://schemas.microsoft.com/office/word/2016/wordml/cid" xmlns:w16="http://schemas.microsoft.com/office/word/2018/wordml" xmlns:w16du="http://schemas.microsoft.com/office/word/2023/wordml/word16du" xmlns:w16sdtdh="http://schemas.microsoft.com/office/word/2020/wordml/sdtdatahash" xmlns:w16sdtfl="http://schemas.microsoft.com/office/word/2024/wordml/sdtformatlock" xmlns:w16se="http://schemas.microsoft.com/office/word/2015/wordml/symex" xmlns:wpg="http://schemas.microsoft.com/office/word/2010/wordprocessingGroup" xmlns:wpi="http://schemas.microsoft.com/office/word/2010/wordprocessingInk" xmlns:wne="http://schemas.microsoft.com/office/word/2006/wordml" xmlns:wps="http://schemas.microsoft.com/office/word/2010/wordprocessingShape" mc:Ignorable="w14 w15 w16se w16cid w16 w16cex w16sdtdh w16sdtfl w16du wp14">
+<w:endnotes xmlns:wpc="http://schemas.microsoft.com/office/word/2010/wordprocessingCanvas" xmlns:cx="http://schemas.microsoft.com/office/drawing/2014/chartex" xmlns:cx1="http://schemas.microsoft.com/office/drawing/2015/9/8/chartex" xmlns:cx2="http://schemas.microsoft.com/office/drawing/2015/10/21/chartex" xmlns:cx3="http://schemas.microsoft.com/office/drawing/2016/5/9/chartex" xmlns:cx4="http://schemas.microsoft.com/office/drawing/2016/5/10/chartex" xmlns:cx5="http://schemas.microsoft.com/office/drawing/2016/5/11/chartex" xmlns:cx6="http://schemas.microsoft.com/office/drawing/2016/5/12/chartex" xmlns:cx7="http://schemas.microsoft.com/office/drawing/2016/5/13/chartex" xmlns:cx8="http://schemas.microsoft.com/office/drawing/2016/5/14/chartex" xmlns:mc="http://schemas.openxmlformats.org/markup-compatibility/2006" xmlns:m="http://schemas.openxmlformats.org/officeDocument/2006/math" xmlns:aink="http://schemas.microsoft.com/office/drawing/2016/ink" xmlns:am3d="http://schemas.microsoft.com/office/drawing/2017/model3d" xmlns:oel="http://schemas.microsoft.com/office/2019/extlst" xmlns:r="http://schemas.openxmlformats.org/officeDocument/2006/relationships" xmlns:wp14="http://schemas.microsoft.com/office/word/2010/wordprocessingDrawing" xmlns:wp="http://schemas.openxmlformats.org/drawingml/2006/wordprocessingDrawing" xmlns:wpg="http://schemas.microsoft.com/office/word/2010/wordprocessingGroup" xmlns:wpi="http://schemas.microsoft.com/office/word/2010/wordprocessingInk" xmlns:wps="http://schemas.microsoft.com/office/word/2010/wordprocessingShape" xmlns:o="urn:schemas-microsoft-com:office:office" xmlns:v="urn:schemas-microsoft-com:vml" xmlns:w10="urn:schemas-microsoft-com:office:word" xmlns:w="http://schemas.openxmlformats.org/wordprocessingml/2006/main" xmlns:w14="http://schemas.microsoft.com/office/word/2010/wordml" xmlns:w15="http://schemas.microsoft.com/office/word/2012/wordml" xmlns:w16cex="http://schemas.microsoft.com/office/word/2018/wordml/cex" xmlns:w16cid="http://schemas.microsoft.com/office/word/2016/wordml/cid" xmlns:w16="http://schemas.microsoft.com/office/word/2018/wordml" xmlns:w16sdtdh="http://schemas.microsoft.com/office/word/2020/wordml/sdtdatahash" xmlns:w16sdtfl="http://schemas.microsoft.com/office/word/2024/wordml/sdtformatlock" xmlns:w16se="http://schemas.microsoft.com/office/word/2015/wordml/symex" xmlns:w16du="http://schemas.microsoft.com/office/word/2023/wordml/word16du" xmlns:wne="http://schemas.microsoft.com/office/word/2006/wordml" mc:Ignorable="w14 w15 w16se w16cid w16 w16cex w16sdtdh w16sdtfl w16du wp14">
   <w:endnote w:type="separator" w:id="-1">
     <w:p>
       <w:pPr>
@@ -2838,7 +3247,7 @@
 </file>
 
 <file path=word/footer1.xml><?xml version="1.0" encoding="utf-8"?>
-<w:ftr xmlns:wpc="http://schemas.microsoft.com/office/word/2010/wordprocessingCanvas" xmlns:cx="http://schemas.microsoft.com/office/drawing/2014/chartex" xmlns:cx1="http://schemas.microsoft.com/office/drawing/2015/9/8/chartex" xmlns:cx2="http://schemas.microsoft.com/office/drawing/2015/10/21/chartex" xmlns:cx3="http://schemas.microsoft.com/office/drawing/2016/5/9/chartex" xmlns:cx4="http://schemas.microsoft.com/office/drawing/2016/5/10/chartex" xmlns:cx5="http://schemas.microsoft.com/office/drawing/2016/5/11/chartex" xmlns:cx6="http://schemas.microsoft.com/office/drawing/2016/5/12/chartex" xmlns:cx7="http://schemas.microsoft.com/office/drawing/2016/5/13/chartex" xmlns:cx8="http://schemas.microsoft.com/office/drawing/2016/5/14/chartex" xmlns:mc="http://schemas.openxmlformats.org/markup-compatibility/2006" xmlns:aink="http://schemas.microsoft.com/office/drawing/2016/ink" xmlns:am3d="http://schemas.microsoft.com/office/drawing/2017/model3d" xmlns:o="urn:schemas-microsoft-com:office:office" xmlns:oel="http://schemas.microsoft.com/office/2019/extlst" xmlns:r="http://schemas.openxmlformats.org/officeDocument/2006/relationships" xmlns:m="http://schemas.openxmlformats.org/officeDocument/2006/math" xmlns:v="urn:schemas-microsoft-com:vml" xmlns:wp14="http://schemas.microsoft.com/office/word/2010/wordprocessingDrawing" xmlns:wp="http://schemas.openxmlformats.org/drawingml/2006/wordprocessingDrawing" xmlns:w10="urn:schemas-microsoft-com:office:word" xmlns:w="http://schemas.openxmlformats.org/wordprocessingml/2006/main" xmlns:w14="http://schemas.microsoft.com/office/word/2010/wordml" xmlns:w15="http://schemas.microsoft.com/office/word/2012/wordml" xmlns:w16cex="http://schemas.microsoft.com/office/word/2018/wordml/cex" xmlns:w16cid="http://schemas.microsoft.com/office/word/2016/wordml/cid" xmlns:w16="http://schemas.microsoft.com/office/word/2018/wordml" xmlns:w16du="http://schemas.microsoft.com/office/word/2023/wordml/word16du" xmlns:w16sdtdh="http://schemas.microsoft.com/office/word/2020/wordml/sdtdatahash" xmlns:w16sdtfl="http://schemas.microsoft.com/office/word/2024/wordml/sdtformatlock" xmlns:w16se="http://schemas.microsoft.com/office/word/2015/wordml/symex" xmlns:wpg="http://schemas.microsoft.com/office/word/2010/wordprocessingGroup" xmlns:wpi="http://schemas.microsoft.com/office/word/2010/wordprocessingInk" xmlns:wne="http://schemas.microsoft.com/office/word/2006/wordml" xmlns:wps="http://schemas.microsoft.com/office/word/2010/wordprocessingShape" mc:Ignorable="w14 w15 w16se w16cid w16 w16cex w16sdtdh w16sdtfl w16du wp14">
+<w:ftr xmlns:wpc="http://schemas.microsoft.com/office/word/2010/wordprocessingCanvas" xmlns:cx="http://schemas.microsoft.com/office/drawing/2014/chartex" xmlns:cx1="http://schemas.microsoft.com/office/drawing/2015/9/8/chartex" xmlns:cx2="http://schemas.microsoft.com/office/drawing/2015/10/21/chartex" xmlns:cx3="http://schemas.microsoft.com/office/drawing/2016/5/9/chartex" xmlns:cx4="http://schemas.microsoft.com/office/drawing/2016/5/10/chartex" xmlns:cx5="http://schemas.microsoft.com/office/drawing/2016/5/11/chartex" xmlns:cx6="http://schemas.microsoft.com/office/drawing/2016/5/12/chartex" xmlns:cx7="http://schemas.microsoft.com/office/drawing/2016/5/13/chartex" xmlns:cx8="http://schemas.microsoft.com/office/drawing/2016/5/14/chartex" xmlns:mc="http://schemas.openxmlformats.org/markup-compatibility/2006" xmlns:m="http://schemas.openxmlformats.org/officeDocument/2006/math" xmlns:aink="http://schemas.microsoft.com/office/drawing/2016/ink" xmlns:am3d="http://schemas.microsoft.com/office/drawing/2017/model3d" xmlns:oel="http://schemas.microsoft.com/office/2019/extlst" xmlns:r="http://schemas.openxmlformats.org/officeDocument/2006/relationships" xmlns:wp14="http://schemas.microsoft.com/office/word/2010/wordprocessingDrawing" xmlns:wp="http://schemas.openxmlformats.org/drawingml/2006/wordprocessingDrawing" xmlns:wpg="http://schemas.microsoft.com/office/word/2010/wordprocessingGroup" xmlns:wpi="http://schemas.microsoft.com/office/word/2010/wordprocessingInk" xmlns:wps="http://schemas.microsoft.com/office/word/2010/wordprocessingShape" xmlns:o="urn:schemas-microsoft-com:office:office" xmlns:v="urn:schemas-microsoft-com:vml" xmlns:w10="urn:schemas-microsoft-com:office:word" xmlns:w="http://schemas.openxmlformats.org/wordprocessingml/2006/main" xmlns:w14="http://schemas.microsoft.com/office/word/2010/wordml" xmlns:w15="http://schemas.microsoft.com/office/word/2012/wordml" xmlns:w16cex="http://schemas.microsoft.com/office/word/2018/wordml/cex" xmlns:w16cid="http://schemas.microsoft.com/office/word/2016/wordml/cid" xmlns:w16="http://schemas.microsoft.com/office/word/2018/wordml" xmlns:w16sdtdh="http://schemas.microsoft.com/office/word/2020/wordml/sdtdatahash" xmlns:w16sdtfl="http://schemas.microsoft.com/office/word/2024/wordml/sdtformatlock" xmlns:w16se="http://schemas.microsoft.com/office/word/2015/wordml/symex" xmlns:w16du="http://schemas.microsoft.com/office/word/2023/wordml/word16du" xmlns:wne="http://schemas.microsoft.com/office/word/2006/wordml" mc:Ignorable="w14 w15 w16se w16cid w16 w16cex w16sdtdh w16sdtfl w16du wp14">
   <w:p>
     <w:pPr>
       <w:pStyle w:val="Footer"/>
@@ -2856,7 +3265,7 @@
 </file>
 
 <file path=word/footnotes.xml><?xml version="1.0" encoding="utf-8"?>
-<w:footnotes xmlns:wpc="http://schemas.microsoft.com/office/word/2010/wordprocessingCanvas" xmlns:cx="http://schemas.microsoft.com/office/drawing/2014/chartex" xmlns:cx1="http://schemas.microsoft.com/office/drawing/2015/9/8/chartex" xmlns:cx2="http://schemas.microsoft.com/office/drawing/2015/10/21/chartex" xmlns:cx3="http://schemas.microsoft.com/office/drawing/2016/5/9/chartex" xmlns:cx4="http://schemas.microsoft.com/office/drawing/2016/5/10/chartex" xmlns:cx5="http://schemas.microsoft.com/office/drawing/2016/5/11/chartex" xmlns:cx6="http://schemas.microsoft.com/office/drawing/2016/5/12/chartex" xmlns:cx7="http://schemas.microsoft.com/office/drawing/2016/5/13/chartex" xmlns:cx8="http://schemas.microsoft.com/office/drawing/2016/5/14/chartex" xmlns:mc="http://schemas.openxmlformats.org/markup-compatibility/2006" xmlns:aink="http://schemas.microsoft.com/office/drawing/2016/ink" xmlns:am3d="http://schemas.microsoft.com/office/drawing/2017/model3d" xmlns:o="urn:schemas-microsoft-com:office:office" xmlns:oel="http://schemas.microsoft.com/office/2019/extlst" xmlns:r="http://schemas.openxmlformats.org/officeDocument/2006/relationships" xmlns:m="http://schemas.openxmlformats.org/officeDocument/2006/math" xmlns:v="urn:schemas-microsoft-com:vml" xmlns:wp14="http://schemas.microsoft.com/office/word/2010/wordprocessingDrawing" xmlns:wp="http://schemas.openxmlformats.org/drawingml/2006/wordprocessingDrawing" xmlns:w10="urn:schemas-microsoft-com:office:word" xmlns:w="http://schemas.openxmlformats.org/wordprocessingml/2006/main" xmlns:w14="http://schemas.microsoft.com/office/word/2010/wordml" xmlns:w15="http://schemas.microsoft.com/office/word/2012/wordml" xmlns:w16cex="http://schemas.microsoft.com/office/word/2018/wordml/cex" xmlns:w16cid="http://schemas.microsoft.com/office/word/2016/wordml/cid" xmlns:w16="http://schemas.microsoft.com/office/word/2018/wordml" xmlns:w16du="http://schemas.microsoft.com/office/word/2023/wordml/word16du" xmlns:w16sdtdh="http://schemas.microsoft.com/office/word/2020/wordml/sdtdatahash" xmlns:w16sdtfl="http://schemas.microsoft.com/office/word/2024/wordml/sdtformatlock" xmlns:w16se="http://schemas.microsoft.com/office/word/2015/wordml/symex" xmlns:wpg="http://schemas.microsoft.com/office/word/2010/wordprocessingGroup" xmlns:wpi="http://schemas.microsoft.com/office/word/2010/wordprocessingInk" xmlns:wne="http://schemas.microsoft.com/office/word/2006/wordml" xmlns:wps="http://schemas.microsoft.com/office/word/2010/wordprocessingShape" mc:Ignorable="w14 w15 w16se w16cid w16 w16cex w16sdtdh w16sdtfl w16du wp14">
+<w:footnotes xmlns:wpc="http://schemas.microsoft.com/office/word/2010/wordprocessingCanvas" xmlns:cx="http://schemas.microsoft.com/office/drawing/2014/chartex" xmlns:cx1="http://schemas.microsoft.com/office/drawing/2015/9/8/chartex" xmlns:cx2="http://schemas.microsoft.com/office/drawing/2015/10/21/chartex" xmlns:cx3="http://schemas.microsoft.com/office/drawing/2016/5/9/chartex" xmlns:cx4="http://schemas.microsoft.com/office/drawing/2016/5/10/chartex" xmlns:cx5="http://schemas.microsoft.com/office/drawing/2016/5/11/chartex" xmlns:cx6="http://schemas.microsoft.com/office/drawing/2016/5/12/chartex" xmlns:cx7="http://schemas.microsoft.com/office/drawing/2016/5/13/chartex" xmlns:cx8="http://schemas.microsoft.com/office/drawing/2016/5/14/chartex" xmlns:mc="http://schemas.openxmlformats.org/markup-compatibility/2006" xmlns:m="http://schemas.openxmlformats.org/officeDocument/2006/math" xmlns:aink="http://schemas.microsoft.com/office/drawing/2016/ink" xmlns:am3d="http://schemas.microsoft.com/office/drawing/2017/model3d" xmlns:oel="http://schemas.microsoft.com/office/2019/extlst" xmlns:r="http://schemas.openxmlformats.org/officeDocument/2006/relationships" xmlns:wp14="http://schemas.microsoft.com/office/word/2010/wordprocessingDrawing" xmlns:wp="http://schemas.openxmlformats.org/drawingml/2006/wordprocessingDrawing" xmlns:wpg="http://schemas.microsoft.com/office/word/2010/wordprocessingGroup" xmlns:wpi="http://schemas.microsoft.com/office/word/2010/wordprocessingInk" xmlns:wps="http://schemas.microsoft.com/office/word/2010/wordprocessingShape" xmlns:o="urn:schemas-microsoft-com:office:office" xmlns:v="urn:schemas-microsoft-com:vml" xmlns:w10="urn:schemas-microsoft-com:office:word" xmlns:w="http://schemas.openxmlformats.org/wordprocessingml/2006/main" xmlns:w14="http://schemas.microsoft.com/office/word/2010/wordml" xmlns:w15="http://schemas.microsoft.com/office/word/2012/wordml" xmlns:w16cex="http://schemas.microsoft.com/office/word/2018/wordml/cex" xmlns:w16cid="http://schemas.microsoft.com/office/word/2016/wordml/cid" xmlns:w16="http://schemas.microsoft.com/office/word/2018/wordml" xmlns:w16sdtdh="http://schemas.microsoft.com/office/word/2020/wordml/sdtdatahash" xmlns:w16sdtfl="http://schemas.microsoft.com/office/word/2024/wordml/sdtformatlock" xmlns:w16se="http://schemas.microsoft.com/office/word/2015/wordml/symex" xmlns:w16du="http://schemas.microsoft.com/office/word/2023/wordml/word16du" xmlns:wne="http://schemas.microsoft.com/office/word/2006/wordml" mc:Ignorable="w14 w15 w16se w16cid w16 w16cex w16sdtdh w16sdtfl w16du wp14">
   <w:footnote w:type="separator" w:id="-1">
     <w:p>
       <w:pPr>
@@ -2881,7 +3290,7 @@
 </file>
 
 <file path=word/header1.xml><?xml version="1.0" encoding="utf-8"?>
-<w:hdr xmlns:wpc="http://schemas.microsoft.com/office/word/2010/wordprocessingCanvas" xmlns:cx="http://schemas.microsoft.com/office/drawing/2014/chartex" xmlns:cx1="http://schemas.microsoft.com/office/drawing/2015/9/8/chartex" xmlns:cx2="http://schemas.microsoft.com/office/drawing/2015/10/21/chartex" xmlns:cx3="http://schemas.microsoft.com/office/drawing/2016/5/9/chartex" xmlns:cx4="http://schemas.microsoft.com/office/drawing/2016/5/10/chartex" xmlns:cx5="http://schemas.microsoft.com/office/drawing/2016/5/11/chartex" xmlns:cx6="http://schemas.microsoft.com/office/drawing/2016/5/12/chartex" xmlns:cx7="http://schemas.microsoft.com/office/drawing/2016/5/13/chartex" xmlns:cx8="http://schemas.microsoft.com/office/drawing/2016/5/14/chartex" xmlns:mc="http://schemas.openxmlformats.org/markup-compatibility/2006" xmlns:aink="http://schemas.microsoft.com/office/drawing/2016/ink" xmlns:am3d="http://schemas.microsoft.com/office/drawing/2017/model3d" xmlns:o="urn:schemas-microsoft-com:office:office" xmlns:oel="http://schemas.microsoft.com/office/2019/extlst" xmlns:r="http://schemas.openxmlformats.org/officeDocument/2006/relationships" xmlns:m="http://schemas.openxmlformats.org/officeDocument/2006/math" xmlns:v="urn:schemas-microsoft-com:vml" xmlns:wp14="http://schemas.microsoft.com/office/word/2010/wordprocessingDrawing" xmlns:wp="http://schemas.openxmlformats.org/drawingml/2006/wordprocessingDrawing" xmlns:w10="urn:schemas-microsoft-com:office:word" xmlns:w="http://schemas.openxmlformats.org/wordprocessingml/2006/main" xmlns:w14="http://schemas.microsoft.com/office/word/2010/wordml" xmlns:w15="http://schemas.microsoft.com/office/word/2012/wordml" xmlns:w16cex="http://schemas.microsoft.com/office/word/2018/wordml/cex" xmlns:w16cid="http://schemas.microsoft.com/office/word/2016/wordml/cid" xmlns:w16="http://schemas.microsoft.com/office/word/2018/wordml" xmlns:w16du="http://schemas.microsoft.com/office/word/2023/wordml/word16du" xmlns:w16sdtdh="http://schemas.microsoft.com/office/word/2020/wordml/sdtdatahash" xmlns:w16sdtfl="http://schemas.microsoft.com/office/word/2024/wordml/sdtformatlock" xmlns:w16se="http://schemas.microsoft.com/office/word/2015/wordml/symex" xmlns:wpg="http://schemas.microsoft.com/office/word/2010/wordprocessingGroup" xmlns:wpi="http://schemas.microsoft.com/office/word/2010/wordprocessingInk" xmlns:wne="http://schemas.microsoft.com/office/word/2006/wordml" xmlns:wps="http://schemas.microsoft.com/office/word/2010/wordprocessingShape" mc:Ignorable="w14 w15 w16se w16cid w16 w16cex w16sdtdh w16sdtfl w16du wp14">
+<w:hdr xmlns:wpc="http://schemas.microsoft.com/office/word/2010/wordprocessingCanvas" xmlns:cx="http://schemas.microsoft.com/office/drawing/2014/chartex" xmlns:cx1="http://schemas.microsoft.com/office/drawing/2015/9/8/chartex" xmlns:cx2="http://schemas.microsoft.com/office/drawing/2015/10/21/chartex" xmlns:cx3="http://schemas.microsoft.com/office/drawing/2016/5/9/chartex" xmlns:cx4="http://schemas.microsoft.com/office/drawing/2016/5/10/chartex" xmlns:cx5="http://schemas.microsoft.com/office/drawing/2016/5/11/chartex" xmlns:cx6="http://schemas.microsoft.com/office/drawing/2016/5/12/chartex" xmlns:cx7="http://schemas.microsoft.com/office/drawing/2016/5/13/chartex" xmlns:cx8="http://schemas.microsoft.com/office/drawing/2016/5/14/chartex" xmlns:mc="http://schemas.openxmlformats.org/markup-compatibility/2006" xmlns:m="http://schemas.openxmlformats.org/officeDocument/2006/math" xmlns:aink="http://schemas.microsoft.com/office/drawing/2016/ink" xmlns:am3d="http://schemas.microsoft.com/office/drawing/2017/model3d" xmlns:oel="http://schemas.microsoft.com/office/2019/extlst" xmlns:r="http://schemas.openxmlformats.org/officeDocument/2006/relationships" xmlns:wp14="http://schemas.microsoft.com/office/word/2010/wordprocessingDrawing" xmlns:wp="http://schemas.openxmlformats.org/drawingml/2006/wordprocessingDrawing" xmlns:wpg="http://schemas.microsoft.com/office/word/2010/wordprocessingGroup" xmlns:wpi="http://schemas.microsoft.com/office/word/2010/wordprocessingInk" xmlns:wps="http://schemas.microsoft.com/office/word/2010/wordprocessingShape" xmlns:o="urn:schemas-microsoft-com:office:office" xmlns:v="urn:schemas-microsoft-com:vml" xmlns:w10="urn:schemas-microsoft-com:office:word" xmlns:w="http://schemas.openxmlformats.org/wordprocessingml/2006/main" xmlns:w14="http://schemas.microsoft.com/office/word/2010/wordml" xmlns:w15="http://schemas.microsoft.com/office/word/2012/wordml" xmlns:w16cex="http://schemas.microsoft.com/office/word/2018/wordml/cex" xmlns:w16cid="http://schemas.microsoft.com/office/word/2016/wordml/cid" xmlns:w16="http://schemas.microsoft.com/office/word/2018/wordml" xmlns:w16sdtdh="http://schemas.microsoft.com/office/word/2020/wordml/sdtdatahash" xmlns:w16sdtfl="http://schemas.microsoft.com/office/word/2024/wordml/sdtformatlock" xmlns:w16se="http://schemas.microsoft.com/office/word/2015/wordml/symex" xmlns:w16du="http://schemas.microsoft.com/office/word/2023/wordml/word16du" xmlns:wne="http://schemas.microsoft.com/office/word/2006/wordml" mc:Ignorable="w14 w15 w16se w16cid w16 w16cex w16sdtdh w16sdtfl w16du wp14">
   <w:p>
     <w:pPr>
       <w:pStyle w:val="Header"/>
@@ -2899,7 +3308,7 @@
 </file>
 
 <file path=word/numbering.xml><?xml version="1.0" encoding="utf-8"?>
-<w:numbering xmlns:wpc="http://schemas.microsoft.com/office/word/2010/wordprocessingCanvas" xmlns:cx="http://schemas.microsoft.com/office/drawing/2014/chartex" xmlns:cx1="http://schemas.microsoft.com/office/drawing/2015/9/8/chartex" xmlns:cx2="http://schemas.microsoft.com/office/drawing/2015/10/21/chartex" xmlns:cx3="http://schemas.microsoft.com/office/drawing/2016/5/9/chartex" xmlns:cx4="http://schemas.microsoft.com/office/drawing/2016/5/10/chartex" xmlns:cx5="http://schemas.microsoft.com/office/drawing/2016/5/11/chartex" xmlns:cx6="http://schemas.microsoft.com/office/drawing/2016/5/12/chartex" xmlns:cx7="http://schemas.microsoft.com/office/drawing/2016/5/13/chartex" xmlns:cx8="http://schemas.microsoft.com/office/drawing/2016/5/14/chartex" xmlns:mc="http://schemas.openxmlformats.org/markup-compatibility/2006" xmlns:aink="http://schemas.microsoft.com/office/drawing/2016/ink" xmlns:am3d="http://schemas.microsoft.com/office/drawing/2017/model3d" xmlns:o="urn:schemas-microsoft-com:office:office" xmlns:oel="http://schemas.microsoft.com/office/2019/extlst" xmlns:r="http://schemas.openxmlformats.org/officeDocument/2006/relationships" xmlns:m="http://schemas.openxmlformats.org/officeDocument/2006/math" xmlns:v="urn:schemas-microsoft-com:vml" xmlns:wp14="http://schemas.microsoft.com/office/word/2010/wordprocessingDrawing" xmlns:wp="http://schemas.openxmlformats.org/drawingml/2006/wordprocessingDrawing" xmlns:w10="urn:schemas-microsoft-com:office:word" xmlns:w="http://schemas.openxmlformats.org/wordprocessingml/2006/main" xmlns:w14="http://schemas.microsoft.com/office/word/2010/wordml" xmlns:w15="http://schemas.microsoft.com/office/word/2012/wordml" xmlns:w16cex="http://schemas.microsoft.com/office/word/2018/wordml/cex" xmlns:w16cid="http://schemas.microsoft.com/office/word/2016/wordml/cid" xmlns:w16="http://schemas.microsoft.com/office/word/2018/wordml" xmlns:w16du="http://schemas.microsoft.com/office/word/2023/wordml/word16du" xmlns:w16sdtdh="http://schemas.microsoft.com/office/word/2020/wordml/sdtdatahash" xmlns:w16sdtfl="http://schemas.microsoft.com/office/word/2024/wordml/sdtformatlock" xmlns:w16se="http://schemas.microsoft.com/office/word/2015/wordml/symex" xmlns:wpg="http://schemas.microsoft.com/office/word/2010/wordprocessingGroup" xmlns:wpi="http://schemas.microsoft.com/office/word/2010/wordprocessingInk" xmlns:wne="http://schemas.microsoft.com/office/word/2006/wordml" xmlns:wps="http://schemas.microsoft.com/office/word/2010/wordprocessingShape" mc:Ignorable="w14 w15 w16se w16cid w16 w16cex w16sdtdh w16sdtfl w16du wp14">
+<w:numbering xmlns:wpc="http://schemas.microsoft.com/office/word/2010/wordprocessingCanvas" xmlns:cx="http://schemas.microsoft.com/office/drawing/2014/chartex" xmlns:cx1="http://schemas.microsoft.com/office/drawing/2015/9/8/chartex" xmlns:cx2="http://schemas.microsoft.com/office/drawing/2015/10/21/chartex" xmlns:cx3="http://schemas.microsoft.com/office/drawing/2016/5/9/chartex" xmlns:cx4="http://schemas.microsoft.com/office/drawing/2016/5/10/chartex" xmlns:cx5="http://schemas.microsoft.com/office/drawing/2016/5/11/chartex" xmlns:cx6="http://schemas.microsoft.com/office/drawing/2016/5/12/chartex" xmlns:cx7="http://schemas.microsoft.com/office/drawing/2016/5/13/chartex" xmlns:cx8="http://schemas.microsoft.com/office/drawing/2016/5/14/chartex" xmlns:mc="http://schemas.openxmlformats.org/markup-compatibility/2006" xmlns:m="http://schemas.openxmlformats.org/officeDocument/2006/math" xmlns:aink="http://schemas.microsoft.com/office/drawing/2016/ink" xmlns:am3d="http://schemas.microsoft.com/office/drawing/2017/model3d" xmlns:oel="http://schemas.microsoft.com/office/2019/extlst" xmlns:r="http://schemas.openxmlformats.org/officeDocument/2006/relationships" xmlns:wp14="http://schemas.microsoft.com/office/word/2010/wordprocessingDrawing" xmlns:wp="http://schemas.openxmlformats.org/drawingml/2006/wordprocessingDrawing" xmlns:wpg="http://schemas.microsoft.com/office/word/2010/wordprocessingGroup" xmlns:wpi="http://schemas.microsoft.com/office/word/2010/wordprocessingInk" xmlns:wps="http://schemas.microsoft.com/office/word/2010/wordprocessingShape" xmlns:o="urn:schemas-microsoft-com:office:office" xmlns:v="urn:schemas-microsoft-com:vml" xmlns:w10="urn:schemas-microsoft-com:office:word" xmlns:w="http://schemas.openxmlformats.org/wordprocessingml/2006/main" xmlns:w14="http://schemas.microsoft.com/office/word/2010/wordml" xmlns:w15="http://schemas.microsoft.com/office/word/2012/wordml" xmlns:w16cex="http://schemas.microsoft.com/office/word/2018/wordml/cex" xmlns:w16cid="http://schemas.microsoft.com/office/word/2016/wordml/cid" xmlns:w16="http://schemas.microsoft.com/office/word/2018/wordml" xmlns:w16sdtdh="http://schemas.microsoft.com/office/word/2020/wordml/sdtdatahash" xmlns:w16sdtfl="http://schemas.microsoft.com/office/word/2024/wordml/sdtformatlock" xmlns:w16se="http://schemas.microsoft.com/office/word/2015/wordml/symex" xmlns:w16du="http://schemas.microsoft.com/office/word/2023/wordml/word16du" xmlns:wne="http://schemas.microsoft.com/office/word/2006/wordml" mc:Ignorable="w14 w15 w16se w16cid w16 w16cex w16sdtdh w16sdtfl w16du wp14">
   <w:abstractNum w:abstractNumId="0" w15:restartNumberingAfterBreak="0">
     <w:nsid w:val="FFFFFF7C"/>
     <w:multiLevelType w:val="singleLevel"/>
@@ -3102,7 +3511,7 @@
 </file>
 
 <file path=word/styles.xml><?xml version="1.0" encoding="utf-8"?>
-<w:styles xmlns:mc="http://schemas.openxmlformats.org/markup-compatibility/2006" xmlns:r="http://schemas.openxmlformats.org/officeDocument/2006/relationships" xmlns:w="http://schemas.openxmlformats.org/wordprocessingml/2006/main" xmlns:w14="http://schemas.microsoft.com/office/word/2010/wordml" xmlns:w15="http://schemas.microsoft.com/office/word/2012/wordml" xmlns:w16cex="http://schemas.microsoft.com/office/word/2018/wordml/cex" xmlns:w16cid="http://schemas.microsoft.com/office/word/2016/wordml/cid" xmlns:w16="http://schemas.microsoft.com/office/word/2018/wordml" xmlns:w16du="http://schemas.microsoft.com/office/word/2023/wordml/word16du" xmlns:w16sdtdh="http://schemas.microsoft.com/office/word/2020/wordml/sdtdatahash" xmlns:w16sdtfl="http://schemas.microsoft.com/office/word/2024/wordml/sdtformatlock" xmlns:w16se="http://schemas.microsoft.com/office/word/2015/wordml/symex" mc:Ignorable="w14 w15 w16se w16cid w16 w16cex w16sdtdh w16sdtfl w16du">
+<w:styles xmlns:mc="http://schemas.openxmlformats.org/markup-compatibility/2006" xmlns:r="http://schemas.openxmlformats.org/officeDocument/2006/relationships" xmlns:w="http://schemas.openxmlformats.org/wordprocessingml/2006/main" xmlns:w14="http://schemas.microsoft.com/office/word/2010/wordml" xmlns:w15="http://schemas.microsoft.com/office/word/2012/wordml" xmlns:w16cex="http://schemas.microsoft.com/office/word/2018/wordml/cex" xmlns:w16cid="http://schemas.microsoft.com/office/word/2016/wordml/cid" xmlns:w16="http://schemas.microsoft.com/office/word/2018/wordml" xmlns:w16sdtdh="http://schemas.microsoft.com/office/word/2020/wordml/sdtdatahash" xmlns:w16sdtfl="http://schemas.microsoft.com/office/word/2024/wordml/sdtformatlock" xmlns:w16se="http://schemas.microsoft.com/office/word/2015/wordml/symex" xmlns:w16du="http://schemas.microsoft.com/office/word/2023/wordml/word16du" mc:Ignorable="w14 w15 w16se w16cid w16 w16cex w16sdtdh w16sdtfl w16du">
   <w:docDefaults>
     <w:rPrDefault>
       <w:rPr>
@@ -3709,6 +4118,7 @@
   <w:style w:type="character" w:default="1" w:styleId="DefaultParagraphFont">
     <w:name w:val="Default Paragraph Font"/>
     <w:uiPriority w:val="1"/>
+    <w:semiHidden/>
     <w:unhideWhenUsed/>
   </w:style>
   <w:style w:type="table" w:default="1" w:styleId="TableNormal">

</xml_diff>

<commit_message>
docs(report): complete report screenshots and developer 3 details
</commit_message>
<xml_diff>
--- a/CCCS106_Lab01_Report_Template.docx
+++ b/CCCS106_Lab01_Report_Template.docx
@@ -1,6 +1,6 @@
 
 <file path=word/document.xml><?xml version="1.0" encoding="utf-8"?>
-<w:document xmlns:wpc="http://schemas.microsoft.com/office/word/2010/wordprocessingCanvas" xmlns:cx="http://schemas.microsoft.com/office/drawing/2014/chartex" xmlns:cx1="http://schemas.microsoft.com/office/drawing/2015/9/8/chartex" xmlns:cx2="http://schemas.microsoft.com/office/drawing/2015/10/21/chartex" xmlns:cx3="http://schemas.microsoft.com/office/drawing/2016/5/9/chartex" xmlns:cx4="http://schemas.microsoft.com/office/drawing/2016/5/10/chartex" xmlns:cx5="http://schemas.microsoft.com/office/drawing/2016/5/11/chartex" xmlns:cx6="http://schemas.microsoft.com/office/drawing/2016/5/12/chartex" xmlns:cx7="http://schemas.microsoft.com/office/drawing/2016/5/13/chartex" xmlns:cx8="http://schemas.microsoft.com/office/drawing/2016/5/14/chartex" xmlns:mc="http://schemas.openxmlformats.org/markup-compatibility/2006" xmlns:m="http://schemas.openxmlformats.org/officeDocument/2006/math" xmlns:aink="http://schemas.microsoft.com/office/drawing/2016/ink" xmlns:am3d="http://schemas.microsoft.com/office/drawing/2017/model3d" xmlns:oel="http://schemas.microsoft.com/office/2019/extlst" xmlns:r="http://schemas.openxmlformats.org/officeDocument/2006/relationships" xmlns:wp14="http://schemas.microsoft.com/office/word/2010/wordprocessingDrawing" xmlns:wp="http://schemas.openxmlformats.org/drawingml/2006/wordprocessingDrawing" xmlns:wpg="http://schemas.microsoft.com/office/word/2010/wordprocessingGroup" xmlns:wpi="http://schemas.microsoft.com/office/word/2010/wordprocessingInk" xmlns:wps="http://schemas.microsoft.com/office/word/2010/wordprocessingShape" xmlns:o="urn:schemas-microsoft-com:office:office" xmlns:v="urn:schemas-microsoft-com:vml" xmlns:w10="urn:schemas-microsoft-com:office:word" xmlns:w="http://schemas.openxmlformats.org/wordprocessingml/2006/main" xmlns:w14="http://schemas.microsoft.com/office/word/2010/wordml" xmlns:w15="http://schemas.microsoft.com/office/word/2012/wordml" xmlns:w16cex="http://schemas.microsoft.com/office/word/2018/wordml/cex" xmlns:w16cid="http://schemas.microsoft.com/office/word/2016/wordml/cid" xmlns:w16="http://schemas.microsoft.com/office/word/2018/wordml" xmlns:w16sdtdh="http://schemas.microsoft.com/office/word/2020/wordml/sdtdatahash" xmlns:w16sdtfl="http://schemas.microsoft.com/office/word/2024/wordml/sdtformatlock" xmlns:w16se="http://schemas.microsoft.com/office/word/2015/wordml/symex" xmlns:w16du="http://schemas.microsoft.com/office/word/2023/wordml/word16du" xmlns:wne="http://schemas.microsoft.com/office/word/2006/wordml" mc:Ignorable="w14 w15 w16se w16cid w16 w16cex w16sdtdh w16sdtfl w16du wp14">
+<w:document xmlns:wpc="http://schemas.microsoft.com/office/word/2010/wordprocessingCanvas" xmlns:cx="http://schemas.microsoft.com/office/drawing/2014/chartex" xmlns:cx1="http://schemas.microsoft.com/office/drawing/2015/9/8/chartex" xmlns:cx2="http://schemas.microsoft.com/office/drawing/2015/10/21/chartex" xmlns:cx3="http://schemas.microsoft.com/office/drawing/2016/5/9/chartex" xmlns:cx4="http://schemas.microsoft.com/office/drawing/2016/5/10/chartex" xmlns:cx5="http://schemas.microsoft.com/office/drawing/2016/5/11/chartex" xmlns:cx6="http://schemas.microsoft.com/office/drawing/2016/5/12/chartex" xmlns:cx7="http://schemas.microsoft.com/office/drawing/2016/5/13/chartex" xmlns:cx8="http://schemas.microsoft.com/office/drawing/2016/5/14/chartex" xmlns:mc="http://schemas.openxmlformats.org/markup-compatibility/2006" xmlns:aink="http://schemas.microsoft.com/office/drawing/2016/ink" xmlns:am3d="http://schemas.microsoft.com/office/drawing/2017/model3d" xmlns:o="urn:schemas-microsoft-com:office:office" xmlns:oel="http://schemas.microsoft.com/office/2019/extlst" xmlns:r="http://schemas.openxmlformats.org/officeDocument/2006/relationships" xmlns:m="http://schemas.openxmlformats.org/officeDocument/2006/math" xmlns:v="urn:schemas-microsoft-com:vml" xmlns:wp14="http://schemas.microsoft.com/office/word/2010/wordprocessingDrawing" xmlns:wp="http://schemas.openxmlformats.org/drawingml/2006/wordprocessingDrawing" xmlns:w10="urn:schemas-microsoft-com:office:word" xmlns:w="http://schemas.openxmlformats.org/wordprocessingml/2006/main" xmlns:w14="http://schemas.microsoft.com/office/word/2010/wordml" xmlns:w15="http://schemas.microsoft.com/office/word/2012/wordml" xmlns:w16cex="http://schemas.microsoft.com/office/word/2018/wordml/cex" xmlns:w16cid="http://schemas.microsoft.com/office/word/2016/wordml/cid" xmlns:w16="http://schemas.microsoft.com/office/word/2018/wordml" xmlns:w16du="http://schemas.microsoft.com/office/word/2023/wordml/word16du" xmlns:w16sdtdh="http://schemas.microsoft.com/office/word/2020/wordml/sdtdatahash" xmlns:w16sdtfl="http://schemas.microsoft.com/office/word/2024/wordml/sdtformatlock" xmlns:w16se="http://schemas.microsoft.com/office/word/2015/wordml/symex" xmlns:wpg="http://schemas.microsoft.com/office/word/2010/wordprocessingGroup" xmlns:wpi="http://schemas.microsoft.com/office/word/2010/wordprocessingInk" xmlns:wne="http://schemas.microsoft.com/office/word/2006/wordml" xmlns:wps="http://schemas.microsoft.com/office/word/2010/wordprocessingShape" mc:Ignorable="w14 w15 w16se w16cid w16 w16cex w16sdtdh w16sdtfl w16du wp14">
   <w:body>
     <w:p>
       <w:pPr>
@@ -224,6 +224,7 @@
             <w:pPr>
               <w:spacing w:after="0"/>
             </w:pPr>
+            <w:proofErr w:type="gramStart"/>
             <w:r>
               <w:rPr>
                 <w:color w:val="0F172A"/>
@@ -238,6 +239,7 @@
               </w:rPr>
               <w:t>September</w:t>
             </w:r>
+            <w:proofErr w:type="gramEnd"/>
             <w:r>
               <w:rPr>
                 <w:color w:val="0F172A"/>
@@ -470,12 +472,21 @@
             <w:pPr>
               <w:spacing w:after="0"/>
             </w:pPr>
+            <w:proofErr w:type="gramStart"/>
             <w:r>
               <w:rPr>
                 <w:b/>
                 <w:sz w:val="18"/>
               </w:rPr>
-              <w:t xml:space="preserve">[ Lead Student </w:t>
+              <w:t>[ Lead</w:t>
+            </w:r>
+            <w:proofErr w:type="gramEnd"/>
+            <w:r>
+              <w:rPr>
+                <w:b/>
+                <w:sz w:val="18"/>
+              </w:rPr>
+              <w:t xml:space="preserve"> Student </w:t>
             </w:r>
             <w:proofErr w:type="gramStart"/>
             <w:r>
@@ -596,6 +607,7 @@
             <w:pPr>
               <w:spacing w:after="0"/>
             </w:pPr>
+            <w:proofErr w:type="gramStart"/>
             <w:r>
               <w:rPr>
                 <w:b/>
@@ -608,7 +620,15 @@
                 <w:b/>
                 <w:sz w:val="18"/>
               </w:rPr>
-              <w:t xml:space="preserve">Renz Angelo S. </w:t>
+              <w:t>Renz</w:t>
+            </w:r>
+            <w:proofErr w:type="gramEnd"/>
+            <w:r>
+              <w:rPr>
+                <w:b/>
+                <w:sz w:val="18"/>
+              </w:rPr>
+              <w:t xml:space="preserve"> Angelo S. </w:t>
             </w:r>
             <w:proofErr w:type="gramStart"/>
             <w:r>
@@ -736,12 +756,28 @@
             <w:pPr>
               <w:spacing w:after="0"/>
             </w:pPr>
+            <w:proofErr w:type="gramStart"/>
             <w:r>
               <w:rPr>
                 <w:b/>
                 <w:sz w:val="18"/>
               </w:rPr>
-              <w:t xml:space="preserve">[ Partner C </w:t>
+              <w:t xml:space="preserve">[ </w:t>
+            </w:r>
+            <w:r>
+              <w:rPr>
+                <w:b/>
+                <w:sz w:val="18"/>
+              </w:rPr>
+              <w:t>Ubante</w:t>
+            </w:r>
+            <w:proofErr w:type="gramEnd"/>
+            <w:r>
+              <w:rPr>
+                <w:b/>
+                <w:sz w:val="18"/>
+              </w:rPr>
+              <w:t xml:space="preserve"> Jay Marion </w:t>
             </w:r>
             <w:proofErr w:type="gramStart"/>
             <w:r>
@@ -749,7 +785,14 @@
                 <w:b/>
                 <w:sz w:val="18"/>
               </w:rPr>
-              <w:t>Name ]</w:t>
+              <w:t xml:space="preserve">B </w:t>
+            </w:r>
+            <w:r>
+              <w:rPr>
+                <w:b/>
+                <w:sz w:val="18"/>
+              </w:rPr>
+              <w:t>]</w:t>
             </w:r>
             <w:proofErr w:type="gramEnd"/>
           </w:p>
@@ -773,7 +816,7 @@
               <w:rPr>
                 <w:sz w:val="18"/>
               </w:rPr>
-              <w:t>2024-XXXXX</w:t>
+              <w:t>C20101802</w:t>
             </w:r>
           </w:p>
         </w:tc>
@@ -792,11 +835,25 @@
             <w:pPr>
               <w:spacing w:after="0"/>
             </w:pPr>
+            <w:proofErr w:type="gramStart"/>
             <w:r>
               <w:rPr>
                 <w:sz w:val="18"/>
               </w:rPr>
-              <w:t>@dev3-username</w:t>
+              <w:t>@</w:t>
+            </w:r>
+            <w:r>
+              <w:rPr>
+                <w:sz w:val="18"/>
+              </w:rPr>
+              <w:t>JM</w:t>
+            </w:r>
+            <w:proofErr w:type="gramEnd"/>
+            <w:r>
+              <w:rPr>
+                <w:sz w:val="18"/>
+              </w:rPr>
+              <w:t>-Ubante</w:t>
             </w:r>
           </w:p>
         </w:tc>
@@ -973,13 +1030,23 @@
               <w:spacing w:before="240" w:after="80"/>
               <w:jc w:val="center"/>
             </w:pPr>
+            <w:proofErr w:type="gramStart"/>
             <w:r>
               <w:rPr>
                 <w:b/>
                 <w:color w:val="475569"/>
                 <w:sz w:val="22"/>
               </w:rPr>
-              <w:t xml:space="preserve">[ PASTE / INSERT SCREENSHOT IMAGE </w:t>
+              <w:t>[ PASTE</w:t>
+            </w:r>
+            <w:proofErr w:type="gramEnd"/>
+            <w:r>
+              <w:rPr>
+                <w:b/>
+                <w:color w:val="475569"/>
+                <w:sz w:val="22"/>
+              </w:rPr>
+              <w:t xml:space="preserve"> / INSERT SCREENSHOT IMAGE </w:t>
             </w:r>
             <w:proofErr w:type="gramStart"/>
             <w:r>
@@ -1151,6 +1218,11 @@
             <w:pPr>
               <w:spacing w:before="240" w:after="80"/>
               <w:jc w:val="center"/>
+              <w:rPr>
+                <w:b/>
+                <w:color w:val="475569"/>
+                <w:sz w:val="22"/>
+              </w:rPr>
             </w:pPr>
             <w:r>
               <w:rPr>
@@ -1201,7 +1273,86 @@
                 <w:color w:val="475569"/>
                 <w:sz w:val="22"/>
               </w:rPr>
-              <w:t xml:space="preserve"> [PASTE / INSERT SCREENSHOT IMAGE </w:t>
+              <w:t xml:space="preserve"> </w:t>
+            </w:r>
+          </w:p>
+          <w:p>
+            <w:pPr>
+              <w:spacing w:before="240" w:after="80"/>
+              <w:jc w:val="center"/>
+              <w:rPr>
+                <w:b/>
+                <w:color w:val="475569"/>
+                <w:sz w:val="22"/>
+              </w:rPr>
+            </w:pPr>
+            <w:r>
+              <w:rPr>
+                <w:noProof/>
+              </w:rPr>
+              <w:lastRenderedPageBreak/>
+              <w:drawing>
+                <wp:inline distT="0" distB="0" distL="0" distR="0" wp14:anchorId="69115B48" wp14:editId="1F311EF8">
+                  <wp:extent cx="5689600" cy="3616325"/>
+                  <wp:effectExtent l="0" t="0" r="6350" b="3175"/>
+                  <wp:docPr id="1722436769" name="Picture 1"/>
+                  <wp:cNvGraphicFramePr>
+                    <a:graphicFrameLocks xmlns:a="http://schemas.openxmlformats.org/drawingml/2006/main" noChangeAspect="1"/>
+                  </wp:cNvGraphicFramePr>
+                  <a:graphic xmlns:a="http://schemas.openxmlformats.org/drawingml/2006/main">
+                    <a:graphicData uri="http://schemas.openxmlformats.org/drawingml/2006/picture">
+                      <pic:pic xmlns:pic="http://schemas.openxmlformats.org/drawingml/2006/picture">
+                        <pic:nvPicPr>
+                          <pic:cNvPr id="0" name="Picture 1"/>
+                          <pic:cNvPicPr>
+                            <a:picLocks noChangeAspect="1" noChangeArrowheads="1"/>
+                          </pic:cNvPicPr>
+                        </pic:nvPicPr>
+                        <pic:blipFill>
+                          <a:blip r:embed="rId11">
+                            <a:extLst>
+                              <a:ext uri="{28A0092B-C50C-407E-A947-70E740481C1C}">
+                                <a14:useLocalDpi xmlns:a14="http://schemas.microsoft.com/office/drawing/2010/main" val="0"/>
+                              </a:ext>
+                            </a:extLst>
+                          </a:blip>
+                          <a:srcRect/>
+                          <a:stretch>
+                            <a:fillRect/>
+                          </a:stretch>
+                        </pic:blipFill>
+                        <pic:spPr bwMode="auto">
+                          <a:xfrm>
+                            <a:off x="0" y="0"/>
+                            <a:ext cx="5689600" cy="3616325"/>
+                          </a:xfrm>
+                          <a:prstGeom prst="rect">
+                            <a:avLst/>
+                          </a:prstGeom>
+                          <a:noFill/>
+                          <a:ln>
+                            <a:noFill/>
+                          </a:ln>
+                        </pic:spPr>
+                      </pic:pic>
+                    </a:graphicData>
+                  </a:graphic>
+                </wp:inline>
+              </w:drawing>
+            </w:r>
+          </w:p>
+          <w:p>
+            <w:pPr>
+              <w:spacing w:before="240" w:after="80"/>
+              <w:jc w:val="center"/>
+            </w:pPr>
+            <w:r>
+              <w:rPr>
+                <w:b/>
+                <w:color w:val="475569"/>
+                <w:sz w:val="22"/>
+              </w:rPr>
+              <w:t xml:space="preserve">[PASTE / INSERT SCREENSHOT IMAGE </w:t>
             </w:r>
             <w:proofErr w:type="gramStart"/>
             <w:r>
@@ -1258,6 +1409,7 @@
           <w:b/>
           <w:sz w:val="19"/>
         </w:rPr>
+        <w:lastRenderedPageBreak/>
         <w:t>Figure 2: Pre-flight Environment Diagnostics Audit (verify_setup.py)</w:t>
       </w:r>
     </w:p>
@@ -1356,7 +1508,7 @@
                           <pic:cNvPicPr/>
                         </pic:nvPicPr>
                         <pic:blipFill>
-                          <a:blip r:embed="rId11"/>
+                          <a:blip r:embed="rId12"/>
                           <a:stretch>
                             <a:fillRect/>
                           </a:stretch>
@@ -1410,7 +1562,7 @@
                           <pic:cNvPicPr/>
                         </pic:nvPicPr>
                         <pic:blipFill>
-                          <a:blip r:embed="rId12"/>
+                          <a:blip r:embed="rId13"/>
                           <a:stretch>
                             <a:fillRect/>
                           </a:stretch>
@@ -1423,6 +1575,70 @@
                           <a:prstGeom prst="rect">
                             <a:avLst/>
                           </a:prstGeom>
+                        </pic:spPr>
+                      </pic:pic>
+                    </a:graphicData>
+                  </a:graphic>
+                </wp:inline>
+              </w:drawing>
+            </w:r>
+          </w:p>
+          <w:p>
+            <w:pPr>
+              <w:spacing w:before="240" w:after="80"/>
+              <w:jc w:val="center"/>
+              <w:rPr>
+                <w:b/>
+                <w:color w:val="475569"/>
+                <w:sz w:val="22"/>
+              </w:rPr>
+            </w:pPr>
+            <w:r>
+              <w:rPr>
+                <w:noProof/>
+              </w:rPr>
+              <w:drawing>
+                <wp:inline distT="0" distB="0" distL="0" distR="0" wp14:anchorId="492A2F46" wp14:editId="4FECF474">
+                  <wp:extent cx="5689600" cy="1189990"/>
+                  <wp:effectExtent l="0" t="0" r="6350" b="0"/>
+                  <wp:docPr id="46181251" name="Picture 2"/>
+                  <wp:cNvGraphicFramePr>
+                    <a:graphicFrameLocks xmlns:a="http://schemas.openxmlformats.org/drawingml/2006/main" noChangeAspect="1"/>
+                  </wp:cNvGraphicFramePr>
+                  <a:graphic xmlns:a="http://schemas.openxmlformats.org/drawingml/2006/main">
+                    <a:graphicData uri="http://schemas.openxmlformats.org/drawingml/2006/picture">
+                      <pic:pic xmlns:pic="http://schemas.openxmlformats.org/drawingml/2006/picture">
+                        <pic:nvPicPr>
+                          <pic:cNvPr id="0" name="Picture 3"/>
+                          <pic:cNvPicPr>
+                            <a:picLocks noChangeAspect="1" noChangeArrowheads="1"/>
+                          </pic:cNvPicPr>
+                        </pic:nvPicPr>
+                        <pic:blipFill>
+                          <a:blip r:embed="rId14">
+                            <a:extLst>
+                              <a:ext uri="{28A0092B-C50C-407E-A947-70E740481C1C}">
+                                <a14:useLocalDpi xmlns:a14="http://schemas.microsoft.com/office/drawing/2010/main" val="0"/>
+                              </a:ext>
+                            </a:extLst>
+                          </a:blip>
+                          <a:srcRect/>
+                          <a:stretch>
+                            <a:fillRect/>
+                          </a:stretch>
+                        </pic:blipFill>
+                        <pic:spPr bwMode="auto">
+                          <a:xfrm>
+                            <a:off x="0" y="0"/>
+                            <a:ext cx="5689600" cy="1189990"/>
+                          </a:xfrm>
+                          <a:prstGeom prst="rect">
+                            <a:avLst/>
+                          </a:prstGeom>
+                          <a:noFill/>
+                          <a:ln>
+                            <a:noFill/>
+                          </a:ln>
                         </pic:spPr>
                       </pic:pic>
                     </a:graphicData>
@@ -1620,7 +1836,7 @@
                           <pic:cNvPicPr/>
                         </pic:nvPicPr>
                         <pic:blipFill>
-                          <a:blip r:embed="rId13"/>
+                          <a:blip r:embed="rId15"/>
                           <a:stretch>
                             <a:fillRect/>
                           </a:stretch>
@@ -1659,9 +1875,9 @@
                 <w:sz w:val="22"/>
               </w:rPr>
               <w:drawing>
-                <wp:inline distT="0" distB="0" distL="0" distR="0" wp14:anchorId="24DA492F" wp14:editId="14E77438">
-                  <wp:extent cx="1865702" cy="2299854"/>
-                  <wp:effectExtent l="0" t="0" r="1270" b="0"/>
+                <wp:inline distT="0" distB="0" distL="0" distR="0" wp14:anchorId="24DA492F" wp14:editId="35806BA1">
+                  <wp:extent cx="2365692" cy="2916194"/>
+                  <wp:effectExtent l="0" t="0" r="0" b="0"/>
                   <wp:docPr id="2088159481" name="Picture 2"/>
                   <wp:cNvGraphicFramePr>
                     <a:graphicFrameLocks xmlns:a="http://schemas.openxmlformats.org/drawingml/2006/main" noChangeAspect="1"/>
@@ -1674,7 +1890,7 @@
                           <pic:cNvPicPr/>
                         </pic:nvPicPr>
                         <pic:blipFill>
-                          <a:blip r:embed="rId14"/>
+                          <a:blip r:embed="rId16"/>
                           <a:stretch>
                             <a:fillRect/>
                           </a:stretch>
@@ -1682,11 +1898,76 @@
                         <pic:spPr>
                           <a:xfrm>
                             <a:off x="0" y="0"/>
-                            <a:ext cx="1911341" cy="2356114"/>
+                            <a:ext cx="2428845" cy="2994043"/>
                           </a:xfrm>
                           <a:prstGeom prst="rect">
                             <a:avLst/>
                           </a:prstGeom>
+                        </pic:spPr>
+                      </pic:pic>
+                    </a:graphicData>
+                  </a:graphic>
+                </wp:inline>
+              </w:drawing>
+            </w:r>
+          </w:p>
+          <w:p>
+            <w:pPr>
+              <w:spacing w:before="240" w:after="80"/>
+              <w:jc w:val="center"/>
+              <w:rPr>
+                <w:b/>
+                <w:color w:val="475569"/>
+                <w:sz w:val="22"/>
+              </w:rPr>
+            </w:pPr>
+            <w:r>
+              <w:rPr>
+                <w:noProof/>
+              </w:rPr>
+              <w:lastRenderedPageBreak/>
+              <w:drawing>
+                <wp:inline distT="0" distB="0" distL="0" distR="0" wp14:anchorId="7DCF1DC7" wp14:editId="240C0B1A">
+                  <wp:extent cx="3361038" cy="4129033"/>
+                  <wp:effectExtent l="0" t="0" r="0" b="5080"/>
+                  <wp:docPr id="1787917941" name="Picture 3"/>
+                  <wp:cNvGraphicFramePr>
+                    <a:graphicFrameLocks xmlns:a="http://schemas.openxmlformats.org/drawingml/2006/main" noChangeAspect="1"/>
+                  </wp:cNvGraphicFramePr>
+                  <a:graphic xmlns:a="http://schemas.openxmlformats.org/drawingml/2006/main">
+                    <a:graphicData uri="http://schemas.openxmlformats.org/drawingml/2006/picture">
+                      <pic:pic xmlns:pic="http://schemas.openxmlformats.org/drawingml/2006/picture">
+                        <pic:nvPicPr>
+                          <pic:cNvPr id="0" name="Picture 5"/>
+                          <pic:cNvPicPr>
+                            <a:picLocks noChangeAspect="1" noChangeArrowheads="1"/>
+                          </pic:cNvPicPr>
+                        </pic:nvPicPr>
+                        <pic:blipFill>
+                          <a:blip r:embed="rId17">
+                            <a:extLst>
+                              <a:ext uri="{28A0092B-C50C-407E-A947-70E740481C1C}">
+                                <a14:useLocalDpi xmlns:a14="http://schemas.microsoft.com/office/drawing/2010/main" val="0"/>
+                              </a:ext>
+                            </a:extLst>
+                          </a:blip>
+                          <a:srcRect/>
+                          <a:stretch>
+                            <a:fillRect/>
+                          </a:stretch>
+                        </pic:blipFill>
+                        <pic:spPr bwMode="auto">
+                          <a:xfrm>
+                            <a:off x="0" y="0"/>
+                            <a:ext cx="3371353" cy="4141705"/>
+                          </a:xfrm>
+                          <a:prstGeom prst="rect">
+                            <a:avLst/>
+                          </a:prstGeom>
+                          <a:noFill/>
+                          <a:ln>
+                            <a:noFill/>
+                          </a:ln>
                         </pic:spPr>
                       </pic:pic>
                     </a:graphicData>
@@ -1815,6 +2096,7 @@
                 <w:color w:val="475569"/>
                 <w:sz w:val="22"/>
               </w:rPr>
+              <w:lastRenderedPageBreak/>
               <w:drawing>
                 <wp:inline distT="0" distB="0" distL="0" distR="0" wp14:anchorId="08CDB028" wp14:editId="6257D68E">
                   <wp:extent cx="4139609" cy="2328530"/>
@@ -1831,7 +2113,7 @@
                           <pic:cNvPicPr/>
                         </pic:nvPicPr>
                         <pic:blipFill>
-                          <a:blip r:embed="rId15"/>
+                          <a:blip r:embed="rId18"/>
                           <a:stretch>
                             <a:fillRect/>
                           </a:stretch>
@@ -1885,7 +2167,7 @@
                           <pic:cNvPicPr/>
                         </pic:nvPicPr>
                         <pic:blipFill>
-                          <a:blip r:embed="rId16"/>
+                          <a:blip r:embed="rId19"/>
                           <a:stretch>
                             <a:fillRect/>
                           </a:stretch>
@@ -1910,6 +2192,71 @@
             <w:pPr>
               <w:spacing w:before="240" w:after="80"/>
               <w:jc w:val="center"/>
+              <w:rPr>
+                <w:b/>
+                <w:color w:val="475569"/>
+                <w:sz w:val="22"/>
+              </w:rPr>
+            </w:pPr>
+            <w:r>
+              <w:rPr>
+                <w:noProof/>
+              </w:rPr>
+              <w:lastRenderedPageBreak/>
+              <w:drawing>
+                <wp:inline distT="0" distB="0" distL="0" distR="0" wp14:anchorId="46FFD7C5" wp14:editId="318F682F">
+                  <wp:extent cx="2660821" cy="3274904"/>
+                  <wp:effectExtent l="0" t="0" r="6350" b="1905"/>
+                  <wp:docPr id="841321997" name="Picture 4"/>
+                  <wp:cNvGraphicFramePr>
+                    <a:graphicFrameLocks xmlns:a="http://schemas.openxmlformats.org/drawingml/2006/main" noChangeAspect="1"/>
+                  </wp:cNvGraphicFramePr>
+                  <a:graphic xmlns:a="http://schemas.openxmlformats.org/drawingml/2006/main">
+                    <a:graphicData uri="http://schemas.openxmlformats.org/drawingml/2006/picture">
+                      <pic:pic xmlns:pic="http://schemas.openxmlformats.org/drawingml/2006/picture">
+                        <pic:nvPicPr>
+                          <pic:cNvPr id="0" name="Picture 7"/>
+                          <pic:cNvPicPr>
+                            <a:picLocks noChangeAspect="1" noChangeArrowheads="1"/>
+                          </pic:cNvPicPr>
+                        </pic:nvPicPr>
+                        <pic:blipFill>
+                          <a:blip r:embed="rId20">
+                            <a:extLst>
+                              <a:ext uri="{28A0092B-C50C-407E-A947-70E740481C1C}">
+                                <a14:useLocalDpi xmlns:a14="http://schemas.microsoft.com/office/drawing/2010/main" val="0"/>
+                              </a:ext>
+                            </a:extLst>
+                          </a:blip>
+                          <a:srcRect/>
+                          <a:stretch>
+                            <a:fillRect/>
+                          </a:stretch>
+                        </pic:blipFill>
+                        <pic:spPr bwMode="auto">
+                          <a:xfrm>
+                            <a:off x="0" y="0"/>
+                            <a:ext cx="2665521" cy="3280688"/>
+                          </a:xfrm>
+                          <a:prstGeom prst="rect">
+                            <a:avLst/>
+                          </a:prstGeom>
+                          <a:noFill/>
+                          <a:ln>
+                            <a:noFill/>
+                          </a:ln>
+                        </pic:spPr>
+                      </pic:pic>
+                    </a:graphicData>
+                  </a:graphic>
+                </wp:inline>
+              </w:drawing>
+            </w:r>
+          </w:p>
+          <w:p>
+            <w:pPr>
+              <w:spacing w:before="240" w:after="80"/>
+              <w:jc w:val="center"/>
             </w:pPr>
             <w:r>
               <w:rPr>
@@ -1974,6 +2321,7 @@
           <w:b/>
           <w:sz w:val="19"/>
         </w:rPr>
+        <w:lastRenderedPageBreak/>
         <w:t>Figure 5: Sprint Goal Milestone Reached State</w:t>
       </w:r>
     </w:p>
@@ -2025,7 +2373,6 @@
                 <w:color w:val="475569"/>
                 <w:sz w:val="22"/>
               </w:rPr>
-              <w:lastRenderedPageBreak/>
               <w:drawing>
                 <wp:inline distT="0" distB="0" distL="0" distR="0" wp14:anchorId="31BAE28A" wp14:editId="5F24C618">
                   <wp:extent cx="3987209" cy="2242805"/>
@@ -2042,7 +2389,7 @@
                           <pic:cNvPicPr/>
                         </pic:nvPicPr>
                         <pic:blipFill>
-                          <a:blip r:embed="rId17"/>
+                          <a:blip r:embed="rId21"/>
                           <a:stretch>
                             <a:fillRect/>
                           </a:stretch>
@@ -2080,6 +2427,7 @@
                 <w:color w:val="475569"/>
                 <w:sz w:val="22"/>
               </w:rPr>
+              <w:lastRenderedPageBreak/>
               <w:drawing>
                 <wp:inline distT="0" distB="0" distL="0" distR="0" wp14:anchorId="619B0E1F" wp14:editId="03070B03">
                   <wp:extent cx="2073349" cy="2549802"/>
@@ -2096,7 +2444,7 @@
                           <pic:cNvPicPr/>
                         </pic:nvPicPr>
                         <pic:blipFill>
-                          <a:blip r:embed="rId18"/>
+                          <a:blip r:embed="rId22"/>
                           <a:stretch>
                             <a:fillRect/>
                           </a:stretch>
@@ -2121,6 +2469,70 @@
             <w:pPr>
               <w:spacing w:before="240" w:after="80"/>
               <w:jc w:val="center"/>
+              <w:rPr>
+                <w:b/>
+                <w:color w:val="475569"/>
+                <w:sz w:val="22"/>
+              </w:rPr>
+            </w:pPr>
+            <w:r>
+              <w:rPr>
+                <w:noProof/>
+              </w:rPr>
+              <w:drawing>
+                <wp:inline distT="0" distB="0" distL="0" distR="0" wp14:anchorId="2AA8444E" wp14:editId="3E7A4E84">
+                  <wp:extent cx="3389560" cy="4217773"/>
+                  <wp:effectExtent l="0" t="0" r="1905" b="0"/>
+                  <wp:docPr id="71242600" name="Picture 5"/>
+                  <wp:cNvGraphicFramePr>
+                    <a:graphicFrameLocks xmlns:a="http://schemas.openxmlformats.org/drawingml/2006/main" noChangeAspect="1"/>
+                  </wp:cNvGraphicFramePr>
+                  <a:graphic xmlns:a="http://schemas.openxmlformats.org/drawingml/2006/main">
+                    <a:graphicData uri="http://schemas.openxmlformats.org/drawingml/2006/picture">
+                      <pic:pic xmlns:pic="http://schemas.openxmlformats.org/drawingml/2006/picture">
+                        <pic:nvPicPr>
+                          <pic:cNvPr id="0" name="Picture 9"/>
+                          <pic:cNvPicPr>
+                            <a:picLocks noChangeAspect="1" noChangeArrowheads="1"/>
+                          </pic:cNvPicPr>
+                        </pic:nvPicPr>
+                        <pic:blipFill>
+                          <a:blip r:embed="rId23">
+                            <a:extLst>
+                              <a:ext uri="{28A0092B-C50C-407E-A947-70E740481C1C}">
+                                <a14:useLocalDpi xmlns:a14="http://schemas.microsoft.com/office/drawing/2010/main" val="0"/>
+                              </a:ext>
+                            </a:extLst>
+                          </a:blip>
+                          <a:srcRect/>
+                          <a:stretch>
+                            <a:fillRect/>
+                          </a:stretch>
+                        </pic:blipFill>
+                        <pic:spPr bwMode="auto">
+                          <a:xfrm>
+                            <a:off x="0" y="0"/>
+                            <a:ext cx="3396099" cy="4225910"/>
+                          </a:xfrm>
+                          <a:prstGeom prst="rect">
+                            <a:avLst/>
+                          </a:prstGeom>
+                          <a:noFill/>
+                          <a:ln>
+                            <a:noFill/>
+                          </a:ln>
+                        </pic:spPr>
+                      </pic:pic>
+                    </a:graphicData>
+                  </a:graphic>
+                </wp:inline>
+              </w:drawing>
+            </w:r>
+          </w:p>
+          <w:p>
+            <w:pPr>
+              <w:spacing w:before="240" w:after="80"/>
+              <w:jc w:val="center"/>
             </w:pPr>
             <w:r>
               <w:rPr>
@@ -2169,7 +2581,15 @@
                 <w:color w:val="94A3B8"/>
                 <w:sz w:val="18"/>
               </w:rPr>
-              <w:t>Requirement: Window with Dark Mode toggle active, demonstrating reactive Material 3 dark surface container rendering.</w:t>
+              <w:t xml:space="preserve">Requirement: Window with Dark Mode toggle active, demonstrating reactive Material 3 dark surface container </w:t>
+            </w:r>
+            <w:r>
+              <w:rPr>
+                <w:color w:val="94A3B8"/>
+                <w:sz w:val="18"/>
+              </w:rPr>
+              <w:lastRenderedPageBreak/>
+              <w:t>rendering.</w:t>
             </w:r>
           </w:p>
         </w:tc>
@@ -2185,6 +2605,7 @@
           <w:b/>
           <w:sz w:val="19"/>
         </w:rPr>
+        <w:lastRenderedPageBreak/>
         <w:t>Figure 6: Material 3 Dark Mode Theme Toggle State</w:t>
       </w:r>
     </w:p>
@@ -2376,12 +2797,21 @@
             <w:pPr>
               <w:spacing w:after="0"/>
             </w:pPr>
+            <w:proofErr w:type="gramStart"/>
             <w:r>
               <w:rPr>
                 <w:b/>
                 <w:sz w:val="17"/>
               </w:rPr>
-              <w:t xml:space="preserve">[ Student </w:t>
+              <w:t>[ Student</w:t>
+            </w:r>
+            <w:proofErr w:type="gramEnd"/>
+            <w:r>
+              <w:rPr>
+                <w:b/>
+                <w:sz w:val="17"/>
+              </w:rPr>
+              <w:t xml:space="preserve"> </w:t>
             </w:r>
             <w:proofErr w:type="gramStart"/>
             <w:r>
@@ -2761,7 +3191,19 @@
               <w:rPr>
                 <w:sz w:val="17"/>
               </w:rPr>
-              <w:t>[ghi9012]</w:t>
+              <w:t>[</w:t>
+            </w:r>
+            <w:r>
+              <w:rPr>
+                <w:sz w:val="17"/>
+              </w:rPr>
+              <w:t>8e9ec3e</w:t>
+            </w:r>
+            <w:r>
+              <w:rPr>
+                <w:sz w:val="17"/>
+              </w:rPr>
+              <w:t>]</w:t>
             </w:r>
           </w:p>
         </w:tc>
@@ -2999,16 +3441,13 @@
       </w:r>
     </w:p>
     <w:p>
-      <w:pPr>
-        <w:spacing w:after="160"/>
-      </w:pPr>
       <w:r>
         <w:rPr>
           <w:i/>
           <w:color w:val="64748B"/>
           <w:sz w:val="19"/>
         </w:rPr>
-        <w:t>[ Write 3-4 sentences describing what you learned about feature branching safety, enforcing state boundary constraints, and testing Material 3 controls in Flet</w:t>
+        <w:t xml:space="preserve">I learned how feature branching allows me to work on assigned changes without directly affecting the team's main branch. I also learned the importance of synchronizing with the latest main branch before merging to ensure that my work was based on the team's most recent version. Testing the task counter and reaching the 5/5 sprint goal helped me understand how application state and boundary conditions control the behavior of a feature. I also tested </w:t>
       </w:r>
       <w:proofErr w:type="gramStart"/>
       <w:r>
@@ -3017,11 +3456,25 @@
           <w:color w:val="64748B"/>
           <w:sz w:val="19"/>
         </w:rPr>
-        <w:t>... ]</w:t>
+        <w:t>the Material</w:t>
       </w:r>
       <w:proofErr w:type="gramEnd"/>
-    </w:p>
-    <w:p>
+      <w:r>
+        <w:rPr>
+          <w:i/>
+          <w:color w:val="64748B"/>
+          <w:sz w:val="19"/>
+        </w:rPr>
+        <w:t xml:space="preserve"> 3 dark mode and verified that the interface responded correctly to the theme change.</w:t>
+      </w:r>
+      <w:r>
+        <w:rPr>
+          <w:i/>
+          <w:color w:val="64748B"/>
+          <w:sz w:val="19"/>
+        </w:rPr>
+        <w:t xml:space="preserve"> </w:t>
+      </w:r>
       <w:r>
         <w:br w:type="page"/>
       </w:r>
@@ -3209,8 +3662,8 @@
     </w:tbl>
     <w:p/>
     <w:sectPr>
-      <w:headerReference w:type="default" r:id="rId19"/>
-      <w:footerReference w:type="default" r:id="rId20"/>
+      <w:headerReference w:type="default" r:id="rId24"/>
+      <w:footerReference w:type="default" r:id="rId25"/>
       <w:pgSz w:w="12240" w:h="15840"/>
       <w:pgMar w:top="1440" w:right="1440" w:bottom="1440" w:left="1440" w:header="720" w:footer="720" w:gutter="0"/>
       <w:cols w:space="720"/>
@@ -3222,7 +3675,7 @@
 </file>
 
 <file path=word/endnotes.xml><?xml version="1.0" encoding="utf-8"?>
-<w:endnotes xmlns:wpc="http://schemas.microsoft.com/office/word/2010/wordprocessingCanvas" xmlns:cx="http://schemas.microsoft.com/office/drawing/2014/chartex" xmlns:cx1="http://schemas.microsoft.com/office/drawing/2015/9/8/chartex" xmlns:cx2="http://schemas.microsoft.com/office/drawing/2015/10/21/chartex" xmlns:cx3="http://schemas.microsoft.com/office/drawing/2016/5/9/chartex" xmlns:cx4="http://schemas.microsoft.com/office/drawing/2016/5/10/chartex" xmlns:cx5="http://schemas.microsoft.com/office/drawing/2016/5/11/chartex" xmlns:cx6="http://schemas.microsoft.com/office/drawing/2016/5/12/chartex" xmlns:cx7="http://schemas.microsoft.com/office/drawing/2016/5/13/chartex" xmlns:cx8="http://schemas.microsoft.com/office/drawing/2016/5/14/chartex" xmlns:mc="http://schemas.openxmlformats.org/markup-compatibility/2006" xmlns:m="http://schemas.openxmlformats.org/officeDocument/2006/math" xmlns:aink="http://schemas.microsoft.com/office/drawing/2016/ink" xmlns:am3d="http://schemas.microsoft.com/office/drawing/2017/model3d" xmlns:oel="http://schemas.microsoft.com/office/2019/extlst" xmlns:r="http://schemas.openxmlformats.org/officeDocument/2006/relationships" xmlns:wp14="http://schemas.microsoft.com/office/word/2010/wordprocessingDrawing" xmlns:wp="http://schemas.openxmlformats.org/drawingml/2006/wordprocessingDrawing" xmlns:wpg="http://schemas.microsoft.com/office/word/2010/wordprocessingGroup" xmlns:wpi="http://schemas.microsoft.com/office/word/2010/wordprocessingInk" xmlns:wps="http://schemas.microsoft.com/office/word/2010/wordprocessingShape" xmlns:o="urn:schemas-microsoft-com:office:office" xmlns:v="urn:schemas-microsoft-com:vml" xmlns:w10="urn:schemas-microsoft-com:office:word" xmlns:w="http://schemas.openxmlformats.org/wordprocessingml/2006/main" xmlns:w14="http://schemas.microsoft.com/office/word/2010/wordml" xmlns:w15="http://schemas.microsoft.com/office/word/2012/wordml" xmlns:w16cex="http://schemas.microsoft.com/office/word/2018/wordml/cex" xmlns:w16cid="http://schemas.microsoft.com/office/word/2016/wordml/cid" xmlns:w16="http://schemas.microsoft.com/office/word/2018/wordml" xmlns:w16sdtdh="http://schemas.microsoft.com/office/word/2020/wordml/sdtdatahash" xmlns:w16sdtfl="http://schemas.microsoft.com/office/word/2024/wordml/sdtformatlock" xmlns:w16se="http://schemas.microsoft.com/office/word/2015/wordml/symex" xmlns:w16du="http://schemas.microsoft.com/office/word/2023/wordml/word16du" xmlns:wne="http://schemas.microsoft.com/office/word/2006/wordml" mc:Ignorable="w14 w15 w16se w16cid w16 w16cex w16sdtdh w16sdtfl w16du wp14">
+<w:endnotes xmlns:wpc="http://schemas.microsoft.com/office/word/2010/wordprocessingCanvas" xmlns:cx="http://schemas.microsoft.com/office/drawing/2014/chartex" xmlns:cx1="http://schemas.microsoft.com/office/drawing/2015/9/8/chartex" xmlns:cx2="http://schemas.microsoft.com/office/drawing/2015/10/21/chartex" xmlns:cx3="http://schemas.microsoft.com/office/drawing/2016/5/9/chartex" xmlns:cx4="http://schemas.microsoft.com/office/drawing/2016/5/10/chartex" xmlns:cx5="http://schemas.microsoft.com/office/drawing/2016/5/11/chartex" xmlns:cx6="http://schemas.microsoft.com/office/drawing/2016/5/12/chartex" xmlns:cx7="http://schemas.microsoft.com/office/drawing/2016/5/13/chartex" xmlns:cx8="http://schemas.microsoft.com/office/drawing/2016/5/14/chartex" xmlns:mc="http://schemas.openxmlformats.org/markup-compatibility/2006" xmlns:aink="http://schemas.microsoft.com/office/drawing/2016/ink" xmlns:am3d="http://schemas.microsoft.com/office/drawing/2017/model3d" xmlns:o="urn:schemas-microsoft-com:office:office" xmlns:oel="http://schemas.microsoft.com/office/2019/extlst" xmlns:r="http://schemas.openxmlformats.org/officeDocument/2006/relationships" xmlns:m="http://schemas.openxmlformats.org/officeDocument/2006/math" xmlns:v="urn:schemas-microsoft-com:vml" xmlns:wp14="http://schemas.microsoft.com/office/word/2010/wordprocessingDrawing" xmlns:wp="http://schemas.openxmlformats.org/drawingml/2006/wordprocessingDrawing" xmlns:w10="urn:schemas-microsoft-com:office:word" xmlns:w="http://schemas.openxmlformats.org/wordprocessingml/2006/main" xmlns:w14="http://schemas.microsoft.com/office/word/2010/wordml" xmlns:w15="http://schemas.microsoft.com/office/word/2012/wordml" xmlns:w16cex="http://schemas.microsoft.com/office/word/2018/wordml/cex" xmlns:w16cid="http://schemas.microsoft.com/office/word/2016/wordml/cid" xmlns:w16="http://schemas.microsoft.com/office/word/2018/wordml" xmlns:w16du="http://schemas.microsoft.com/office/word/2023/wordml/word16du" xmlns:w16sdtdh="http://schemas.microsoft.com/office/word/2020/wordml/sdtdatahash" xmlns:w16sdtfl="http://schemas.microsoft.com/office/word/2024/wordml/sdtformatlock" xmlns:w16se="http://schemas.microsoft.com/office/word/2015/wordml/symex" xmlns:wpg="http://schemas.microsoft.com/office/word/2010/wordprocessingGroup" xmlns:wpi="http://schemas.microsoft.com/office/word/2010/wordprocessingInk" xmlns:wne="http://schemas.microsoft.com/office/word/2006/wordml" xmlns:wps="http://schemas.microsoft.com/office/word/2010/wordprocessingShape" mc:Ignorable="w14 w15 w16se w16cid w16 w16cex w16sdtdh w16sdtfl w16du wp14">
   <w:endnote w:type="separator" w:id="-1">
     <w:p>
       <w:pPr>
@@ -3247,7 +3700,7 @@
 </file>
 
 <file path=word/footer1.xml><?xml version="1.0" encoding="utf-8"?>
-<w:ftr xmlns:wpc="http://schemas.microsoft.com/office/word/2010/wordprocessingCanvas" xmlns:cx="http://schemas.microsoft.com/office/drawing/2014/chartex" xmlns:cx1="http://schemas.microsoft.com/office/drawing/2015/9/8/chartex" xmlns:cx2="http://schemas.microsoft.com/office/drawing/2015/10/21/chartex" xmlns:cx3="http://schemas.microsoft.com/office/drawing/2016/5/9/chartex" xmlns:cx4="http://schemas.microsoft.com/office/drawing/2016/5/10/chartex" xmlns:cx5="http://schemas.microsoft.com/office/drawing/2016/5/11/chartex" xmlns:cx6="http://schemas.microsoft.com/office/drawing/2016/5/12/chartex" xmlns:cx7="http://schemas.microsoft.com/office/drawing/2016/5/13/chartex" xmlns:cx8="http://schemas.microsoft.com/office/drawing/2016/5/14/chartex" xmlns:mc="http://schemas.openxmlformats.org/markup-compatibility/2006" xmlns:m="http://schemas.openxmlformats.org/officeDocument/2006/math" xmlns:aink="http://schemas.microsoft.com/office/drawing/2016/ink" xmlns:am3d="http://schemas.microsoft.com/office/drawing/2017/model3d" xmlns:oel="http://schemas.microsoft.com/office/2019/extlst" xmlns:r="http://schemas.openxmlformats.org/officeDocument/2006/relationships" xmlns:wp14="http://schemas.microsoft.com/office/word/2010/wordprocessingDrawing" xmlns:wp="http://schemas.openxmlformats.org/drawingml/2006/wordprocessingDrawing" xmlns:wpg="http://schemas.microsoft.com/office/word/2010/wordprocessingGroup" xmlns:wpi="http://schemas.microsoft.com/office/word/2010/wordprocessingInk" xmlns:wps="http://schemas.microsoft.com/office/word/2010/wordprocessingShape" xmlns:o="urn:schemas-microsoft-com:office:office" xmlns:v="urn:schemas-microsoft-com:vml" xmlns:w10="urn:schemas-microsoft-com:office:word" xmlns:w="http://schemas.openxmlformats.org/wordprocessingml/2006/main" xmlns:w14="http://schemas.microsoft.com/office/word/2010/wordml" xmlns:w15="http://schemas.microsoft.com/office/word/2012/wordml" xmlns:w16cex="http://schemas.microsoft.com/office/word/2018/wordml/cex" xmlns:w16cid="http://schemas.microsoft.com/office/word/2016/wordml/cid" xmlns:w16="http://schemas.microsoft.com/office/word/2018/wordml" xmlns:w16sdtdh="http://schemas.microsoft.com/office/word/2020/wordml/sdtdatahash" xmlns:w16sdtfl="http://schemas.microsoft.com/office/word/2024/wordml/sdtformatlock" xmlns:w16se="http://schemas.microsoft.com/office/word/2015/wordml/symex" xmlns:w16du="http://schemas.microsoft.com/office/word/2023/wordml/word16du" xmlns:wne="http://schemas.microsoft.com/office/word/2006/wordml" mc:Ignorable="w14 w15 w16se w16cid w16 w16cex w16sdtdh w16sdtfl w16du wp14">
+<w:ftr xmlns:wpc="http://schemas.microsoft.com/office/word/2010/wordprocessingCanvas" xmlns:cx="http://schemas.microsoft.com/office/drawing/2014/chartex" xmlns:cx1="http://schemas.microsoft.com/office/drawing/2015/9/8/chartex" xmlns:cx2="http://schemas.microsoft.com/office/drawing/2015/10/21/chartex" xmlns:cx3="http://schemas.microsoft.com/office/drawing/2016/5/9/chartex" xmlns:cx4="http://schemas.microsoft.com/office/drawing/2016/5/10/chartex" xmlns:cx5="http://schemas.microsoft.com/office/drawing/2016/5/11/chartex" xmlns:cx6="http://schemas.microsoft.com/office/drawing/2016/5/12/chartex" xmlns:cx7="http://schemas.microsoft.com/office/drawing/2016/5/13/chartex" xmlns:cx8="http://schemas.microsoft.com/office/drawing/2016/5/14/chartex" xmlns:mc="http://schemas.openxmlformats.org/markup-compatibility/2006" xmlns:aink="http://schemas.microsoft.com/office/drawing/2016/ink" xmlns:am3d="http://schemas.microsoft.com/office/drawing/2017/model3d" xmlns:o="urn:schemas-microsoft-com:office:office" xmlns:oel="http://schemas.microsoft.com/office/2019/extlst" xmlns:r="http://schemas.openxmlformats.org/officeDocument/2006/relationships" xmlns:m="http://schemas.openxmlformats.org/officeDocument/2006/math" xmlns:v="urn:schemas-microsoft-com:vml" xmlns:wp14="http://schemas.microsoft.com/office/word/2010/wordprocessingDrawing" xmlns:wp="http://schemas.openxmlformats.org/drawingml/2006/wordprocessingDrawing" xmlns:w10="urn:schemas-microsoft-com:office:word" xmlns:w="http://schemas.openxmlformats.org/wordprocessingml/2006/main" xmlns:w14="http://schemas.microsoft.com/office/word/2010/wordml" xmlns:w15="http://schemas.microsoft.com/office/word/2012/wordml" xmlns:w16cex="http://schemas.microsoft.com/office/word/2018/wordml/cex" xmlns:w16cid="http://schemas.microsoft.com/office/word/2016/wordml/cid" xmlns:w16="http://schemas.microsoft.com/office/word/2018/wordml" xmlns:w16du="http://schemas.microsoft.com/office/word/2023/wordml/word16du" xmlns:w16sdtdh="http://schemas.microsoft.com/office/word/2020/wordml/sdtdatahash" xmlns:w16sdtfl="http://schemas.microsoft.com/office/word/2024/wordml/sdtformatlock" xmlns:w16se="http://schemas.microsoft.com/office/word/2015/wordml/symex" xmlns:wpg="http://schemas.microsoft.com/office/word/2010/wordprocessingGroup" xmlns:wpi="http://schemas.microsoft.com/office/word/2010/wordprocessingInk" xmlns:wne="http://schemas.microsoft.com/office/word/2006/wordml" xmlns:wps="http://schemas.microsoft.com/office/word/2010/wordprocessingShape" mc:Ignorable="w14 w15 w16se w16cid w16 w16cex w16sdtdh w16sdtfl w16du wp14">
   <w:p>
     <w:pPr>
       <w:pStyle w:val="Footer"/>
@@ -3265,7 +3718,7 @@
 </file>
 
 <file path=word/footnotes.xml><?xml version="1.0" encoding="utf-8"?>
-<w:footnotes xmlns:wpc="http://schemas.microsoft.com/office/word/2010/wordprocessingCanvas" xmlns:cx="http://schemas.microsoft.com/office/drawing/2014/chartex" xmlns:cx1="http://schemas.microsoft.com/office/drawing/2015/9/8/chartex" xmlns:cx2="http://schemas.microsoft.com/office/drawing/2015/10/21/chartex" xmlns:cx3="http://schemas.microsoft.com/office/drawing/2016/5/9/chartex" xmlns:cx4="http://schemas.microsoft.com/office/drawing/2016/5/10/chartex" xmlns:cx5="http://schemas.microsoft.com/office/drawing/2016/5/11/chartex" xmlns:cx6="http://schemas.microsoft.com/office/drawing/2016/5/12/chartex" xmlns:cx7="http://schemas.microsoft.com/office/drawing/2016/5/13/chartex" xmlns:cx8="http://schemas.microsoft.com/office/drawing/2016/5/14/chartex" xmlns:mc="http://schemas.openxmlformats.org/markup-compatibility/2006" xmlns:m="http://schemas.openxmlformats.org/officeDocument/2006/math" xmlns:aink="http://schemas.microsoft.com/office/drawing/2016/ink" xmlns:am3d="http://schemas.microsoft.com/office/drawing/2017/model3d" xmlns:oel="http://schemas.microsoft.com/office/2019/extlst" xmlns:r="http://schemas.openxmlformats.org/officeDocument/2006/relationships" xmlns:wp14="http://schemas.microsoft.com/office/word/2010/wordprocessingDrawing" xmlns:wp="http://schemas.openxmlformats.org/drawingml/2006/wordprocessingDrawing" xmlns:wpg="http://schemas.microsoft.com/office/word/2010/wordprocessingGroup" xmlns:wpi="http://schemas.microsoft.com/office/word/2010/wordprocessingInk" xmlns:wps="http://schemas.microsoft.com/office/word/2010/wordprocessingShape" xmlns:o="urn:schemas-microsoft-com:office:office" xmlns:v="urn:schemas-microsoft-com:vml" xmlns:w10="urn:schemas-microsoft-com:office:word" xmlns:w="http://schemas.openxmlformats.org/wordprocessingml/2006/main" xmlns:w14="http://schemas.microsoft.com/office/word/2010/wordml" xmlns:w15="http://schemas.microsoft.com/office/word/2012/wordml" xmlns:w16cex="http://schemas.microsoft.com/office/word/2018/wordml/cex" xmlns:w16cid="http://schemas.microsoft.com/office/word/2016/wordml/cid" xmlns:w16="http://schemas.microsoft.com/office/word/2018/wordml" xmlns:w16sdtdh="http://schemas.microsoft.com/office/word/2020/wordml/sdtdatahash" xmlns:w16sdtfl="http://schemas.microsoft.com/office/word/2024/wordml/sdtformatlock" xmlns:w16se="http://schemas.microsoft.com/office/word/2015/wordml/symex" xmlns:w16du="http://schemas.microsoft.com/office/word/2023/wordml/word16du" xmlns:wne="http://schemas.microsoft.com/office/word/2006/wordml" mc:Ignorable="w14 w15 w16se w16cid w16 w16cex w16sdtdh w16sdtfl w16du wp14">
+<w:footnotes xmlns:wpc="http://schemas.microsoft.com/office/word/2010/wordprocessingCanvas" xmlns:cx="http://schemas.microsoft.com/office/drawing/2014/chartex" xmlns:cx1="http://schemas.microsoft.com/office/drawing/2015/9/8/chartex" xmlns:cx2="http://schemas.microsoft.com/office/drawing/2015/10/21/chartex" xmlns:cx3="http://schemas.microsoft.com/office/drawing/2016/5/9/chartex" xmlns:cx4="http://schemas.microsoft.com/office/drawing/2016/5/10/chartex" xmlns:cx5="http://schemas.microsoft.com/office/drawing/2016/5/11/chartex" xmlns:cx6="http://schemas.microsoft.com/office/drawing/2016/5/12/chartex" xmlns:cx7="http://schemas.microsoft.com/office/drawing/2016/5/13/chartex" xmlns:cx8="http://schemas.microsoft.com/office/drawing/2016/5/14/chartex" xmlns:mc="http://schemas.openxmlformats.org/markup-compatibility/2006" xmlns:aink="http://schemas.microsoft.com/office/drawing/2016/ink" xmlns:am3d="http://schemas.microsoft.com/office/drawing/2017/model3d" xmlns:o="urn:schemas-microsoft-com:office:office" xmlns:oel="http://schemas.microsoft.com/office/2019/extlst" xmlns:r="http://schemas.openxmlformats.org/officeDocument/2006/relationships" xmlns:m="http://schemas.openxmlformats.org/officeDocument/2006/math" xmlns:v="urn:schemas-microsoft-com:vml" xmlns:wp14="http://schemas.microsoft.com/office/word/2010/wordprocessingDrawing" xmlns:wp="http://schemas.openxmlformats.org/drawingml/2006/wordprocessingDrawing" xmlns:w10="urn:schemas-microsoft-com:office:word" xmlns:w="http://schemas.openxmlformats.org/wordprocessingml/2006/main" xmlns:w14="http://schemas.microsoft.com/office/word/2010/wordml" xmlns:w15="http://schemas.microsoft.com/office/word/2012/wordml" xmlns:w16cex="http://schemas.microsoft.com/office/word/2018/wordml/cex" xmlns:w16cid="http://schemas.microsoft.com/office/word/2016/wordml/cid" xmlns:w16="http://schemas.microsoft.com/office/word/2018/wordml" xmlns:w16du="http://schemas.microsoft.com/office/word/2023/wordml/word16du" xmlns:w16sdtdh="http://schemas.microsoft.com/office/word/2020/wordml/sdtdatahash" xmlns:w16sdtfl="http://schemas.microsoft.com/office/word/2024/wordml/sdtformatlock" xmlns:w16se="http://schemas.microsoft.com/office/word/2015/wordml/symex" xmlns:wpg="http://schemas.microsoft.com/office/word/2010/wordprocessingGroup" xmlns:wpi="http://schemas.microsoft.com/office/word/2010/wordprocessingInk" xmlns:wne="http://schemas.microsoft.com/office/word/2006/wordml" xmlns:wps="http://schemas.microsoft.com/office/word/2010/wordprocessingShape" mc:Ignorable="w14 w15 w16se w16cid w16 w16cex w16sdtdh w16sdtfl w16du wp14">
   <w:footnote w:type="separator" w:id="-1">
     <w:p>
       <w:pPr>
@@ -3290,7 +3743,7 @@
 </file>
 
 <file path=word/header1.xml><?xml version="1.0" encoding="utf-8"?>
-<w:hdr xmlns:wpc="http://schemas.microsoft.com/office/word/2010/wordprocessingCanvas" xmlns:cx="http://schemas.microsoft.com/office/drawing/2014/chartex" xmlns:cx1="http://schemas.microsoft.com/office/drawing/2015/9/8/chartex" xmlns:cx2="http://schemas.microsoft.com/office/drawing/2015/10/21/chartex" xmlns:cx3="http://schemas.microsoft.com/office/drawing/2016/5/9/chartex" xmlns:cx4="http://schemas.microsoft.com/office/drawing/2016/5/10/chartex" xmlns:cx5="http://schemas.microsoft.com/office/drawing/2016/5/11/chartex" xmlns:cx6="http://schemas.microsoft.com/office/drawing/2016/5/12/chartex" xmlns:cx7="http://schemas.microsoft.com/office/drawing/2016/5/13/chartex" xmlns:cx8="http://schemas.microsoft.com/office/drawing/2016/5/14/chartex" xmlns:mc="http://schemas.openxmlformats.org/markup-compatibility/2006" xmlns:m="http://schemas.openxmlformats.org/officeDocument/2006/math" xmlns:aink="http://schemas.microsoft.com/office/drawing/2016/ink" xmlns:am3d="http://schemas.microsoft.com/office/drawing/2017/model3d" xmlns:oel="http://schemas.microsoft.com/office/2019/extlst" xmlns:r="http://schemas.openxmlformats.org/officeDocument/2006/relationships" xmlns:wp14="http://schemas.microsoft.com/office/word/2010/wordprocessingDrawing" xmlns:wp="http://schemas.openxmlformats.org/drawingml/2006/wordprocessingDrawing" xmlns:wpg="http://schemas.microsoft.com/office/word/2010/wordprocessingGroup" xmlns:wpi="http://schemas.microsoft.com/office/word/2010/wordprocessingInk" xmlns:wps="http://schemas.microsoft.com/office/word/2010/wordprocessingShape" xmlns:o="urn:schemas-microsoft-com:office:office" xmlns:v="urn:schemas-microsoft-com:vml" xmlns:w10="urn:schemas-microsoft-com:office:word" xmlns:w="http://schemas.openxmlformats.org/wordprocessingml/2006/main" xmlns:w14="http://schemas.microsoft.com/office/word/2010/wordml" xmlns:w15="http://schemas.microsoft.com/office/word/2012/wordml" xmlns:w16cex="http://schemas.microsoft.com/office/word/2018/wordml/cex" xmlns:w16cid="http://schemas.microsoft.com/office/word/2016/wordml/cid" xmlns:w16="http://schemas.microsoft.com/office/word/2018/wordml" xmlns:w16sdtdh="http://schemas.microsoft.com/office/word/2020/wordml/sdtdatahash" xmlns:w16sdtfl="http://schemas.microsoft.com/office/word/2024/wordml/sdtformatlock" xmlns:w16se="http://schemas.microsoft.com/office/word/2015/wordml/symex" xmlns:w16du="http://schemas.microsoft.com/office/word/2023/wordml/word16du" xmlns:wne="http://schemas.microsoft.com/office/word/2006/wordml" mc:Ignorable="w14 w15 w16se w16cid w16 w16cex w16sdtdh w16sdtfl w16du wp14">
+<w:hdr xmlns:wpc="http://schemas.microsoft.com/office/word/2010/wordprocessingCanvas" xmlns:cx="http://schemas.microsoft.com/office/drawing/2014/chartex" xmlns:cx1="http://schemas.microsoft.com/office/drawing/2015/9/8/chartex" xmlns:cx2="http://schemas.microsoft.com/office/drawing/2015/10/21/chartex" xmlns:cx3="http://schemas.microsoft.com/office/drawing/2016/5/9/chartex" xmlns:cx4="http://schemas.microsoft.com/office/drawing/2016/5/10/chartex" xmlns:cx5="http://schemas.microsoft.com/office/drawing/2016/5/11/chartex" xmlns:cx6="http://schemas.microsoft.com/office/drawing/2016/5/12/chartex" xmlns:cx7="http://schemas.microsoft.com/office/drawing/2016/5/13/chartex" xmlns:cx8="http://schemas.microsoft.com/office/drawing/2016/5/14/chartex" xmlns:mc="http://schemas.openxmlformats.org/markup-compatibility/2006" xmlns:aink="http://schemas.microsoft.com/office/drawing/2016/ink" xmlns:am3d="http://schemas.microsoft.com/office/drawing/2017/model3d" xmlns:o="urn:schemas-microsoft-com:office:office" xmlns:oel="http://schemas.microsoft.com/office/2019/extlst" xmlns:r="http://schemas.openxmlformats.org/officeDocument/2006/relationships" xmlns:m="http://schemas.openxmlformats.org/officeDocument/2006/math" xmlns:v="urn:schemas-microsoft-com:vml" xmlns:wp14="http://schemas.microsoft.com/office/word/2010/wordprocessingDrawing" xmlns:wp="http://schemas.openxmlformats.org/drawingml/2006/wordprocessingDrawing" xmlns:w10="urn:schemas-microsoft-com:office:word" xmlns:w="http://schemas.openxmlformats.org/wordprocessingml/2006/main" xmlns:w14="http://schemas.microsoft.com/office/word/2010/wordml" xmlns:w15="http://schemas.microsoft.com/office/word/2012/wordml" xmlns:w16cex="http://schemas.microsoft.com/office/word/2018/wordml/cex" xmlns:w16cid="http://schemas.microsoft.com/office/word/2016/wordml/cid" xmlns:w16="http://schemas.microsoft.com/office/word/2018/wordml" xmlns:w16du="http://schemas.microsoft.com/office/word/2023/wordml/word16du" xmlns:w16sdtdh="http://schemas.microsoft.com/office/word/2020/wordml/sdtdatahash" xmlns:w16sdtfl="http://schemas.microsoft.com/office/word/2024/wordml/sdtformatlock" xmlns:w16se="http://schemas.microsoft.com/office/word/2015/wordml/symex" xmlns:wpg="http://schemas.microsoft.com/office/word/2010/wordprocessingGroup" xmlns:wpi="http://schemas.microsoft.com/office/word/2010/wordprocessingInk" xmlns:wne="http://schemas.microsoft.com/office/word/2006/wordml" xmlns:wps="http://schemas.microsoft.com/office/word/2010/wordprocessingShape" mc:Ignorable="w14 w15 w16se w16cid w16 w16cex w16sdtdh w16sdtfl w16du wp14">
   <w:p>
     <w:pPr>
       <w:pStyle w:val="Header"/>
@@ -3308,7 +3761,7 @@
 </file>
 
 <file path=word/numbering.xml><?xml version="1.0" encoding="utf-8"?>
-<w:numbering xmlns:wpc="http://schemas.microsoft.com/office/word/2010/wordprocessingCanvas" xmlns:cx="http://schemas.microsoft.com/office/drawing/2014/chartex" xmlns:cx1="http://schemas.microsoft.com/office/drawing/2015/9/8/chartex" xmlns:cx2="http://schemas.microsoft.com/office/drawing/2015/10/21/chartex" xmlns:cx3="http://schemas.microsoft.com/office/drawing/2016/5/9/chartex" xmlns:cx4="http://schemas.microsoft.com/office/drawing/2016/5/10/chartex" xmlns:cx5="http://schemas.microsoft.com/office/drawing/2016/5/11/chartex" xmlns:cx6="http://schemas.microsoft.com/office/drawing/2016/5/12/chartex" xmlns:cx7="http://schemas.microsoft.com/office/drawing/2016/5/13/chartex" xmlns:cx8="http://schemas.microsoft.com/office/drawing/2016/5/14/chartex" xmlns:mc="http://schemas.openxmlformats.org/markup-compatibility/2006" xmlns:m="http://schemas.openxmlformats.org/officeDocument/2006/math" xmlns:aink="http://schemas.microsoft.com/office/drawing/2016/ink" xmlns:am3d="http://schemas.microsoft.com/office/drawing/2017/model3d" xmlns:oel="http://schemas.microsoft.com/office/2019/extlst" xmlns:r="http://schemas.openxmlformats.org/officeDocument/2006/relationships" xmlns:wp14="http://schemas.microsoft.com/office/word/2010/wordprocessingDrawing" xmlns:wp="http://schemas.openxmlformats.org/drawingml/2006/wordprocessingDrawing" xmlns:wpg="http://schemas.microsoft.com/office/word/2010/wordprocessingGroup" xmlns:wpi="http://schemas.microsoft.com/office/word/2010/wordprocessingInk" xmlns:wps="http://schemas.microsoft.com/office/word/2010/wordprocessingShape" xmlns:o="urn:schemas-microsoft-com:office:office" xmlns:v="urn:schemas-microsoft-com:vml" xmlns:w10="urn:schemas-microsoft-com:office:word" xmlns:w="http://schemas.openxmlformats.org/wordprocessingml/2006/main" xmlns:w14="http://schemas.microsoft.com/office/word/2010/wordml" xmlns:w15="http://schemas.microsoft.com/office/word/2012/wordml" xmlns:w16cex="http://schemas.microsoft.com/office/word/2018/wordml/cex" xmlns:w16cid="http://schemas.microsoft.com/office/word/2016/wordml/cid" xmlns:w16="http://schemas.microsoft.com/office/word/2018/wordml" xmlns:w16sdtdh="http://schemas.microsoft.com/office/word/2020/wordml/sdtdatahash" xmlns:w16sdtfl="http://schemas.microsoft.com/office/word/2024/wordml/sdtformatlock" xmlns:w16se="http://schemas.microsoft.com/office/word/2015/wordml/symex" xmlns:w16du="http://schemas.microsoft.com/office/word/2023/wordml/word16du" xmlns:wne="http://schemas.microsoft.com/office/word/2006/wordml" mc:Ignorable="w14 w15 w16se w16cid w16 w16cex w16sdtdh w16sdtfl w16du wp14">
+<w:numbering xmlns:wpc="http://schemas.microsoft.com/office/word/2010/wordprocessingCanvas" xmlns:cx="http://schemas.microsoft.com/office/drawing/2014/chartex" xmlns:cx1="http://schemas.microsoft.com/office/drawing/2015/9/8/chartex" xmlns:cx2="http://schemas.microsoft.com/office/drawing/2015/10/21/chartex" xmlns:cx3="http://schemas.microsoft.com/office/drawing/2016/5/9/chartex" xmlns:cx4="http://schemas.microsoft.com/office/drawing/2016/5/10/chartex" xmlns:cx5="http://schemas.microsoft.com/office/drawing/2016/5/11/chartex" xmlns:cx6="http://schemas.microsoft.com/office/drawing/2016/5/12/chartex" xmlns:cx7="http://schemas.microsoft.com/office/drawing/2016/5/13/chartex" xmlns:cx8="http://schemas.microsoft.com/office/drawing/2016/5/14/chartex" xmlns:mc="http://schemas.openxmlformats.org/markup-compatibility/2006" xmlns:aink="http://schemas.microsoft.com/office/drawing/2016/ink" xmlns:am3d="http://schemas.microsoft.com/office/drawing/2017/model3d" xmlns:o="urn:schemas-microsoft-com:office:office" xmlns:oel="http://schemas.microsoft.com/office/2019/extlst" xmlns:r="http://schemas.openxmlformats.org/officeDocument/2006/relationships" xmlns:m="http://schemas.openxmlformats.org/officeDocument/2006/math" xmlns:v="urn:schemas-microsoft-com:vml" xmlns:wp14="http://schemas.microsoft.com/office/word/2010/wordprocessingDrawing" xmlns:wp="http://schemas.openxmlformats.org/drawingml/2006/wordprocessingDrawing" xmlns:w10="urn:schemas-microsoft-com:office:word" xmlns:w="http://schemas.openxmlformats.org/wordprocessingml/2006/main" xmlns:w14="http://schemas.microsoft.com/office/word/2010/wordml" xmlns:w15="http://schemas.microsoft.com/office/word/2012/wordml" xmlns:w16cex="http://schemas.microsoft.com/office/word/2018/wordml/cex" xmlns:w16cid="http://schemas.microsoft.com/office/word/2016/wordml/cid" xmlns:w16="http://schemas.microsoft.com/office/word/2018/wordml" xmlns:w16du="http://schemas.microsoft.com/office/word/2023/wordml/word16du" xmlns:w16sdtdh="http://schemas.microsoft.com/office/word/2020/wordml/sdtdatahash" xmlns:w16sdtfl="http://schemas.microsoft.com/office/word/2024/wordml/sdtformatlock" xmlns:w16se="http://schemas.microsoft.com/office/word/2015/wordml/symex" xmlns:wpg="http://schemas.microsoft.com/office/word/2010/wordprocessingGroup" xmlns:wpi="http://schemas.microsoft.com/office/word/2010/wordprocessingInk" xmlns:wne="http://schemas.microsoft.com/office/word/2006/wordml" xmlns:wps="http://schemas.microsoft.com/office/word/2010/wordprocessingShape" mc:Ignorable="w14 w15 w16se w16cid w16 w16cex w16sdtdh w16sdtfl w16du wp14">
   <w:abstractNum w:abstractNumId="0" w15:restartNumberingAfterBreak="0">
     <w:nsid w:val="FFFFFF7C"/>
     <w:multiLevelType w:val="singleLevel"/>
@@ -3511,7 +3964,7 @@
 </file>
 
 <file path=word/styles.xml><?xml version="1.0" encoding="utf-8"?>
-<w:styles xmlns:mc="http://schemas.openxmlformats.org/markup-compatibility/2006" xmlns:r="http://schemas.openxmlformats.org/officeDocument/2006/relationships" xmlns:w="http://schemas.openxmlformats.org/wordprocessingml/2006/main" xmlns:w14="http://schemas.microsoft.com/office/word/2010/wordml" xmlns:w15="http://schemas.microsoft.com/office/word/2012/wordml" xmlns:w16cex="http://schemas.microsoft.com/office/word/2018/wordml/cex" xmlns:w16cid="http://schemas.microsoft.com/office/word/2016/wordml/cid" xmlns:w16="http://schemas.microsoft.com/office/word/2018/wordml" xmlns:w16sdtdh="http://schemas.microsoft.com/office/word/2020/wordml/sdtdatahash" xmlns:w16sdtfl="http://schemas.microsoft.com/office/word/2024/wordml/sdtformatlock" xmlns:w16se="http://schemas.microsoft.com/office/word/2015/wordml/symex" xmlns:w16du="http://schemas.microsoft.com/office/word/2023/wordml/word16du" mc:Ignorable="w14 w15 w16se w16cid w16 w16cex w16sdtdh w16sdtfl w16du">
+<w:styles xmlns:mc="http://schemas.openxmlformats.org/markup-compatibility/2006" xmlns:r="http://schemas.openxmlformats.org/officeDocument/2006/relationships" xmlns:w="http://schemas.openxmlformats.org/wordprocessingml/2006/main" xmlns:w14="http://schemas.microsoft.com/office/word/2010/wordml" xmlns:w15="http://schemas.microsoft.com/office/word/2012/wordml" xmlns:w16cex="http://schemas.microsoft.com/office/word/2018/wordml/cex" xmlns:w16cid="http://schemas.microsoft.com/office/word/2016/wordml/cid" xmlns:w16="http://schemas.microsoft.com/office/word/2018/wordml" xmlns:w16du="http://schemas.microsoft.com/office/word/2023/wordml/word16du" xmlns:w16sdtdh="http://schemas.microsoft.com/office/word/2020/wordml/sdtdatahash" xmlns:w16sdtfl="http://schemas.microsoft.com/office/word/2024/wordml/sdtformatlock" xmlns:w16se="http://schemas.microsoft.com/office/word/2015/wordml/symex" mc:Ignorable="w14 w15 w16se w16cid w16 w16cex w16sdtdh w16sdtfl w16du">
   <w:docDefaults>
     <w:rPrDefault>
       <w:rPr>
@@ -4118,7 +4571,6 @@
   <w:style w:type="character" w:default="1" w:styleId="DefaultParagraphFont">
     <w:name w:val="Default Paragraph Font"/>
     <w:uiPriority w:val="1"/>
-    <w:semiHidden/>
     <w:unhideWhenUsed/>
   </w:style>
   <w:style w:type="table" w:default="1" w:styleId="TableNormal">

</xml_diff>

<commit_message>
docs(Final): Finalized Lab Report and added git log.
</commit_message>
<xml_diff>
--- a/CCCS106_Lab01_Report_Template.docx
+++ b/CCCS106_Lab01_Report_Template.docx
@@ -1,6 +1,6 @@
 
 <file path=word/document.xml><?xml version="1.0" encoding="utf-8"?>
-<w:document xmlns:wpc="http://schemas.microsoft.com/office/word/2010/wordprocessingCanvas" xmlns:cx="http://schemas.microsoft.com/office/drawing/2014/chartex" xmlns:cx1="http://schemas.microsoft.com/office/drawing/2015/9/8/chartex" xmlns:cx2="http://schemas.microsoft.com/office/drawing/2015/10/21/chartex" xmlns:cx3="http://schemas.microsoft.com/office/drawing/2016/5/9/chartex" xmlns:cx4="http://schemas.microsoft.com/office/drawing/2016/5/10/chartex" xmlns:cx5="http://schemas.microsoft.com/office/drawing/2016/5/11/chartex" xmlns:cx6="http://schemas.microsoft.com/office/drawing/2016/5/12/chartex" xmlns:cx7="http://schemas.microsoft.com/office/drawing/2016/5/13/chartex" xmlns:cx8="http://schemas.microsoft.com/office/drawing/2016/5/14/chartex" xmlns:mc="http://schemas.openxmlformats.org/markup-compatibility/2006" xmlns:aink="http://schemas.microsoft.com/office/drawing/2016/ink" xmlns:am3d="http://schemas.microsoft.com/office/drawing/2017/model3d" xmlns:o="urn:schemas-microsoft-com:office:office" xmlns:oel="http://schemas.microsoft.com/office/2019/extlst" xmlns:r="http://schemas.openxmlformats.org/officeDocument/2006/relationships" xmlns:m="http://schemas.openxmlformats.org/officeDocument/2006/math" xmlns:v="urn:schemas-microsoft-com:vml" xmlns:wp14="http://schemas.microsoft.com/office/word/2010/wordprocessingDrawing" xmlns:wp="http://schemas.openxmlformats.org/drawingml/2006/wordprocessingDrawing" xmlns:w10="urn:schemas-microsoft-com:office:word" xmlns:w="http://schemas.openxmlformats.org/wordprocessingml/2006/main" xmlns:w14="http://schemas.microsoft.com/office/word/2010/wordml" xmlns:w15="http://schemas.microsoft.com/office/word/2012/wordml" xmlns:w16cex="http://schemas.microsoft.com/office/word/2018/wordml/cex" xmlns:w16cid="http://schemas.microsoft.com/office/word/2016/wordml/cid" xmlns:w16="http://schemas.microsoft.com/office/word/2018/wordml" xmlns:w16du="http://schemas.microsoft.com/office/word/2023/wordml/word16du" xmlns:w16sdtdh="http://schemas.microsoft.com/office/word/2020/wordml/sdtdatahash" xmlns:w16sdtfl="http://schemas.microsoft.com/office/word/2024/wordml/sdtformatlock" xmlns:w16se="http://schemas.microsoft.com/office/word/2015/wordml/symex" xmlns:wpg="http://schemas.microsoft.com/office/word/2010/wordprocessingGroup" xmlns:wpi="http://schemas.microsoft.com/office/word/2010/wordprocessingInk" xmlns:wne="http://schemas.microsoft.com/office/word/2006/wordml" xmlns:wps="http://schemas.microsoft.com/office/word/2010/wordprocessingShape" mc:Ignorable="w14 w15 w16se w16cid w16 w16cex w16sdtdh w16sdtfl w16du wp14">
+<w:document xmlns:wpc="http://schemas.microsoft.com/office/word/2010/wordprocessingCanvas" xmlns:cx="http://schemas.microsoft.com/office/drawing/2014/chartex" xmlns:cx1="http://schemas.microsoft.com/office/drawing/2015/9/8/chartex" xmlns:cx2="http://schemas.microsoft.com/office/drawing/2015/10/21/chartex" xmlns:cx3="http://schemas.microsoft.com/office/drawing/2016/5/9/chartex" xmlns:cx4="http://schemas.microsoft.com/office/drawing/2016/5/10/chartex" xmlns:cx5="http://schemas.microsoft.com/office/drawing/2016/5/11/chartex" xmlns:cx6="http://schemas.microsoft.com/office/drawing/2016/5/12/chartex" xmlns:cx7="http://schemas.microsoft.com/office/drawing/2016/5/13/chartex" xmlns:cx8="http://schemas.microsoft.com/office/drawing/2016/5/14/chartex" xmlns:mc="http://schemas.openxmlformats.org/markup-compatibility/2006" xmlns:m="http://schemas.openxmlformats.org/officeDocument/2006/math" xmlns:aink="http://schemas.microsoft.com/office/drawing/2016/ink" xmlns:am3d="http://schemas.microsoft.com/office/drawing/2017/model3d" xmlns:oel="http://schemas.microsoft.com/office/2019/extlst" xmlns:r="http://schemas.openxmlformats.org/officeDocument/2006/relationships" xmlns:wp14="http://schemas.microsoft.com/office/word/2010/wordprocessingDrawing" xmlns:wp="http://schemas.openxmlformats.org/drawingml/2006/wordprocessingDrawing" xmlns:wpg="http://schemas.microsoft.com/office/word/2010/wordprocessingGroup" xmlns:wpi="http://schemas.microsoft.com/office/word/2010/wordprocessingInk" xmlns:wps="http://schemas.microsoft.com/office/word/2010/wordprocessingShape" xmlns:o="urn:schemas-microsoft-com:office:office" xmlns:v="urn:schemas-microsoft-com:vml" xmlns:w10="urn:schemas-microsoft-com:office:word" xmlns:w="http://schemas.openxmlformats.org/wordprocessingml/2006/main" xmlns:w14="http://schemas.microsoft.com/office/word/2010/wordml" xmlns:w15="http://schemas.microsoft.com/office/word/2012/wordml" xmlns:w16cex="http://schemas.microsoft.com/office/word/2018/wordml/cex" xmlns:w16cid="http://schemas.microsoft.com/office/word/2016/wordml/cid" xmlns:w16="http://schemas.microsoft.com/office/word/2018/wordml" xmlns:w16sdtdh="http://schemas.microsoft.com/office/word/2020/wordml/sdtdatahash" xmlns:w16sdtfl="http://schemas.microsoft.com/office/word/2024/wordml/sdtformatlock" xmlns:w16se="http://schemas.microsoft.com/office/word/2015/wordml/symex" xmlns:w16du="http://schemas.microsoft.com/office/word/2023/wordml/word16du" xmlns:wne="http://schemas.microsoft.com/office/word/2006/wordml" mc:Ignorable="w14 w15 w16se w16cid w16 w16cex w16sdtdh w16sdtfl w16du wp14">
   <w:body>
     <w:p>
       <w:pPr>
@@ -224,7 +224,6 @@
             <w:pPr>
               <w:spacing w:after="0"/>
             </w:pPr>
-            <w:proofErr w:type="gramStart"/>
             <w:r>
               <w:rPr>
                 <w:color w:val="0F172A"/>
@@ -239,13 +238,26 @@
               </w:rPr>
               <w:t>September</w:t>
             </w:r>
-            <w:proofErr w:type="gramEnd"/>
             <w:r>
               <w:rPr>
                 <w:color w:val="0F172A"/>
                 <w:sz w:val="19"/>
               </w:rPr>
-              <w:t xml:space="preserve"> DD, </w:t>
+              <w:t xml:space="preserve"> </w:t>
+            </w:r>
+            <w:r>
+              <w:rPr>
+                <w:color w:val="0F172A"/>
+                <w:sz w:val="19"/>
+              </w:rPr>
+              <w:t>6</w:t>
+            </w:r>
+            <w:r>
+              <w:rPr>
+                <w:color w:val="0F172A"/>
+                <w:sz w:val="19"/>
+              </w:rPr>
+              <w:t xml:space="preserve">, </w:t>
             </w:r>
             <w:proofErr w:type="gramStart"/>
             <w:r>
@@ -472,21 +484,35 @@
             <w:pPr>
               <w:spacing w:after="0"/>
             </w:pPr>
-            <w:proofErr w:type="gramStart"/>
             <w:r>
               <w:rPr>
                 <w:b/>
                 <w:sz w:val="18"/>
               </w:rPr>
-              <w:t>[ Lead</w:t>
+              <w:t xml:space="preserve">[ </w:t>
             </w:r>
-            <w:proofErr w:type="gramEnd"/>
             <w:r>
               <w:rPr>
                 <w:b/>
                 <w:sz w:val="18"/>
               </w:rPr>
-              <w:t xml:space="preserve"> Student </w:t>
+              <w:t xml:space="preserve">Sta. Ana, </w:t>
+            </w:r>
+            <w:proofErr w:type="spellStart"/>
+            <w:r>
+              <w:rPr>
+                <w:b/>
+                <w:sz w:val="18"/>
+              </w:rPr>
+              <w:t>Gelorenz</w:t>
+            </w:r>
+            <w:proofErr w:type="spellEnd"/>
+            <w:r>
+              <w:rPr>
+                <w:b/>
+                <w:sz w:val="18"/>
+              </w:rPr>
+              <w:t xml:space="preserve"> </w:t>
             </w:r>
             <w:proofErr w:type="gramStart"/>
             <w:r>
@@ -494,7 +520,14 @@
                 <w:b/>
                 <w:sz w:val="18"/>
               </w:rPr>
-              <w:t>Name ]</w:t>
+              <w:t>D.</w:t>
+            </w:r>
+            <w:r>
+              <w:rPr>
+                <w:b/>
+                <w:sz w:val="18"/>
+              </w:rPr>
+              <w:t xml:space="preserve"> ]</w:t>
             </w:r>
             <w:proofErr w:type="gramEnd"/>
           </w:p>
@@ -607,7 +640,6 @@
             <w:pPr>
               <w:spacing w:after="0"/>
             </w:pPr>
-            <w:proofErr w:type="gramStart"/>
             <w:r>
               <w:rPr>
                 <w:b/>
@@ -620,15 +652,14 @@
                 <w:b/>
                 <w:sz w:val="18"/>
               </w:rPr>
-              <w:t>Renz</w:t>
+              <w:t xml:space="preserve">Priela, </w:t>
             </w:r>
-            <w:proofErr w:type="gramEnd"/>
             <w:r>
               <w:rPr>
                 <w:b/>
                 <w:sz w:val="18"/>
               </w:rPr>
-              <w:t xml:space="preserve"> Angelo S. </w:t>
+              <w:t xml:space="preserve">Renz Angelo </w:t>
             </w:r>
             <w:proofErr w:type="gramStart"/>
             <w:r>
@@ -636,7 +667,7 @@
                 <w:b/>
                 <w:sz w:val="18"/>
               </w:rPr>
-              <w:t>Priela</w:t>
+              <w:t>S.</w:t>
             </w:r>
             <w:r>
               <w:rPr>
@@ -756,7 +787,6 @@
             <w:pPr>
               <w:spacing w:after="0"/>
             </w:pPr>
-            <w:proofErr w:type="gramStart"/>
             <w:r>
               <w:rPr>
                 <w:b/>
@@ -764,6 +794,7 @@
               </w:rPr>
               <w:t xml:space="preserve">[ </w:t>
             </w:r>
+            <w:proofErr w:type="spellStart"/>
             <w:r>
               <w:rPr>
                 <w:b/>
@@ -771,7 +802,14 @@
               </w:rPr>
               <w:t>Ubante</w:t>
             </w:r>
-            <w:proofErr w:type="gramEnd"/>
+            <w:proofErr w:type="spellEnd"/>
+            <w:r>
+              <w:rPr>
+                <w:b/>
+                <w:sz w:val="18"/>
+              </w:rPr>
+              <w:t>,</w:t>
+            </w:r>
             <w:r>
               <w:rPr>
                 <w:b/>
@@ -835,7 +873,6 @@
             <w:pPr>
               <w:spacing w:after="0"/>
             </w:pPr>
-            <w:proofErr w:type="gramStart"/>
             <w:r>
               <w:rPr>
                 <w:sz w:val="18"/>
@@ -846,14 +883,7 @@
               <w:rPr>
                 <w:sz w:val="18"/>
               </w:rPr>
-              <w:t>JM</w:t>
-            </w:r>
-            <w:proofErr w:type="gramEnd"/>
-            <w:r>
-              <w:rPr>
-                <w:sz w:val="18"/>
-              </w:rPr>
-              <w:t>-Ubante</w:t>
+              <w:t>JM-Ubante</w:t>
             </w:r>
           </w:p>
         </w:tc>
@@ -1030,42 +1060,6 @@
               <w:spacing w:before="240" w:after="80"/>
               <w:jc w:val="center"/>
             </w:pPr>
-            <w:proofErr w:type="gramStart"/>
-            <w:r>
-              <w:rPr>
-                <w:b/>
-                <w:color w:val="475569"/>
-                <w:sz w:val="22"/>
-              </w:rPr>
-              <w:t>[ PASTE</w:t>
-            </w:r>
-            <w:proofErr w:type="gramEnd"/>
-            <w:r>
-              <w:rPr>
-                <w:b/>
-                <w:color w:val="475569"/>
-                <w:sz w:val="22"/>
-              </w:rPr>
-              <w:t xml:space="preserve"> / INSERT SCREENSHOT IMAGE </w:t>
-            </w:r>
-            <w:proofErr w:type="gramStart"/>
-            <w:r>
-              <w:rPr>
-                <w:b/>
-                <w:color w:val="475569"/>
-                <w:sz w:val="22"/>
-              </w:rPr>
-              <w:t>HERE ]</w:t>
-            </w:r>
-            <w:proofErr w:type="gramEnd"/>
-            <w:r>
-              <w:rPr>
-                <w:b/>
-                <w:color w:val="475569"/>
-                <w:sz w:val="22"/>
-              </w:rPr>
-              <w:br/>
-            </w:r>
             <w:r>
               <w:rPr>
                 <w:i/>
@@ -1121,8 +1115,13 @@
       </w:r>
       <w:proofErr w:type="gramStart"/>
       <w:r>
-        <w:t>and .gitignore</w:t>
+        <w:t>and .</w:t>
       </w:r>
+      <w:proofErr w:type="spellStart"/>
+      <w:r>
+        <w:t>gitignore</w:t>
+      </w:r>
+      <w:proofErr w:type="spellEnd"/>
       <w:proofErr w:type="gramEnd"/>
       <w:r>
         <w:t xml:space="preserve"> hygiene.</w:t>
@@ -1178,9 +1177,9 @@
               </w:rPr>
               <w:lastRenderedPageBreak/>
               <w:drawing>
-                <wp:inline distT="0" distB="0" distL="0" distR="0" wp14:anchorId="3C0561CB" wp14:editId="596FF887">
-                  <wp:extent cx="5689600" cy="3200400"/>
-                  <wp:effectExtent l="0" t="0" r="6350" b="0"/>
+                <wp:inline distT="0" distB="0" distL="0" distR="0" wp14:anchorId="3C0561CB" wp14:editId="52AC2930">
+                  <wp:extent cx="4313817" cy="2426522"/>
+                  <wp:effectExtent l="0" t="0" r="4445" b="0"/>
                   <wp:docPr id="250099404" name="Picture 2"/>
                   <wp:cNvGraphicFramePr>
                     <a:graphicFrameLocks xmlns:a="http://schemas.openxmlformats.org/drawingml/2006/main" noChangeAspect="1"/>
@@ -1201,7 +1200,7 @@
                         <pic:spPr>
                           <a:xfrm>
                             <a:off x="0" y="0"/>
-                            <a:ext cx="5689600" cy="3200400"/>
+                            <a:ext cx="4340372" cy="2441459"/>
                           </a:xfrm>
                           <a:prstGeom prst="rect">
                             <a:avLst/>
@@ -1290,11 +1289,10 @@
               <w:rPr>
                 <w:noProof/>
               </w:rPr>
-              <w:lastRenderedPageBreak/>
               <w:drawing>
-                <wp:inline distT="0" distB="0" distL="0" distR="0" wp14:anchorId="69115B48" wp14:editId="1F311EF8">
-                  <wp:extent cx="5689600" cy="3616325"/>
-                  <wp:effectExtent l="0" t="0" r="6350" b="3175"/>
+                <wp:inline distT="0" distB="0" distL="0" distR="0" wp14:anchorId="69115B48" wp14:editId="174133E5">
+                  <wp:extent cx="4303059" cy="2735036"/>
+                  <wp:effectExtent l="0" t="0" r="2540" b="0"/>
                   <wp:docPr id="1722436769" name="Picture 1"/>
                   <wp:cNvGraphicFramePr>
                     <a:graphicFrameLocks xmlns:a="http://schemas.openxmlformats.org/drawingml/2006/main" noChangeAspect="1"/>
@@ -1324,7 +1322,7 @@
                         <pic:spPr bwMode="auto">
                           <a:xfrm>
                             <a:off x="0" y="0"/>
-                            <a:ext cx="5689600" cy="3616325"/>
+                            <a:ext cx="4310848" cy="2739986"/>
                           </a:xfrm>
                           <a:prstGeom prst="rect">
                             <a:avLst/>
@@ -1340,36 +1338,12 @@
                 </wp:inline>
               </w:drawing>
             </w:r>
-          </w:p>
-          <w:p>
-            <w:pPr>
-              <w:spacing w:before="240" w:after="80"/>
-              <w:jc w:val="center"/>
-            </w:pPr>
             <w:r>
               <w:rPr>
                 <w:b/>
                 <w:color w:val="475569"/>
                 <w:sz w:val="22"/>
               </w:rPr>
-              <w:t xml:space="preserve">[PASTE / INSERT SCREENSHOT IMAGE </w:t>
-            </w:r>
-            <w:proofErr w:type="gramStart"/>
-            <w:r>
-              <w:rPr>
-                <w:b/>
-                <w:color w:val="475569"/>
-                <w:sz w:val="22"/>
-              </w:rPr>
-              <w:t>HERE ]</w:t>
-            </w:r>
-            <w:proofErr w:type="gramEnd"/>
-            <w:r>
-              <w:rPr>
-                <w:b/>
-                <w:color w:val="475569"/>
-                <w:sz w:val="22"/>
-              </w:rPr>
               <w:br/>
             </w:r>
             <w:r>
@@ -1378,6 +1352,7 @@
                 <w:color w:val="64748B"/>
                 <w:sz w:val="19"/>
               </w:rPr>
+              <w:lastRenderedPageBreak/>
               <w:t>Reference: Pre-flight Environment Diagnostics Audit (verify_setup.py)</w:t>
             </w:r>
             <w:r>
@@ -1491,11 +1466,10 @@
                 <w:color w:val="475569"/>
                 <w:sz w:val="22"/>
               </w:rPr>
-              <w:lastRenderedPageBreak/>
               <w:drawing>
-                <wp:inline distT="0" distB="0" distL="0" distR="0" wp14:anchorId="4D5674C2" wp14:editId="0D14F980">
-                  <wp:extent cx="4550735" cy="2559788"/>
-                  <wp:effectExtent l="0" t="0" r="0" b="5715"/>
+                <wp:inline distT="0" distB="0" distL="0" distR="0" wp14:anchorId="4D5674C2" wp14:editId="78765829">
+                  <wp:extent cx="4895443" cy="1761067"/>
+                  <wp:effectExtent l="0" t="0" r="0" b="4445"/>
                   <wp:docPr id="394996854" name="Picture 3"/>
                   <wp:cNvGraphicFramePr>
                     <a:graphicFrameLocks xmlns:a="http://schemas.openxmlformats.org/drawingml/2006/main" noChangeAspect="1"/>
@@ -1507,20 +1481,29 @@
                           <pic:cNvPr id="394996854" name="Picture 394996854"/>
                           <pic:cNvPicPr/>
                         </pic:nvPicPr>
-                        <pic:blipFill>
+                        <pic:blipFill rotWithShape="1">
                           <a:blip r:embed="rId12"/>
+                          <a:srcRect l="11662" b="43505"/>
                           <a:stretch>
                             <a:fillRect/>
                           </a:stretch>
                         </pic:blipFill>
-                        <pic:spPr>
+                        <pic:spPr bwMode="auto">
                           <a:xfrm>
                             <a:off x="0" y="0"/>
-                            <a:ext cx="4575751" cy="2573859"/>
+                            <a:ext cx="4995851" cy="1797187"/>
                           </a:xfrm>
                           <a:prstGeom prst="rect">
                             <a:avLst/>
                           </a:prstGeom>
+                          <a:ln>
+                            <a:noFill/>
+                          </a:ln>
+                          <a:extLst>
+                            <a:ext uri="{53640926-AAD7-44D8-BBD7-CCE9431645EC}">
+                              <a14:shadowObscured xmlns:a14="http://schemas.microsoft.com/office/drawing/2010/main"/>
+                            </a:ext>
+                          </a:extLst>
                         </pic:spPr>
                       </pic:pic>
                     </a:graphicData>
@@ -1598,9 +1581,9 @@
                 <w:noProof/>
               </w:rPr>
               <w:drawing>
-                <wp:inline distT="0" distB="0" distL="0" distR="0" wp14:anchorId="492A2F46" wp14:editId="4FECF474">
-                  <wp:extent cx="5689600" cy="1189990"/>
-                  <wp:effectExtent l="0" t="0" r="6350" b="0"/>
+                <wp:inline distT="0" distB="0" distL="0" distR="0" wp14:anchorId="492A2F46" wp14:editId="7FAE7BED">
+                  <wp:extent cx="5346550" cy="1118240"/>
+                  <wp:effectExtent l="0" t="0" r="635" b="0"/>
                   <wp:docPr id="46181251" name="Picture 2"/>
                   <wp:cNvGraphicFramePr>
                     <a:graphicFrameLocks xmlns:a="http://schemas.openxmlformats.org/drawingml/2006/main" noChangeAspect="1"/>
@@ -1630,7 +1613,7 @@
                         <pic:spPr bwMode="auto">
                           <a:xfrm>
                             <a:off x="0" y="0"/>
-                            <a:ext cx="5689600" cy="1189990"/>
+                            <a:ext cx="5368502" cy="1122831"/>
                           </a:xfrm>
                           <a:prstGeom prst="rect">
                             <a:avLst/>
@@ -1646,35 +1629,19 @@
                 </wp:inline>
               </w:drawing>
             </w:r>
-          </w:p>
-          <w:p>
-            <w:pPr>
-              <w:spacing w:before="240" w:after="80"/>
-              <w:jc w:val="center"/>
-            </w:pPr>
             <w:r>
               <w:rPr>
                 <w:b/>
                 <w:color w:val="475569"/>
                 <w:sz w:val="22"/>
               </w:rPr>
-              <w:t xml:space="preserve">[ PASTE / INSERT SCREENSHOT IMAGE </w:t>
+              <w:br/>
             </w:r>
-            <w:proofErr w:type="gramStart"/>
             <w:r>
               <w:rPr>
-                <w:b/>
-                <w:color w:val="475569"/>
-                <w:sz w:val="22"/>
-              </w:rPr>
-              <w:t>HERE ]</w:t>
-            </w:r>
-            <w:proofErr w:type="gramEnd"/>
-            <w:r>
-              <w:rPr>
-                <w:b/>
-                <w:color w:val="475569"/>
-                <w:sz w:val="22"/>
+                <w:i/>
+                <w:color w:val="64748B"/>
+                <w:sz w:val="19"/>
               </w:rPr>
               <w:br/>
             </w:r>
@@ -1741,8 +1708,17 @@
           <w:b/>
           <w:sz w:val="19"/>
         </w:rPr>
-        <w:t>&amp; .gitignore</w:t>
+        <w:t>&amp; .</w:t>
       </w:r>
+      <w:proofErr w:type="spellStart"/>
+      <w:r>
+        <w:rPr>
+          <w:b/>
+          <w:sz w:val="19"/>
+        </w:rPr>
+        <w:t>gitignore</w:t>
+      </w:r>
+      <w:proofErr w:type="spellEnd"/>
       <w:proofErr w:type="gramEnd"/>
       <w:r>
         <w:rPr>
@@ -1750,11 +1726,6 @@
           <w:sz w:val="19"/>
         </w:rPr>
         <w:t xml:space="preserve"> Hygiene Proof</w:t>
-      </w:r>
-    </w:p>
-    <w:p>
-      <w:r>
-        <w:br w:type="page"/>
       </w:r>
     </w:p>
     <w:p>
@@ -1821,7 +1792,7 @@
                 <w:sz w:val="22"/>
               </w:rPr>
               <w:drawing>
-                <wp:inline distT="0" distB="0" distL="0" distR="0" wp14:anchorId="2C45AEB8" wp14:editId="12426114">
+                <wp:inline distT="0" distB="0" distL="0" distR="0" wp14:anchorId="2C45AEB8" wp14:editId="386E895F">
                   <wp:extent cx="5689600" cy="3200400"/>
                   <wp:effectExtent l="0" t="0" r="6350" b="0"/>
                   <wp:docPr id="860300565" name="Picture 5"/>
@@ -1927,9 +1898,9 @@
               </w:rPr>
               <w:lastRenderedPageBreak/>
               <w:drawing>
-                <wp:inline distT="0" distB="0" distL="0" distR="0" wp14:anchorId="7DCF1DC7" wp14:editId="240C0B1A">
-                  <wp:extent cx="3361038" cy="4129033"/>
-                  <wp:effectExtent l="0" t="0" r="0" b="5080"/>
+                <wp:inline distT="0" distB="0" distL="0" distR="0" wp14:anchorId="7DCF1DC7" wp14:editId="2A3F5582">
+                  <wp:extent cx="2269067" cy="2787547"/>
+                  <wp:effectExtent l="0" t="0" r="4445" b="0"/>
                   <wp:docPr id="1787917941" name="Picture 3"/>
                   <wp:cNvGraphicFramePr>
                     <a:graphicFrameLocks xmlns:a="http://schemas.openxmlformats.org/drawingml/2006/main" noChangeAspect="1"/>
@@ -1959,7 +1930,7 @@
                         <pic:spPr bwMode="auto">
                           <a:xfrm>
                             <a:off x="0" y="0"/>
-                            <a:ext cx="3371353" cy="4141705"/>
+                            <a:ext cx="2287947" cy="2810741"/>
                           </a:xfrm>
                           <a:prstGeom prst="rect">
                             <a:avLst/>
@@ -1975,30 +1946,6 @@
                 </wp:inline>
               </w:drawing>
             </w:r>
-          </w:p>
-          <w:p>
-            <w:pPr>
-              <w:spacing w:before="240" w:after="80"/>
-              <w:jc w:val="center"/>
-            </w:pPr>
-            <w:r>
-              <w:rPr>
-                <w:b/>
-                <w:color w:val="475569"/>
-                <w:sz w:val="22"/>
-              </w:rPr>
-              <w:t xml:space="preserve">[ PASTE / INSERT SCREENSHOT IMAGE </w:t>
-            </w:r>
-            <w:proofErr w:type="gramStart"/>
-            <w:r>
-              <w:rPr>
-                <w:b/>
-                <w:color w:val="475569"/>
-                <w:sz w:val="22"/>
-              </w:rPr>
-              <w:t>HERE ]</w:t>
-            </w:r>
-            <w:proofErr w:type="gramEnd"/>
             <w:r>
               <w:rPr>
                 <w:b/>
@@ -2044,7 +1991,6 @@
           <w:b/>
           <w:sz w:val="19"/>
         </w:rPr>
-        <w:lastRenderedPageBreak/>
         <w:t>Figure 4: Application Initial Launch State</w:t>
       </w:r>
     </w:p>
@@ -2096,7 +2042,6 @@
                 <w:color w:val="475569"/>
                 <w:sz w:val="22"/>
               </w:rPr>
-              <w:lastRenderedPageBreak/>
               <w:drawing>
                 <wp:inline distT="0" distB="0" distL="0" distR="0" wp14:anchorId="08CDB028" wp14:editId="6257D68E">
                   <wp:extent cx="4139609" cy="2328530"/>
@@ -2151,6 +2096,7 @@
                 <w:color w:val="475569"/>
                 <w:sz w:val="22"/>
               </w:rPr>
+              <w:lastRenderedPageBreak/>
               <w:drawing>
                 <wp:inline distT="0" distB="0" distL="0" distR="0" wp14:anchorId="7F7048EC" wp14:editId="2121FBE4">
                   <wp:extent cx="1945758" cy="2406572"/>
@@ -2202,7 +2148,6 @@
               <w:rPr>
                 <w:noProof/>
               </w:rPr>
-              <w:lastRenderedPageBreak/>
               <w:drawing>
                 <wp:inline distT="0" distB="0" distL="0" distR="0" wp14:anchorId="46FFD7C5" wp14:editId="318F682F">
                   <wp:extent cx="2660821" cy="3274904"/>
@@ -2264,24 +2209,6 @@
                 <w:color w:val="475569"/>
                 <w:sz w:val="22"/>
               </w:rPr>
-              <w:t xml:space="preserve">[ PASTE / INSERT SCREENSHOT IMAGE </w:t>
-            </w:r>
-            <w:proofErr w:type="gramStart"/>
-            <w:r>
-              <w:rPr>
-                <w:b/>
-                <w:color w:val="475569"/>
-                <w:sz w:val="22"/>
-              </w:rPr>
-              <w:t>HERE ]</w:t>
-            </w:r>
-            <w:proofErr w:type="gramEnd"/>
-            <w:r>
-              <w:rPr>
-                <w:b/>
-                <w:color w:val="475569"/>
-                <w:sz w:val="22"/>
-              </w:rPr>
               <w:br/>
             </w:r>
             <w:r>
@@ -2321,7 +2248,6 @@
           <w:b/>
           <w:sz w:val="19"/>
         </w:rPr>
-        <w:lastRenderedPageBreak/>
         <w:t>Figure 5: Sprint Goal Milestone Reached State</w:t>
       </w:r>
     </w:p>
@@ -2373,6 +2299,7 @@
                 <w:color w:val="475569"/>
                 <w:sz w:val="22"/>
               </w:rPr>
+              <w:lastRenderedPageBreak/>
               <w:drawing>
                 <wp:inline distT="0" distB="0" distL="0" distR="0" wp14:anchorId="31BAE28A" wp14:editId="5F24C618">
                   <wp:extent cx="3987209" cy="2242805"/>
@@ -2427,7 +2354,6 @@
                 <w:color w:val="475569"/>
                 <w:sz w:val="22"/>
               </w:rPr>
-              <w:lastRenderedPageBreak/>
               <w:drawing>
                 <wp:inline distT="0" distB="0" distL="0" distR="0" wp14:anchorId="619B0E1F" wp14:editId="03070B03">
                   <wp:extent cx="2073349" cy="2549802"/>
@@ -2479,6 +2405,7 @@
               <w:rPr>
                 <w:noProof/>
               </w:rPr>
+              <w:lastRenderedPageBreak/>
               <w:drawing>
                 <wp:inline distT="0" distB="0" distL="0" distR="0" wp14:anchorId="2AA8444E" wp14:editId="3E7A4E84">
                   <wp:extent cx="3389560" cy="4217773"/>
@@ -2581,15 +2508,7 @@
                 <w:color w:val="94A3B8"/>
                 <w:sz w:val="18"/>
               </w:rPr>
-              <w:t xml:space="preserve">Requirement: Window with Dark Mode toggle active, demonstrating reactive Material 3 dark surface container </w:t>
-            </w:r>
-            <w:r>
-              <w:rPr>
-                <w:color w:val="94A3B8"/>
-                <w:sz w:val="18"/>
-              </w:rPr>
-              <w:lastRenderedPageBreak/>
-              <w:t>rendering.</w:t>
+              <w:t>Requirement: Window with Dark Mode toggle active, demonstrating reactive Material 3 dark surface container rendering.</w:t>
             </w:r>
           </w:p>
         </w:tc>
@@ -2605,7 +2524,6 @@
           <w:b/>
           <w:sz w:val="19"/>
         </w:rPr>
-        <w:lastRenderedPageBreak/>
         <w:t>Figure 6: Material 3 Dark Mode Theme Toggle State</w:t>
       </w:r>
     </w:p>
@@ -2797,29 +2715,29 @@
             <w:pPr>
               <w:spacing w:after="0"/>
             </w:pPr>
+            <w:r>
+              <w:rPr>
+                <w:b/>
+                <w:sz w:val="17"/>
+              </w:rPr>
+              <w:t xml:space="preserve">[ </w:t>
+            </w:r>
+            <w:proofErr w:type="spellStart"/>
             <w:proofErr w:type="gramStart"/>
             <w:r>
               <w:rPr>
                 <w:b/>
                 <w:sz w:val="17"/>
               </w:rPr>
-              <w:t>[ Student</w:t>
+              <w:t>Gelorenz</w:t>
             </w:r>
-            <w:proofErr w:type="gramEnd"/>
+            <w:proofErr w:type="spellEnd"/>
             <w:r>
               <w:rPr>
                 <w:b/>
                 <w:sz w:val="17"/>
               </w:rPr>
-              <w:t xml:space="preserve"> </w:t>
-            </w:r>
-            <w:proofErr w:type="gramStart"/>
-            <w:r>
-              <w:rPr>
-                <w:b/>
-                <w:sz w:val="17"/>
-              </w:rPr>
-              <w:t>1 ]</w:t>
+              <w:t xml:space="preserve"> ]</w:t>
             </w:r>
             <w:proofErr w:type="gramEnd"/>
           </w:p>
@@ -3106,7 +3024,14 @@
                 <w:b/>
                 <w:sz w:val="17"/>
               </w:rPr>
-              <w:t xml:space="preserve">[ Student </w:t>
+              <w:t xml:space="preserve">[ </w:t>
+            </w:r>
+            <w:r>
+              <w:rPr>
+                <w:b/>
+                <w:sz w:val="17"/>
+              </w:rPr>
+              <w:t xml:space="preserve">Jay </w:t>
             </w:r>
             <w:proofErr w:type="gramStart"/>
             <w:r>
@@ -3114,7 +3039,14 @@
                 <w:b/>
                 <w:sz w:val="17"/>
               </w:rPr>
-              <w:t>3 ]</w:t>
+              <w:t>Marion</w:t>
+            </w:r>
+            <w:r>
+              <w:rPr>
+                <w:b/>
+                <w:sz w:val="17"/>
+              </w:rPr>
+              <w:t xml:space="preserve"> ]</w:t>
             </w:r>
             <w:proofErr w:type="gramEnd"/>
           </w:p>
@@ -3447,33 +3379,7 @@
           <w:color w:val="64748B"/>
           <w:sz w:val="19"/>
         </w:rPr>
-        <w:t xml:space="preserve">I learned how feature branching allows me to work on assigned changes without directly affecting the team's main branch. I also learned the importance of synchronizing with the latest main branch before merging to ensure that my work was based on the team's most recent version. Testing the task counter and reaching the 5/5 sprint goal helped me understand how application state and boundary conditions control the behavior of a feature. I also tested </w:t>
-      </w:r>
-      <w:proofErr w:type="gramStart"/>
-      <w:r>
-        <w:rPr>
-          <w:i/>
-          <w:color w:val="64748B"/>
-          <w:sz w:val="19"/>
-        </w:rPr>
-        <w:t>the Material</w:t>
-      </w:r>
-      <w:proofErr w:type="gramEnd"/>
-      <w:r>
-        <w:rPr>
-          <w:i/>
-          <w:color w:val="64748B"/>
-          <w:sz w:val="19"/>
-        </w:rPr>
-        <w:t xml:space="preserve"> 3 dark mode and verified that the interface responded correctly to the theme change.</w:t>
-      </w:r>
-      <w:r>
-        <w:rPr>
-          <w:i/>
-          <w:color w:val="64748B"/>
-          <w:sz w:val="19"/>
-        </w:rPr>
-        <w:t xml:space="preserve"> </w:t>
+        <w:t xml:space="preserve">I learned how feature branching allows me to work on assigned changes without directly affecting the team's main branch. I also learned the importance of synchronizing with the latest main branch before merging to ensure that my work was based on the team's most recent version. Testing the task counter and reaching the 5/5 sprint goal helped me understand how application state and boundary conditions control the behavior of a feature. I also tested the Material 3 dark mode and verified that the interface responded correctly to the theme change. </w:t>
       </w:r>
       <w:r>
         <w:br w:type="page"/>
@@ -3522,139 +3428,304 @@
           <w:p>
             <w:pPr>
               <w:spacing w:after="0"/>
-            </w:pPr>
-            <w:r>
               <w:rPr>
                 <w:rFonts w:ascii="Courier New" w:hAnsi="Courier New"/>
                 <w:color w:val="E2E8F0"/>
                 <w:sz w:val="17"/>
               </w:rPr>
-              <w:t>*   9f8a123 (HEAD -&gt; main, origin/main) feat(milestone): integrate developer 3 profile and sprint goal milestone badge</w:t>
-            </w:r>
+            </w:pPr>
             <w:r>
               <w:rPr>
                 <w:rFonts w:ascii="Courier New" w:hAnsi="Courier New"/>
                 <w:color w:val="E2E8F0"/>
                 <w:sz w:val="17"/>
               </w:rPr>
-              <w:br/>
-              <w:t xml:space="preserve">|\  </w:t>
+              <w:t>* 6a2175e docs(report): complete report screenshots and developer 3 details</w:t>
             </w:r>
-            <w:r>
+          </w:p>
+          <w:p>
+            <w:pPr>
+              <w:spacing w:after="0"/>
               <w:rPr>
                 <w:rFonts w:ascii="Courier New" w:hAnsi="Courier New"/>
                 <w:color w:val="E2E8F0"/>
                 <w:sz w:val="17"/>
               </w:rPr>
-              <w:br/>
-              <w:t>| * 8e7b456 (feature/dev3-features) feat(milestone): integrate developer 3 profile and sprint goal milestone badge</w:t>
-            </w:r>
+            </w:pPr>
             <w:r>
               <w:rPr>
                 <w:rFonts w:ascii="Courier New" w:hAnsi="Courier New"/>
                 <w:color w:val="E2E8F0"/>
                 <w:sz w:val="17"/>
               </w:rPr>
-              <w:br/>
-              <w:t xml:space="preserve">|/  </w:t>
+              <w:t xml:space="preserve">* d49d4ad </w:t>
             </w:r>
+            <w:proofErr w:type="gramStart"/>
             <w:r>
               <w:rPr>
                 <w:rFonts w:ascii="Courier New" w:hAnsi="Courier New"/>
                 <w:color w:val="E2E8F0"/>
                 <w:sz w:val="17"/>
               </w:rPr>
-              <w:br/>
-              <w:t>*   7d6c789 feat(state): integrate developer 2 profile and task counter handlers</w:t>
+              <w:t>docs[</w:t>
             </w:r>
+            <w:proofErr w:type="spellStart"/>
+            <w:proofErr w:type="gramEnd"/>
             <w:r>
               <w:rPr>
                 <w:rFonts w:ascii="Courier New" w:hAnsi="Courier New"/>
                 <w:color w:val="E2E8F0"/>
                 <w:sz w:val="17"/>
               </w:rPr>
-              <w:br/>
-              <w:t xml:space="preserve">|\  </w:t>
+              <w:t>Lab_Report</w:t>
             </w:r>
+            <w:proofErr w:type="spellEnd"/>
             <w:r>
               <w:rPr>
                 <w:rFonts w:ascii="Courier New" w:hAnsi="Courier New"/>
                 <w:color w:val="E2E8F0"/>
                 <w:sz w:val="17"/>
               </w:rPr>
-              <w:br/>
-              <w:t>| * 6c5d012 (feature/dev2-state) feat(state): integrate developer 2 profile and task counter handlers</w:t>
+              <w:t>]: Added new Screenshot, and minor fixes.</w:t>
             </w:r>
-            <w:r>
+          </w:p>
+          <w:p>
+            <w:pPr>
+              <w:spacing w:after="0"/>
               <w:rPr>
                 <w:rFonts w:ascii="Courier New" w:hAnsi="Courier New"/>
                 <w:color w:val="E2E8F0"/>
                 <w:sz w:val="17"/>
               </w:rPr>
-              <w:br/>
-              <w:t xml:space="preserve">|/  </w:t>
-            </w:r>
+            </w:pPr>
             <w:r>
               <w:rPr>
                 <w:rFonts w:ascii="Courier New" w:hAnsi="Courier New"/>
                 <w:color w:val="E2E8F0"/>
                 <w:sz w:val="17"/>
               </w:rPr>
-              <w:br/>
-              <w:t>*   5b4e345 feat(profile): integrate developer 1 profile card</w:t>
+              <w:t xml:space="preserve">*   26c22c4 Merge pull request #1 from </w:t>
             </w:r>
+            <w:proofErr w:type="spellStart"/>
             <w:r>
               <w:rPr>
                 <w:rFonts w:ascii="Courier New" w:hAnsi="Courier New"/>
                 <w:color w:val="E2E8F0"/>
                 <w:sz w:val="17"/>
               </w:rPr>
-              <w:br/>
-              <w:t xml:space="preserve">|\  </w:t>
+              <w:t>staanagelorenz</w:t>
             </w:r>
+            <w:proofErr w:type="spellEnd"/>
             <w:r>
               <w:rPr>
                 <w:rFonts w:ascii="Courier New" w:hAnsi="Courier New"/>
                 <w:color w:val="E2E8F0"/>
                 <w:sz w:val="17"/>
               </w:rPr>
-              <w:br/>
-              <w:t>| * 4a3f678 (feature/dev1-profile) feat(profile): integrate developer 1 profile card</w:t>
+              <w:t>-cyber/agents/update-branch-with-latest-changes</w:t>
             </w:r>
-            <w:r>
+          </w:p>
+          <w:p>
+            <w:pPr>
+              <w:spacing w:after="0"/>
               <w:rPr>
                 <w:rFonts w:ascii="Courier New" w:hAnsi="Courier New"/>
                 <w:color w:val="E2E8F0"/>
                 <w:sz w:val="17"/>
               </w:rPr>
-              <w:br/>
-              <w:t xml:space="preserve">|/  </w:t>
-            </w:r>
+            </w:pPr>
             <w:r>
               <w:rPr>
                 <w:rFonts w:ascii="Courier New" w:hAnsi="Courier New"/>
                 <w:color w:val="E2E8F0"/>
                 <w:sz w:val="17"/>
               </w:rPr>
-              <w:br/>
-              <w:t>* 3a2e901 chore(init): baseline repository with modern flet app and verification tool</w:t>
+              <w:t xml:space="preserve">|\  </w:t>
             </w:r>
-            <w:r>
+          </w:p>
+          <w:p>
+            <w:pPr>
+              <w:spacing w:after="0"/>
               <w:rPr>
                 <w:rFonts w:ascii="Courier New" w:hAnsi="Courier New"/>
                 <w:color w:val="E2E8F0"/>
                 <w:sz w:val="17"/>
               </w:rPr>
-              <w:br/>
-            </w:r>
+            </w:pPr>
             <w:r>
               <w:rPr>
                 <w:rFonts w:ascii="Courier New" w:hAnsi="Courier New"/>
                 <w:color w:val="E2E8F0"/>
                 <w:sz w:val="17"/>
               </w:rPr>
-              <w:br/>
-              <w:t>[ REPLACE THE SAMPLE COMMIT LOG ABOVE WITH YOUR GROUP'S ACTUAL git_log_proof.txt OUTPUT ]</w:t>
+              <w:t>| * aa86da1 docs(report): finalize lab report</w:t>
+            </w:r>
+          </w:p>
+          <w:p>
+            <w:pPr>
+              <w:spacing w:after="0"/>
+              <w:rPr>
+                <w:rFonts w:ascii="Courier New" w:hAnsi="Courier New"/>
+                <w:color w:val="E2E8F0"/>
+                <w:sz w:val="17"/>
+              </w:rPr>
+            </w:pPr>
+            <w:r>
+              <w:rPr>
+                <w:rFonts w:ascii="Courier New" w:hAnsi="Courier New"/>
+                <w:color w:val="E2E8F0"/>
+                <w:sz w:val="17"/>
+              </w:rPr>
+              <w:t xml:space="preserve">|/  </w:t>
+            </w:r>
+          </w:p>
+          <w:p>
+            <w:pPr>
+              <w:spacing w:after="0"/>
+              <w:rPr>
+                <w:rFonts w:ascii="Courier New" w:hAnsi="Courier New"/>
+                <w:color w:val="E2E8F0"/>
+                <w:sz w:val="17"/>
+              </w:rPr>
+            </w:pPr>
+            <w:r>
+              <w:rPr>
+                <w:rFonts w:ascii="Courier New" w:hAnsi="Courier New"/>
+                <w:color w:val="E2E8F0"/>
+                <w:sz w:val="17"/>
+              </w:rPr>
+              <w:t>* 8e9ec3e feat(milestone): integrate developer 3 profile and sprint goal milestone badge</w:t>
+            </w:r>
+          </w:p>
+          <w:p>
+            <w:pPr>
+              <w:spacing w:after="0"/>
+              <w:rPr>
+                <w:rFonts w:ascii="Courier New" w:hAnsi="Courier New"/>
+                <w:color w:val="E2E8F0"/>
+                <w:sz w:val="17"/>
+              </w:rPr>
+            </w:pPr>
+            <w:r>
+              <w:rPr>
+                <w:rFonts w:ascii="Courier New" w:hAnsi="Courier New"/>
+                <w:color w:val="E2E8F0"/>
+                <w:sz w:val="17"/>
+              </w:rPr>
+              <w:t xml:space="preserve">* 83478e3 </w:t>
+            </w:r>
+            <w:proofErr w:type="gramStart"/>
+            <w:r>
+              <w:rPr>
+                <w:rFonts w:ascii="Courier New" w:hAnsi="Courier New"/>
+                <w:color w:val="E2E8F0"/>
+                <w:sz w:val="17"/>
+              </w:rPr>
+              <w:t>docs(</w:t>
+            </w:r>
+            <w:proofErr w:type="spellStart"/>
+            <w:proofErr w:type="gramEnd"/>
+            <w:r>
+              <w:rPr>
+                <w:rFonts w:ascii="Courier New" w:hAnsi="Courier New"/>
+                <w:color w:val="E2E8F0"/>
+                <w:sz w:val="17"/>
+              </w:rPr>
+              <w:t>Lab_Report</w:t>
+            </w:r>
+            <w:proofErr w:type="spellEnd"/>
+            <w:r>
+              <w:rPr>
+                <w:rFonts w:ascii="Courier New" w:hAnsi="Courier New"/>
+                <w:color w:val="E2E8F0"/>
+                <w:sz w:val="17"/>
+              </w:rPr>
+              <w:t>): Add SS for Figure [2,5,6]. Answered Dev 2 Reflection</w:t>
+            </w:r>
+          </w:p>
+          <w:p>
+            <w:pPr>
+              <w:spacing w:after="0"/>
+              <w:rPr>
+                <w:rFonts w:ascii="Courier New" w:hAnsi="Courier New"/>
+                <w:color w:val="E2E8F0"/>
+                <w:sz w:val="17"/>
+              </w:rPr>
+            </w:pPr>
+            <w:r>
+              <w:rPr>
+                <w:rFonts w:ascii="Courier New" w:hAnsi="Courier New"/>
+                <w:color w:val="E2E8F0"/>
+                <w:sz w:val="17"/>
+              </w:rPr>
+              <w:t>* 38cc06b feat(state): integrate developer 2 profile and task counter handlers</w:t>
+            </w:r>
+          </w:p>
+          <w:p>
+            <w:pPr>
+              <w:spacing w:after="0"/>
+              <w:rPr>
+                <w:rFonts w:ascii="Courier New" w:hAnsi="Courier New"/>
+                <w:color w:val="E2E8F0"/>
+                <w:sz w:val="17"/>
+              </w:rPr>
+            </w:pPr>
+            <w:r>
+              <w:rPr>
+                <w:rFonts w:ascii="Courier New" w:hAnsi="Courier New"/>
+                <w:color w:val="E2E8F0"/>
+                <w:sz w:val="17"/>
+              </w:rPr>
+              <w:t>* 1f0e7c8 feat(profile): integrate developer 1 profile card</w:t>
+            </w:r>
+          </w:p>
+          <w:p>
+            <w:pPr>
+              <w:spacing w:after="0"/>
+            </w:pPr>
+            <w:r>
+              <w:rPr>
+                <w:rFonts w:ascii="Courier New" w:hAnsi="Courier New"/>
+                <w:color w:val="E2E8F0"/>
+                <w:sz w:val="17"/>
+              </w:rPr>
+              <w:t>* dec4696 chore(</w:t>
+            </w:r>
+            <w:proofErr w:type="spellStart"/>
+            <w:r>
+              <w:rPr>
+                <w:rFonts w:ascii="Courier New" w:hAnsi="Courier New"/>
+                <w:color w:val="E2E8F0"/>
+                <w:sz w:val="17"/>
+              </w:rPr>
+              <w:t>init</w:t>
+            </w:r>
+            <w:proofErr w:type="spellEnd"/>
+            <w:r>
+              <w:rPr>
+                <w:rFonts w:ascii="Courier New" w:hAnsi="Courier New"/>
+                <w:color w:val="E2E8F0"/>
+                <w:sz w:val="17"/>
+              </w:rPr>
+              <w:t xml:space="preserve">): baseline repository with modern </w:t>
+            </w:r>
+            <w:proofErr w:type="spellStart"/>
+            <w:r>
+              <w:rPr>
+                <w:rFonts w:ascii="Courier New" w:hAnsi="Courier New"/>
+                <w:color w:val="E2E8F0"/>
+                <w:sz w:val="17"/>
+              </w:rPr>
+              <w:t>flet</w:t>
+            </w:r>
+            <w:proofErr w:type="spellEnd"/>
+            <w:r>
+              <w:rPr>
+                <w:rFonts w:ascii="Courier New" w:hAnsi="Courier New"/>
+                <w:color w:val="E2E8F0"/>
+                <w:sz w:val="17"/>
+              </w:rPr>
+              <w:t xml:space="preserve"> app and verification tool</w:t>
             </w:r>
           </w:p>
         </w:tc>
@@ -3675,7 +3746,7 @@
 </file>
 
 <file path=word/endnotes.xml><?xml version="1.0" encoding="utf-8"?>
-<w:endnotes xmlns:wpc="http://schemas.microsoft.com/office/word/2010/wordprocessingCanvas" xmlns:cx="http://schemas.microsoft.com/office/drawing/2014/chartex" xmlns:cx1="http://schemas.microsoft.com/office/drawing/2015/9/8/chartex" xmlns:cx2="http://schemas.microsoft.com/office/drawing/2015/10/21/chartex" xmlns:cx3="http://schemas.microsoft.com/office/drawing/2016/5/9/chartex" xmlns:cx4="http://schemas.microsoft.com/office/drawing/2016/5/10/chartex" xmlns:cx5="http://schemas.microsoft.com/office/drawing/2016/5/11/chartex" xmlns:cx6="http://schemas.microsoft.com/office/drawing/2016/5/12/chartex" xmlns:cx7="http://schemas.microsoft.com/office/drawing/2016/5/13/chartex" xmlns:cx8="http://schemas.microsoft.com/office/drawing/2016/5/14/chartex" xmlns:mc="http://schemas.openxmlformats.org/markup-compatibility/2006" xmlns:aink="http://schemas.microsoft.com/office/drawing/2016/ink" xmlns:am3d="http://schemas.microsoft.com/office/drawing/2017/model3d" xmlns:o="urn:schemas-microsoft-com:office:office" xmlns:oel="http://schemas.microsoft.com/office/2019/extlst" xmlns:r="http://schemas.openxmlformats.org/officeDocument/2006/relationships" xmlns:m="http://schemas.openxmlformats.org/officeDocument/2006/math" xmlns:v="urn:schemas-microsoft-com:vml" xmlns:wp14="http://schemas.microsoft.com/office/word/2010/wordprocessingDrawing" xmlns:wp="http://schemas.openxmlformats.org/drawingml/2006/wordprocessingDrawing" xmlns:w10="urn:schemas-microsoft-com:office:word" xmlns:w="http://schemas.openxmlformats.org/wordprocessingml/2006/main" xmlns:w14="http://schemas.microsoft.com/office/word/2010/wordml" xmlns:w15="http://schemas.microsoft.com/office/word/2012/wordml" xmlns:w16cex="http://schemas.microsoft.com/office/word/2018/wordml/cex" xmlns:w16cid="http://schemas.microsoft.com/office/word/2016/wordml/cid" xmlns:w16="http://schemas.microsoft.com/office/word/2018/wordml" xmlns:w16du="http://schemas.microsoft.com/office/word/2023/wordml/word16du" xmlns:w16sdtdh="http://schemas.microsoft.com/office/word/2020/wordml/sdtdatahash" xmlns:w16sdtfl="http://schemas.microsoft.com/office/word/2024/wordml/sdtformatlock" xmlns:w16se="http://schemas.microsoft.com/office/word/2015/wordml/symex" xmlns:wpg="http://schemas.microsoft.com/office/word/2010/wordprocessingGroup" xmlns:wpi="http://schemas.microsoft.com/office/word/2010/wordprocessingInk" xmlns:wne="http://schemas.microsoft.com/office/word/2006/wordml" xmlns:wps="http://schemas.microsoft.com/office/word/2010/wordprocessingShape" mc:Ignorable="w14 w15 w16se w16cid w16 w16cex w16sdtdh w16sdtfl w16du wp14">
+<w:endnotes xmlns:wpc="http://schemas.microsoft.com/office/word/2010/wordprocessingCanvas" xmlns:cx="http://schemas.microsoft.com/office/drawing/2014/chartex" xmlns:cx1="http://schemas.microsoft.com/office/drawing/2015/9/8/chartex" xmlns:cx2="http://schemas.microsoft.com/office/drawing/2015/10/21/chartex" xmlns:cx3="http://schemas.microsoft.com/office/drawing/2016/5/9/chartex" xmlns:cx4="http://schemas.microsoft.com/office/drawing/2016/5/10/chartex" xmlns:cx5="http://schemas.microsoft.com/office/drawing/2016/5/11/chartex" xmlns:cx6="http://schemas.microsoft.com/office/drawing/2016/5/12/chartex" xmlns:cx7="http://schemas.microsoft.com/office/drawing/2016/5/13/chartex" xmlns:cx8="http://schemas.microsoft.com/office/drawing/2016/5/14/chartex" xmlns:mc="http://schemas.openxmlformats.org/markup-compatibility/2006" xmlns:m="http://schemas.openxmlformats.org/officeDocument/2006/math" xmlns:aink="http://schemas.microsoft.com/office/drawing/2016/ink" xmlns:am3d="http://schemas.microsoft.com/office/drawing/2017/model3d" xmlns:oel="http://schemas.microsoft.com/office/2019/extlst" xmlns:r="http://schemas.openxmlformats.org/officeDocument/2006/relationships" xmlns:wp14="http://schemas.microsoft.com/office/word/2010/wordprocessingDrawing" xmlns:wp="http://schemas.openxmlformats.org/drawingml/2006/wordprocessingDrawing" xmlns:wpg="http://schemas.microsoft.com/office/word/2010/wordprocessingGroup" xmlns:wpi="http://schemas.microsoft.com/office/word/2010/wordprocessingInk" xmlns:wps="http://schemas.microsoft.com/office/word/2010/wordprocessingShape" xmlns:o="urn:schemas-microsoft-com:office:office" xmlns:v="urn:schemas-microsoft-com:vml" xmlns:w10="urn:schemas-microsoft-com:office:word" xmlns:w="http://schemas.openxmlformats.org/wordprocessingml/2006/main" xmlns:w14="http://schemas.microsoft.com/office/word/2010/wordml" xmlns:w15="http://schemas.microsoft.com/office/word/2012/wordml" xmlns:w16cex="http://schemas.microsoft.com/office/word/2018/wordml/cex" xmlns:w16cid="http://schemas.microsoft.com/office/word/2016/wordml/cid" xmlns:w16="http://schemas.microsoft.com/office/word/2018/wordml" xmlns:w16sdtdh="http://schemas.microsoft.com/office/word/2020/wordml/sdtdatahash" xmlns:w16sdtfl="http://schemas.microsoft.com/office/word/2024/wordml/sdtformatlock" xmlns:w16se="http://schemas.microsoft.com/office/word/2015/wordml/symex" xmlns:w16du="http://schemas.microsoft.com/office/word/2023/wordml/word16du" xmlns:wne="http://schemas.microsoft.com/office/word/2006/wordml" mc:Ignorable="w14 w15 w16se w16cid w16 w16cex w16sdtdh w16sdtfl w16du wp14">
   <w:endnote w:type="separator" w:id="-1">
     <w:p>
       <w:pPr>
@@ -3700,7 +3771,7 @@
 </file>
 
 <file path=word/footer1.xml><?xml version="1.0" encoding="utf-8"?>
-<w:ftr xmlns:wpc="http://schemas.microsoft.com/office/word/2010/wordprocessingCanvas" xmlns:cx="http://schemas.microsoft.com/office/drawing/2014/chartex" xmlns:cx1="http://schemas.microsoft.com/office/drawing/2015/9/8/chartex" xmlns:cx2="http://schemas.microsoft.com/office/drawing/2015/10/21/chartex" xmlns:cx3="http://schemas.microsoft.com/office/drawing/2016/5/9/chartex" xmlns:cx4="http://schemas.microsoft.com/office/drawing/2016/5/10/chartex" xmlns:cx5="http://schemas.microsoft.com/office/drawing/2016/5/11/chartex" xmlns:cx6="http://schemas.microsoft.com/office/drawing/2016/5/12/chartex" xmlns:cx7="http://schemas.microsoft.com/office/drawing/2016/5/13/chartex" xmlns:cx8="http://schemas.microsoft.com/office/drawing/2016/5/14/chartex" xmlns:mc="http://schemas.openxmlformats.org/markup-compatibility/2006" xmlns:aink="http://schemas.microsoft.com/office/drawing/2016/ink" xmlns:am3d="http://schemas.microsoft.com/office/drawing/2017/model3d" xmlns:o="urn:schemas-microsoft-com:office:office" xmlns:oel="http://schemas.microsoft.com/office/2019/extlst" xmlns:r="http://schemas.openxmlformats.org/officeDocument/2006/relationships" xmlns:m="http://schemas.openxmlformats.org/officeDocument/2006/math" xmlns:v="urn:schemas-microsoft-com:vml" xmlns:wp14="http://schemas.microsoft.com/office/word/2010/wordprocessingDrawing" xmlns:wp="http://schemas.openxmlformats.org/drawingml/2006/wordprocessingDrawing" xmlns:w10="urn:schemas-microsoft-com:office:word" xmlns:w="http://schemas.openxmlformats.org/wordprocessingml/2006/main" xmlns:w14="http://schemas.microsoft.com/office/word/2010/wordml" xmlns:w15="http://schemas.microsoft.com/office/word/2012/wordml" xmlns:w16cex="http://schemas.microsoft.com/office/word/2018/wordml/cex" xmlns:w16cid="http://schemas.microsoft.com/office/word/2016/wordml/cid" xmlns:w16="http://schemas.microsoft.com/office/word/2018/wordml" xmlns:w16du="http://schemas.microsoft.com/office/word/2023/wordml/word16du" xmlns:w16sdtdh="http://schemas.microsoft.com/office/word/2020/wordml/sdtdatahash" xmlns:w16sdtfl="http://schemas.microsoft.com/office/word/2024/wordml/sdtformatlock" xmlns:w16se="http://schemas.microsoft.com/office/word/2015/wordml/symex" xmlns:wpg="http://schemas.microsoft.com/office/word/2010/wordprocessingGroup" xmlns:wpi="http://schemas.microsoft.com/office/word/2010/wordprocessingInk" xmlns:wne="http://schemas.microsoft.com/office/word/2006/wordml" xmlns:wps="http://schemas.microsoft.com/office/word/2010/wordprocessingShape" mc:Ignorable="w14 w15 w16se w16cid w16 w16cex w16sdtdh w16sdtfl w16du wp14">
+<w:ftr xmlns:wpc="http://schemas.microsoft.com/office/word/2010/wordprocessingCanvas" xmlns:cx="http://schemas.microsoft.com/office/drawing/2014/chartex" xmlns:cx1="http://schemas.microsoft.com/office/drawing/2015/9/8/chartex" xmlns:cx2="http://schemas.microsoft.com/office/drawing/2015/10/21/chartex" xmlns:cx3="http://schemas.microsoft.com/office/drawing/2016/5/9/chartex" xmlns:cx4="http://schemas.microsoft.com/office/drawing/2016/5/10/chartex" xmlns:cx5="http://schemas.microsoft.com/office/drawing/2016/5/11/chartex" xmlns:cx6="http://schemas.microsoft.com/office/drawing/2016/5/12/chartex" xmlns:cx7="http://schemas.microsoft.com/office/drawing/2016/5/13/chartex" xmlns:cx8="http://schemas.microsoft.com/office/drawing/2016/5/14/chartex" xmlns:mc="http://schemas.openxmlformats.org/markup-compatibility/2006" xmlns:m="http://schemas.openxmlformats.org/officeDocument/2006/math" xmlns:aink="http://schemas.microsoft.com/office/drawing/2016/ink" xmlns:am3d="http://schemas.microsoft.com/office/drawing/2017/model3d" xmlns:oel="http://schemas.microsoft.com/office/2019/extlst" xmlns:r="http://schemas.openxmlformats.org/officeDocument/2006/relationships" xmlns:wp14="http://schemas.microsoft.com/office/word/2010/wordprocessingDrawing" xmlns:wp="http://schemas.openxmlformats.org/drawingml/2006/wordprocessingDrawing" xmlns:wpg="http://schemas.microsoft.com/office/word/2010/wordprocessingGroup" xmlns:wpi="http://schemas.microsoft.com/office/word/2010/wordprocessingInk" xmlns:wps="http://schemas.microsoft.com/office/word/2010/wordprocessingShape" xmlns:o="urn:schemas-microsoft-com:office:office" xmlns:v="urn:schemas-microsoft-com:vml" xmlns:w10="urn:schemas-microsoft-com:office:word" xmlns:w="http://schemas.openxmlformats.org/wordprocessingml/2006/main" xmlns:w14="http://schemas.microsoft.com/office/word/2010/wordml" xmlns:w15="http://schemas.microsoft.com/office/word/2012/wordml" xmlns:w16cex="http://schemas.microsoft.com/office/word/2018/wordml/cex" xmlns:w16cid="http://schemas.microsoft.com/office/word/2016/wordml/cid" xmlns:w16="http://schemas.microsoft.com/office/word/2018/wordml" xmlns:w16sdtdh="http://schemas.microsoft.com/office/word/2020/wordml/sdtdatahash" xmlns:w16sdtfl="http://schemas.microsoft.com/office/word/2024/wordml/sdtformatlock" xmlns:w16se="http://schemas.microsoft.com/office/word/2015/wordml/symex" xmlns:w16du="http://schemas.microsoft.com/office/word/2023/wordml/word16du" xmlns:wne="http://schemas.microsoft.com/office/word/2006/wordml" mc:Ignorable="w14 w15 w16se w16cid w16 w16cex w16sdtdh w16sdtfl w16du wp14">
   <w:p>
     <w:pPr>
       <w:pStyle w:val="Footer"/>
@@ -3718,7 +3789,7 @@
 </file>
 
 <file path=word/footnotes.xml><?xml version="1.0" encoding="utf-8"?>
-<w:footnotes xmlns:wpc="http://schemas.microsoft.com/office/word/2010/wordprocessingCanvas" xmlns:cx="http://schemas.microsoft.com/office/drawing/2014/chartex" xmlns:cx1="http://schemas.microsoft.com/office/drawing/2015/9/8/chartex" xmlns:cx2="http://schemas.microsoft.com/office/drawing/2015/10/21/chartex" xmlns:cx3="http://schemas.microsoft.com/office/drawing/2016/5/9/chartex" xmlns:cx4="http://schemas.microsoft.com/office/drawing/2016/5/10/chartex" xmlns:cx5="http://schemas.microsoft.com/office/drawing/2016/5/11/chartex" xmlns:cx6="http://schemas.microsoft.com/office/drawing/2016/5/12/chartex" xmlns:cx7="http://schemas.microsoft.com/office/drawing/2016/5/13/chartex" xmlns:cx8="http://schemas.microsoft.com/office/drawing/2016/5/14/chartex" xmlns:mc="http://schemas.openxmlformats.org/markup-compatibility/2006" xmlns:aink="http://schemas.microsoft.com/office/drawing/2016/ink" xmlns:am3d="http://schemas.microsoft.com/office/drawing/2017/model3d" xmlns:o="urn:schemas-microsoft-com:office:office" xmlns:oel="http://schemas.microsoft.com/office/2019/extlst" xmlns:r="http://schemas.openxmlformats.org/officeDocument/2006/relationships" xmlns:m="http://schemas.openxmlformats.org/officeDocument/2006/math" xmlns:v="urn:schemas-microsoft-com:vml" xmlns:wp14="http://schemas.microsoft.com/office/word/2010/wordprocessingDrawing" xmlns:wp="http://schemas.openxmlformats.org/drawingml/2006/wordprocessingDrawing" xmlns:w10="urn:schemas-microsoft-com:office:word" xmlns:w="http://schemas.openxmlformats.org/wordprocessingml/2006/main" xmlns:w14="http://schemas.microsoft.com/office/word/2010/wordml" xmlns:w15="http://schemas.microsoft.com/office/word/2012/wordml" xmlns:w16cex="http://schemas.microsoft.com/office/word/2018/wordml/cex" xmlns:w16cid="http://schemas.microsoft.com/office/word/2016/wordml/cid" xmlns:w16="http://schemas.microsoft.com/office/word/2018/wordml" xmlns:w16du="http://schemas.microsoft.com/office/word/2023/wordml/word16du" xmlns:w16sdtdh="http://schemas.microsoft.com/office/word/2020/wordml/sdtdatahash" xmlns:w16sdtfl="http://schemas.microsoft.com/office/word/2024/wordml/sdtformatlock" xmlns:w16se="http://schemas.microsoft.com/office/word/2015/wordml/symex" xmlns:wpg="http://schemas.microsoft.com/office/word/2010/wordprocessingGroup" xmlns:wpi="http://schemas.microsoft.com/office/word/2010/wordprocessingInk" xmlns:wne="http://schemas.microsoft.com/office/word/2006/wordml" xmlns:wps="http://schemas.microsoft.com/office/word/2010/wordprocessingShape" mc:Ignorable="w14 w15 w16se w16cid w16 w16cex w16sdtdh w16sdtfl w16du wp14">
+<w:footnotes xmlns:wpc="http://schemas.microsoft.com/office/word/2010/wordprocessingCanvas" xmlns:cx="http://schemas.microsoft.com/office/drawing/2014/chartex" xmlns:cx1="http://schemas.microsoft.com/office/drawing/2015/9/8/chartex" xmlns:cx2="http://schemas.microsoft.com/office/drawing/2015/10/21/chartex" xmlns:cx3="http://schemas.microsoft.com/office/drawing/2016/5/9/chartex" xmlns:cx4="http://schemas.microsoft.com/office/drawing/2016/5/10/chartex" xmlns:cx5="http://schemas.microsoft.com/office/drawing/2016/5/11/chartex" xmlns:cx6="http://schemas.microsoft.com/office/drawing/2016/5/12/chartex" xmlns:cx7="http://schemas.microsoft.com/office/drawing/2016/5/13/chartex" xmlns:cx8="http://schemas.microsoft.com/office/drawing/2016/5/14/chartex" xmlns:mc="http://schemas.openxmlformats.org/markup-compatibility/2006" xmlns:m="http://schemas.openxmlformats.org/officeDocument/2006/math" xmlns:aink="http://schemas.microsoft.com/office/drawing/2016/ink" xmlns:am3d="http://schemas.microsoft.com/office/drawing/2017/model3d" xmlns:oel="http://schemas.microsoft.com/office/2019/extlst" xmlns:r="http://schemas.openxmlformats.org/officeDocument/2006/relationships" xmlns:wp14="http://schemas.microsoft.com/office/word/2010/wordprocessingDrawing" xmlns:wp="http://schemas.openxmlformats.org/drawingml/2006/wordprocessingDrawing" xmlns:wpg="http://schemas.microsoft.com/office/word/2010/wordprocessingGroup" xmlns:wpi="http://schemas.microsoft.com/office/word/2010/wordprocessingInk" xmlns:wps="http://schemas.microsoft.com/office/word/2010/wordprocessingShape" xmlns:o="urn:schemas-microsoft-com:office:office" xmlns:v="urn:schemas-microsoft-com:vml" xmlns:w10="urn:schemas-microsoft-com:office:word" xmlns:w="http://schemas.openxmlformats.org/wordprocessingml/2006/main" xmlns:w14="http://schemas.microsoft.com/office/word/2010/wordml" xmlns:w15="http://schemas.microsoft.com/office/word/2012/wordml" xmlns:w16cex="http://schemas.microsoft.com/office/word/2018/wordml/cex" xmlns:w16cid="http://schemas.microsoft.com/office/word/2016/wordml/cid" xmlns:w16="http://schemas.microsoft.com/office/word/2018/wordml" xmlns:w16sdtdh="http://schemas.microsoft.com/office/word/2020/wordml/sdtdatahash" xmlns:w16sdtfl="http://schemas.microsoft.com/office/word/2024/wordml/sdtformatlock" xmlns:w16se="http://schemas.microsoft.com/office/word/2015/wordml/symex" xmlns:w16du="http://schemas.microsoft.com/office/word/2023/wordml/word16du" xmlns:wne="http://schemas.microsoft.com/office/word/2006/wordml" mc:Ignorable="w14 w15 w16se w16cid w16 w16cex w16sdtdh w16sdtfl w16du wp14">
   <w:footnote w:type="separator" w:id="-1">
     <w:p>
       <w:pPr>
@@ -3743,7 +3814,7 @@
 </file>
 
 <file path=word/header1.xml><?xml version="1.0" encoding="utf-8"?>
-<w:hdr xmlns:wpc="http://schemas.microsoft.com/office/word/2010/wordprocessingCanvas" xmlns:cx="http://schemas.microsoft.com/office/drawing/2014/chartex" xmlns:cx1="http://schemas.microsoft.com/office/drawing/2015/9/8/chartex" xmlns:cx2="http://schemas.microsoft.com/office/drawing/2015/10/21/chartex" xmlns:cx3="http://schemas.microsoft.com/office/drawing/2016/5/9/chartex" xmlns:cx4="http://schemas.microsoft.com/office/drawing/2016/5/10/chartex" xmlns:cx5="http://schemas.microsoft.com/office/drawing/2016/5/11/chartex" xmlns:cx6="http://schemas.microsoft.com/office/drawing/2016/5/12/chartex" xmlns:cx7="http://schemas.microsoft.com/office/drawing/2016/5/13/chartex" xmlns:cx8="http://schemas.microsoft.com/office/drawing/2016/5/14/chartex" xmlns:mc="http://schemas.openxmlformats.org/markup-compatibility/2006" xmlns:aink="http://schemas.microsoft.com/office/drawing/2016/ink" xmlns:am3d="http://schemas.microsoft.com/office/drawing/2017/model3d" xmlns:o="urn:schemas-microsoft-com:office:office" xmlns:oel="http://schemas.microsoft.com/office/2019/extlst" xmlns:r="http://schemas.openxmlformats.org/officeDocument/2006/relationships" xmlns:m="http://schemas.openxmlformats.org/officeDocument/2006/math" xmlns:v="urn:schemas-microsoft-com:vml" xmlns:wp14="http://schemas.microsoft.com/office/word/2010/wordprocessingDrawing" xmlns:wp="http://schemas.openxmlformats.org/drawingml/2006/wordprocessingDrawing" xmlns:w10="urn:schemas-microsoft-com:office:word" xmlns:w="http://schemas.openxmlformats.org/wordprocessingml/2006/main" xmlns:w14="http://schemas.microsoft.com/office/word/2010/wordml" xmlns:w15="http://schemas.microsoft.com/office/word/2012/wordml" xmlns:w16cex="http://schemas.microsoft.com/office/word/2018/wordml/cex" xmlns:w16cid="http://schemas.microsoft.com/office/word/2016/wordml/cid" xmlns:w16="http://schemas.microsoft.com/office/word/2018/wordml" xmlns:w16du="http://schemas.microsoft.com/office/word/2023/wordml/word16du" xmlns:w16sdtdh="http://schemas.microsoft.com/office/word/2020/wordml/sdtdatahash" xmlns:w16sdtfl="http://schemas.microsoft.com/office/word/2024/wordml/sdtformatlock" xmlns:w16se="http://schemas.microsoft.com/office/word/2015/wordml/symex" xmlns:wpg="http://schemas.microsoft.com/office/word/2010/wordprocessingGroup" xmlns:wpi="http://schemas.microsoft.com/office/word/2010/wordprocessingInk" xmlns:wne="http://schemas.microsoft.com/office/word/2006/wordml" xmlns:wps="http://schemas.microsoft.com/office/word/2010/wordprocessingShape" mc:Ignorable="w14 w15 w16se w16cid w16 w16cex w16sdtdh w16sdtfl w16du wp14">
+<w:hdr xmlns:wpc="http://schemas.microsoft.com/office/word/2010/wordprocessingCanvas" xmlns:cx="http://schemas.microsoft.com/office/drawing/2014/chartex" xmlns:cx1="http://schemas.microsoft.com/office/drawing/2015/9/8/chartex" xmlns:cx2="http://schemas.microsoft.com/office/drawing/2015/10/21/chartex" xmlns:cx3="http://schemas.microsoft.com/office/drawing/2016/5/9/chartex" xmlns:cx4="http://schemas.microsoft.com/office/drawing/2016/5/10/chartex" xmlns:cx5="http://schemas.microsoft.com/office/drawing/2016/5/11/chartex" xmlns:cx6="http://schemas.microsoft.com/office/drawing/2016/5/12/chartex" xmlns:cx7="http://schemas.microsoft.com/office/drawing/2016/5/13/chartex" xmlns:cx8="http://schemas.microsoft.com/office/drawing/2016/5/14/chartex" xmlns:mc="http://schemas.openxmlformats.org/markup-compatibility/2006" xmlns:m="http://schemas.openxmlformats.org/officeDocument/2006/math" xmlns:aink="http://schemas.microsoft.com/office/drawing/2016/ink" xmlns:am3d="http://schemas.microsoft.com/office/drawing/2017/model3d" xmlns:oel="http://schemas.microsoft.com/office/2019/extlst" xmlns:r="http://schemas.openxmlformats.org/officeDocument/2006/relationships" xmlns:wp14="http://schemas.microsoft.com/office/word/2010/wordprocessingDrawing" xmlns:wp="http://schemas.openxmlformats.org/drawingml/2006/wordprocessingDrawing" xmlns:wpg="http://schemas.microsoft.com/office/word/2010/wordprocessingGroup" xmlns:wpi="http://schemas.microsoft.com/office/word/2010/wordprocessingInk" xmlns:wps="http://schemas.microsoft.com/office/word/2010/wordprocessingShape" xmlns:o="urn:schemas-microsoft-com:office:office" xmlns:v="urn:schemas-microsoft-com:vml" xmlns:w10="urn:schemas-microsoft-com:office:word" xmlns:w="http://schemas.openxmlformats.org/wordprocessingml/2006/main" xmlns:w14="http://schemas.microsoft.com/office/word/2010/wordml" xmlns:w15="http://schemas.microsoft.com/office/word/2012/wordml" xmlns:w16cex="http://schemas.microsoft.com/office/word/2018/wordml/cex" xmlns:w16cid="http://schemas.microsoft.com/office/word/2016/wordml/cid" xmlns:w16="http://schemas.microsoft.com/office/word/2018/wordml" xmlns:w16sdtdh="http://schemas.microsoft.com/office/word/2020/wordml/sdtdatahash" xmlns:w16sdtfl="http://schemas.microsoft.com/office/word/2024/wordml/sdtformatlock" xmlns:w16se="http://schemas.microsoft.com/office/word/2015/wordml/symex" xmlns:w16du="http://schemas.microsoft.com/office/word/2023/wordml/word16du" xmlns:wne="http://schemas.microsoft.com/office/word/2006/wordml" mc:Ignorable="w14 w15 w16se w16cid w16 w16cex w16sdtdh w16sdtfl w16du wp14">
   <w:p>
     <w:pPr>
       <w:pStyle w:val="Header"/>
@@ -3761,7 +3832,7 @@
 </file>
 
 <file path=word/numbering.xml><?xml version="1.0" encoding="utf-8"?>
-<w:numbering xmlns:wpc="http://schemas.microsoft.com/office/word/2010/wordprocessingCanvas" xmlns:cx="http://schemas.microsoft.com/office/drawing/2014/chartex" xmlns:cx1="http://schemas.microsoft.com/office/drawing/2015/9/8/chartex" xmlns:cx2="http://schemas.microsoft.com/office/drawing/2015/10/21/chartex" xmlns:cx3="http://schemas.microsoft.com/office/drawing/2016/5/9/chartex" xmlns:cx4="http://schemas.microsoft.com/office/drawing/2016/5/10/chartex" xmlns:cx5="http://schemas.microsoft.com/office/drawing/2016/5/11/chartex" xmlns:cx6="http://schemas.microsoft.com/office/drawing/2016/5/12/chartex" xmlns:cx7="http://schemas.microsoft.com/office/drawing/2016/5/13/chartex" xmlns:cx8="http://schemas.microsoft.com/office/drawing/2016/5/14/chartex" xmlns:mc="http://schemas.openxmlformats.org/markup-compatibility/2006" xmlns:aink="http://schemas.microsoft.com/office/drawing/2016/ink" xmlns:am3d="http://schemas.microsoft.com/office/drawing/2017/model3d" xmlns:o="urn:schemas-microsoft-com:office:office" xmlns:oel="http://schemas.microsoft.com/office/2019/extlst" xmlns:r="http://schemas.openxmlformats.org/officeDocument/2006/relationships" xmlns:m="http://schemas.openxmlformats.org/officeDocument/2006/math" xmlns:v="urn:schemas-microsoft-com:vml" xmlns:wp14="http://schemas.microsoft.com/office/word/2010/wordprocessingDrawing" xmlns:wp="http://schemas.openxmlformats.org/drawingml/2006/wordprocessingDrawing" xmlns:w10="urn:schemas-microsoft-com:office:word" xmlns:w="http://schemas.openxmlformats.org/wordprocessingml/2006/main" xmlns:w14="http://schemas.microsoft.com/office/word/2010/wordml" xmlns:w15="http://schemas.microsoft.com/office/word/2012/wordml" xmlns:w16cex="http://schemas.microsoft.com/office/word/2018/wordml/cex" xmlns:w16cid="http://schemas.microsoft.com/office/word/2016/wordml/cid" xmlns:w16="http://schemas.microsoft.com/office/word/2018/wordml" xmlns:w16du="http://schemas.microsoft.com/office/word/2023/wordml/word16du" xmlns:w16sdtdh="http://schemas.microsoft.com/office/word/2020/wordml/sdtdatahash" xmlns:w16sdtfl="http://schemas.microsoft.com/office/word/2024/wordml/sdtformatlock" xmlns:w16se="http://schemas.microsoft.com/office/word/2015/wordml/symex" xmlns:wpg="http://schemas.microsoft.com/office/word/2010/wordprocessingGroup" xmlns:wpi="http://schemas.microsoft.com/office/word/2010/wordprocessingInk" xmlns:wne="http://schemas.microsoft.com/office/word/2006/wordml" xmlns:wps="http://schemas.microsoft.com/office/word/2010/wordprocessingShape" mc:Ignorable="w14 w15 w16se w16cid w16 w16cex w16sdtdh w16sdtfl w16du wp14">
+<w:numbering xmlns:wpc="http://schemas.microsoft.com/office/word/2010/wordprocessingCanvas" xmlns:cx="http://schemas.microsoft.com/office/drawing/2014/chartex" xmlns:cx1="http://schemas.microsoft.com/office/drawing/2015/9/8/chartex" xmlns:cx2="http://schemas.microsoft.com/office/drawing/2015/10/21/chartex" xmlns:cx3="http://schemas.microsoft.com/office/drawing/2016/5/9/chartex" xmlns:cx4="http://schemas.microsoft.com/office/drawing/2016/5/10/chartex" xmlns:cx5="http://schemas.microsoft.com/office/drawing/2016/5/11/chartex" xmlns:cx6="http://schemas.microsoft.com/office/drawing/2016/5/12/chartex" xmlns:cx7="http://schemas.microsoft.com/office/drawing/2016/5/13/chartex" xmlns:cx8="http://schemas.microsoft.com/office/drawing/2016/5/14/chartex" xmlns:mc="http://schemas.openxmlformats.org/markup-compatibility/2006" xmlns:m="http://schemas.openxmlformats.org/officeDocument/2006/math" xmlns:aink="http://schemas.microsoft.com/office/drawing/2016/ink" xmlns:am3d="http://schemas.microsoft.com/office/drawing/2017/model3d" xmlns:oel="http://schemas.microsoft.com/office/2019/extlst" xmlns:r="http://schemas.openxmlformats.org/officeDocument/2006/relationships" xmlns:wp14="http://schemas.microsoft.com/office/word/2010/wordprocessingDrawing" xmlns:wp="http://schemas.openxmlformats.org/drawingml/2006/wordprocessingDrawing" xmlns:wpg="http://schemas.microsoft.com/office/word/2010/wordprocessingGroup" xmlns:wpi="http://schemas.microsoft.com/office/word/2010/wordprocessingInk" xmlns:wps="http://schemas.microsoft.com/office/word/2010/wordprocessingShape" xmlns:o="urn:schemas-microsoft-com:office:office" xmlns:v="urn:schemas-microsoft-com:vml" xmlns:w10="urn:schemas-microsoft-com:office:word" xmlns:w="http://schemas.openxmlformats.org/wordprocessingml/2006/main" xmlns:w14="http://schemas.microsoft.com/office/word/2010/wordml" xmlns:w15="http://schemas.microsoft.com/office/word/2012/wordml" xmlns:w16cex="http://schemas.microsoft.com/office/word/2018/wordml/cex" xmlns:w16cid="http://schemas.microsoft.com/office/word/2016/wordml/cid" xmlns:w16="http://schemas.microsoft.com/office/word/2018/wordml" xmlns:w16sdtdh="http://schemas.microsoft.com/office/word/2020/wordml/sdtdatahash" xmlns:w16sdtfl="http://schemas.microsoft.com/office/word/2024/wordml/sdtformatlock" xmlns:w16se="http://schemas.microsoft.com/office/word/2015/wordml/symex" xmlns:w16du="http://schemas.microsoft.com/office/word/2023/wordml/word16du" xmlns:wne="http://schemas.microsoft.com/office/word/2006/wordml" mc:Ignorable="w14 w15 w16se w16cid w16 w16cex w16sdtdh w16sdtfl w16du wp14">
   <w:abstractNum w:abstractNumId="0" w15:restartNumberingAfterBreak="0">
     <w:nsid w:val="FFFFFF7C"/>
     <w:multiLevelType w:val="singleLevel"/>
@@ -3964,7 +4035,7 @@
 </file>
 
 <file path=word/styles.xml><?xml version="1.0" encoding="utf-8"?>
-<w:styles xmlns:mc="http://schemas.openxmlformats.org/markup-compatibility/2006" xmlns:r="http://schemas.openxmlformats.org/officeDocument/2006/relationships" xmlns:w="http://schemas.openxmlformats.org/wordprocessingml/2006/main" xmlns:w14="http://schemas.microsoft.com/office/word/2010/wordml" xmlns:w15="http://schemas.microsoft.com/office/word/2012/wordml" xmlns:w16cex="http://schemas.microsoft.com/office/word/2018/wordml/cex" xmlns:w16cid="http://schemas.microsoft.com/office/word/2016/wordml/cid" xmlns:w16="http://schemas.microsoft.com/office/word/2018/wordml" xmlns:w16du="http://schemas.microsoft.com/office/word/2023/wordml/word16du" xmlns:w16sdtdh="http://schemas.microsoft.com/office/word/2020/wordml/sdtdatahash" xmlns:w16sdtfl="http://schemas.microsoft.com/office/word/2024/wordml/sdtformatlock" xmlns:w16se="http://schemas.microsoft.com/office/word/2015/wordml/symex" mc:Ignorable="w14 w15 w16se w16cid w16 w16cex w16sdtdh w16sdtfl w16du">
+<w:styles xmlns:mc="http://schemas.openxmlformats.org/markup-compatibility/2006" xmlns:r="http://schemas.openxmlformats.org/officeDocument/2006/relationships" xmlns:w="http://schemas.openxmlformats.org/wordprocessingml/2006/main" xmlns:w14="http://schemas.microsoft.com/office/word/2010/wordml" xmlns:w15="http://schemas.microsoft.com/office/word/2012/wordml" xmlns:w16cex="http://schemas.microsoft.com/office/word/2018/wordml/cex" xmlns:w16cid="http://schemas.microsoft.com/office/word/2016/wordml/cid" xmlns:w16="http://schemas.microsoft.com/office/word/2018/wordml" xmlns:w16sdtdh="http://schemas.microsoft.com/office/word/2020/wordml/sdtdatahash" xmlns:w16sdtfl="http://schemas.microsoft.com/office/word/2024/wordml/sdtformatlock" xmlns:w16se="http://schemas.microsoft.com/office/word/2015/wordml/symex" xmlns:w16du="http://schemas.microsoft.com/office/word/2023/wordml/word16du" mc:Ignorable="w14 w15 w16se w16cid w16 w16cex w16sdtdh w16sdtfl w16du">
   <w:docDefaults>
     <w:rPrDefault>
       <w:rPr>
@@ -4571,6 +4642,7 @@
   <w:style w:type="character" w:default="1" w:styleId="DefaultParagraphFont">
     <w:name w:val="Default Paragraph Font"/>
     <w:uiPriority w:val="1"/>
+    <w:semiHidden/>
     <w:unhideWhenUsed/>
   </w:style>
   <w:style w:type="table" w:default="1" w:styleId="TableNormal">

</xml_diff>